<commit_message>
Reorganised QA variables - reflect in protocol
</commit_message>
<xml_diff>
--- a/protocols/protocol.docx
+++ b/protocols/protocol.docx
@@ -274,7 +274,7 @@
         <w:pStyle w:val="FirstParagraph"/>
       </w:pPr>
       <w:r>
-        <w:t xml:space="preserve">Ninety-eight percent of people living with advanced chronic kidney disease (CKD) - stages 4 and 5, not receiving kidney replacement therapy (KRT) - live with multiple long-term conditions</w:t>
+        <w:t xml:space="preserve">Ninety-eight percent of people living with chronic kidney disease stages 4 and 5 not receiving kidney replacement therapy - CKD 4/5 - live with multiple long-term conditions</w:t>
       </w:r>
       <w:r>
         <w:t xml:space="preserve"> </w:t>
@@ -283,7 +283,7 @@
         <w:t xml:space="preserve">(2)</w:t>
       </w:r>
       <w:r>
-        <w:t xml:space="preserve">. Resultantly, polypharmacy is highly prevalent, and this gruop are prescribed on average 8-9 medicines per day (&gt;100 pills per week)</w:t>
+        <w:t xml:space="preserve">. Resultantly, polypharmacy is highly prevalent - this group are prescribed on average 8-9 medicines per day (and &gt;100 pills per week)</w:t>
       </w:r>
       <w:r>
         <w:t xml:space="preserve"> </w:t>
@@ -292,7 +292,7 @@
         <w:t xml:space="preserve">(3)</w:t>
       </w:r>
       <w:r>
-        <w:t xml:space="preserve">. Polypharmacy is well linked to avoidable harm</w:t>
+        <w:t xml:space="preserve">. Polypharmacy is well linked to avoidable harms such as falls and hospitalisations</w:t>
       </w:r>
       <w:r>
         <w:t xml:space="preserve"> </w:t>
@@ -301,7 +301,10 @@
         <w:t xml:space="preserve">(4)</w:t>
       </w:r>
       <w:r>
-        <w:t xml:space="preserve">, hence addressing it is a key action area in the World Health Organisation’s current Global Patient Safety Challenge:</w:t>
+        <w:t xml:space="preserve"> </w:t>
+      </w:r>
+      <w:r>
+        <w:t xml:space="preserve">so managing it safely is a key action area within the World Health Organisation’s active global patient safety challenge:</w:t>
       </w:r>
       <w:r>
         <w:t xml:space="preserve"> </w:t>
@@ -320,7 +323,7 @@
         <w:t xml:space="preserve">(5)</w:t>
       </w:r>
       <w:r>
-        <w:t xml:space="preserve">. For people with reduced kidney function, the risk of harm is augmented by unpredictable drug handling and excretion - 1 in 5 experience a medication-related harm each year [REF] - and therefore they are a high priority group to study</w:t>
+        <w:t xml:space="preserve">. For people with CKD 4/5, the risk of medication-related harm is augmented by unpredictable drug handling and excretion - 1 in 5 experience a medication-related harm each year</w:t>
       </w:r>
       <w:r>
         <w:t xml:space="preserve"> </w:t>
@@ -329,6 +332,24 @@
         <w:t xml:space="preserve">(6)</w:t>
       </w:r>
       <w:r>
+        <w:t xml:space="preserve">, making them a high priority group to study</w:t>
+      </w:r>
+      <w:r>
+        <w:t xml:space="preserve"> </w:t>
+      </w:r>
+      <w:r>
+        <w:t xml:space="preserve">(7)</w:t>
+      </w:r>
+      <w:r>
+        <w:t xml:space="preserve">. Added to this, clinical trials that establish the safety and effectiveness of medicines often exclude people living with CKD 4/5, and do not reflect their comorbidity and diversity</w:t>
+      </w:r>
+      <w:r>
+        <w:t xml:space="preserve"> </w:t>
+      </w:r>
+      <w:r>
+        <w:t xml:space="preserve">(8)</w:t>
+      </w:r>
+      <w:r>
         <w:t xml:space="preserve">.</w:t>
       </w:r>
     </w:p>
@@ -337,24 +358,7 @@
         <w:pStyle w:val="BodyText"/>
       </w:pPr>
       <w:r>
-        <w:t xml:space="preserve">Added to this, clinical trials that establish the safety and effectiveness of medicines rarely include people living with advanced kidney disease, and instead include populations that do not reflect their comorbidity and diversity</w:t>
-      </w:r>
-      <w:r>
-        <w:t xml:space="preserve"> </w:t>
-      </w:r>
-      <w:r>
-        <w:t xml:space="preserve">(7)</w:t>
-      </w:r>
-      <w:r>
-        <w:t xml:space="preserve">.</w:t>
-      </w:r>
-    </w:p>
-    <w:p>
-      <w:pPr>
-        <w:pStyle w:val="BodyText"/>
-      </w:pPr>
-      <w:r>
-        <w:t xml:space="preserve">Deprescribing - the systematic process of stopping or reducing medicines - is a proposed way of reducing the harms associated with polypharmacy. However, despite a new chapter in the recent KDIGO (Kidney Disease | Improving Global Outcomes) CKD practice guidelines update entitled</w:t>
+        <w:t xml:space="preserve">Deprescribing - the systematic process of stopping or reducing medicines - is a proposed way of reducing the harms associated with polypharmacy. Within the recently updated KDIGO (Kidney Disease | Improving Global Outcomes) CKD practice guideline there is a new chapter entitled</w:t>
       </w:r>
       <w:r>
         <w:t xml:space="preserve"> </w:t>
@@ -367,16 +371,25 @@
         <w:t xml:space="preserve">Medication management and Drug Stewardship</w:t>
       </w:r>
       <w:r>
-        <w:t xml:space="preserve">, there is an acknowledgment that evidence to guide deprescribing is limited</w:t>
-      </w:r>
-      <w:r>
-        <w:t xml:space="preserve"> </w:t>
-      </w:r>
-      <w:r>
-        <w:t xml:space="preserve">(8)</w:t>
-      </w:r>
-      <w:r>
-        <w:t xml:space="preserve">.</w:t>
+        <w:t xml:space="preserve">, however this includes an acknowledgment that evidence to guide deprescribing is limited</w:t>
+      </w:r>
+      <w:r>
+        <w:t xml:space="preserve"> </w:t>
+      </w:r>
+      <w:r>
+        <w:t xml:space="preserve">(9)</w:t>
+      </w:r>
+      <w:r>
+        <w:t xml:space="preserve">. We have shown that a proportion of people with advanced kidney disease are having medications such as statins discontinued in their last years of life</w:t>
+      </w:r>
+      <w:r>
+        <w:t xml:space="preserve"> </w:t>
+      </w:r>
+      <w:r>
+        <w:t xml:space="preserve">(10)</w:t>
+      </w:r>
+      <w:r>
+        <w:t xml:space="preserve">, but wider-scale information is lacking. Currently there is little guidance for clinicians about what medicines can be deprescribed and when.</w:t>
       </w:r>
     </w:p>
     <w:p>
@@ -384,24 +397,30 @@
         <w:pStyle w:val="BodyText"/>
       </w:pPr>
       <w:r>
-        <w:t xml:space="preserve">Research has shown that a small number of people with advanced kidney disease are having medications such as statins and proton pump inhibitors discontinued in their last years of life</w:t>
-      </w:r>
-      <w:r>
-        <w:t xml:space="preserve"> </w:t>
-      </w:r>
-      <w:r>
-        <w:t xml:space="preserve">(9)</w:t>
-      </w:r>
-      <w:r>
-        <w:t xml:space="preserve">, but information about patterns and predictors of discontinuation at a population level are lacking.</w:t>
-      </w:r>
-    </w:p>
-    <w:p>
-      <w:pPr>
-        <w:pStyle w:val="BodyText"/>
-      </w:pPr>
-      <w:r>
-        <w:t xml:space="preserve">Other factors that make this an important area to study include:</w:t>
+        <w:t xml:space="preserve">We aim to describe the current patterns of discontinuation of common medicines in people living with advanced CKD in England, and evaluate the clinical and sociodemographic factors that lead to variances in these patterns. In routine healthcare data, deprescribing is largely observable as medication</w:t>
+      </w:r>
+      <w:r>
+        <w:t xml:space="preserve"> </w:t>
+      </w:r>
+      <w:r>
+        <w:rPr>
+          <w:i/>
+          <w:iCs/>
+        </w:rPr>
+        <w:t xml:space="preserve">discontinuation</w:t>
+      </w:r>
+      <w:r>
+        <w:t xml:space="preserve">, which will therefore be the primary focus of this study.</w:t>
+      </w:r>
+    </w:p>
+    <w:bookmarkEnd w:id="9"/>
+    <w:bookmarkStart w:id="10" w:name="objectives"/>
+    <w:p>
+      <w:pPr>
+        <w:pStyle w:val="Heading1"/>
+      </w:pPr>
+      <w:r>
+        <w:t xml:space="preserve">2. Objectives</w:t>
       </w:r>
     </w:p>
     <w:p>
@@ -413,16 +432,7 @@
         </w:numPr>
       </w:pPr>
       <w:r>
-        <w:t xml:space="preserve">Supported by policy - Department of Health and Social Care report on reducing overprescribing</w:t>
-      </w:r>
-      <w:r>
-        <w:t xml:space="preserve"> </w:t>
-      </w:r>
-      <w:r>
-        <w:t xml:space="preserve">(10)</w:t>
-      </w:r>
-      <w:r>
-        <w:t xml:space="preserve">,</w:t>
+        <w:t xml:space="preserve">To describe patterns of prescribing at a national level for people living with advanced CKD</w:t>
       </w:r>
     </w:p>
     <w:p>
@@ -434,7 +444,7 @@
         </w:numPr>
       </w:pPr>
       <w:r>
-        <w:t xml:space="preserve">Call for more research into deprescribing - current NIHR call, HDR UK Medicines in acute and Chronic disease driver programme</w:t>
+        <w:t xml:space="preserve">To establish the patterns of discontinuation of medicines in people in England living with advanced CKD.</w:t>
       </w:r>
     </w:p>
     <w:p>
@@ -446,19 +456,26 @@
         </w:numPr>
       </w:pPr>
       <w:r>
-        <w:t xml:space="preserve">Importance to patients, prescribers, and health and care services</w:t>
-      </w:r>
-    </w:p>
-    <w:p>
-      <w:pPr>
-        <w:pStyle w:val="Compact"/>
-        <w:numPr>
-          <w:ilvl w:val="0"/>
-          <w:numId w:val="1001"/>
-        </w:numPr>
-      </w:pPr>
-      <w:r>
-        <w:t xml:space="preserve">James Lind Alliance priority for understanding medicines in older life.</w:t>
+        <w:t xml:space="preserve">To identify the clinical and sociodemographic factors associated with variances in these patterns.</w:t>
+      </w:r>
+    </w:p>
+    <w:bookmarkEnd w:id="10"/>
+    <w:bookmarkStart w:id="45" w:name="methods"/>
+    <w:p>
+      <w:pPr>
+        <w:pStyle w:val="Heading1"/>
+      </w:pPr>
+      <w:r>
+        <w:t xml:space="preserve">3. Methods</w:t>
+      </w:r>
+    </w:p>
+    <w:bookmarkStart w:id="11" w:name="study-design"/>
+    <w:p>
+      <w:pPr>
+        <w:pStyle w:val="Heading2"/>
+      </w:pPr>
+      <w:r>
+        <w:t xml:space="preserve">3.1 Study design</w:t>
       </w:r>
     </w:p>
     <w:p>
@@ -466,17 +483,25 @@
         <w:pStyle w:val="FirstParagraph"/>
       </w:pPr>
       <w:r>
-        <w:t xml:space="preserve">We therefore aim to describe the current patterns of discontinuation of common medicines in people living with advanced CKD in England, and evaluate the clinical and sociodemographic factors that lead to variances in these patterns.</w:t>
-      </w:r>
-    </w:p>
-    <w:bookmarkEnd w:id="9"/>
-    <w:bookmarkStart w:id="10" w:name="objectives"/>
-    <w:p>
-      <w:pPr>
-        <w:pStyle w:val="Heading1"/>
-      </w:pPr>
-      <w:r>
-        <w:t xml:space="preserve">2. Objectives</w:t>
+        <w:t xml:space="preserve">We will conduct cross-sectional and longitudinal analyses of a retrospective cohort of individuals living with advanced kidney disease living in England.</w:t>
+      </w:r>
+    </w:p>
+    <w:bookmarkEnd w:id="11"/>
+    <w:bookmarkStart w:id="12" w:name="data-sources"/>
+    <w:p>
+      <w:pPr>
+        <w:pStyle w:val="Heading2"/>
+      </w:pPr>
+      <w:r>
+        <w:t xml:space="preserve">3.2 Data sources</w:t>
+      </w:r>
+    </w:p>
+    <w:p>
+      <w:pPr>
+        <w:pStyle w:val="FirstParagraph"/>
+      </w:pPr>
+      <w:r>
+        <w:t xml:space="preserve">We will analyse the primary care record data of people living in England that is stored and managed by The Phoenix Partnership (TPP), specifically through the OpenSAFELY-TPP secure analytical platform. We will utilise OpenSAFELY-TPP’s established linkages to:</w:t>
       </w:r>
     </w:p>
     <w:p>
@@ -488,7 +513,7 @@
         </w:numPr>
       </w:pPr>
       <w:r>
-        <w:t xml:space="preserve">To describe patterns of prescribing at a national level for people living with advanced CKD</w:t>
+        <w:t xml:space="preserve">Office for National Statistics (ONS) data on registered deaths</w:t>
       </w:r>
     </w:p>
     <w:p>
@@ -500,7 +525,7 @@
         </w:numPr>
       </w:pPr>
       <w:r>
-        <w:t xml:space="preserve">To establish the patterns of discontinuation of medicines in people in England living with advanced CKD.</w:t>
+        <w:t xml:space="preserve">NHS Secondary Uses Service data, which includes information regarding hospital admissions, and is used to derive each individual’s ethnicity</w:t>
       </w:r>
     </w:p>
     <w:p>
@@ -512,7 +537,17 @@
         </w:numPr>
       </w:pPr>
       <w:r>
-        <w:t xml:space="preserve">To identify the clinical and sociodemographic factors associated with variances in these patterns.</w:t>
+        <w:t xml:space="preserve">Data on Index of Multiple Deprivation (IMD)</w:t>
+      </w:r>
+    </w:p>
+    <w:bookmarkEnd w:id="12"/>
+    <w:bookmarkStart w:id="20" w:name="study-population"/>
+    <w:p>
+      <w:pPr>
+        <w:pStyle w:val="Heading2"/>
+      </w:pPr>
+      <w:r>
+        <w:t xml:space="preserve">3.3 Study population</w:t>
       </w:r>
     </w:p>
     <w:p>
@@ -520,38 +555,29 @@
         <w:pStyle w:val="FirstParagraph"/>
       </w:pPr>
       <w:r>
-        <w:t xml:space="preserve">In routine healthcare data, deprescribing is largely observable as medication</w:t>
+        <w:t xml:space="preserve">This retrospective cohort study will analyse the cohort of individuals living with CKD 4/5 on 01/03/2022 (the</w:t>
       </w:r>
       <w:r>
         <w:t xml:space="preserve"> </w:t>
       </w:r>
       <w:r>
         <w:rPr>
-          <w:u w:val="single"/>
+          <w:b/>
+          <w:bCs/>
         </w:rPr>
-        <w:t xml:space="preserve">discontinuation</w:t>
-      </w:r>
-      <w:r>
-        <w:t xml:space="preserve">, which will therefore be the primary focus of this study.</w:t>
-      </w:r>
-    </w:p>
-    <w:bookmarkEnd w:id="10"/>
-    <w:bookmarkStart w:id="39" w:name="methods"/>
-    <w:p>
-      <w:pPr>
-        <w:pStyle w:val="Heading1"/>
-      </w:pPr>
-      <w:r>
-        <w:t xml:space="preserve">3. Methods</w:t>
-      </w:r>
-    </w:p>
-    <w:bookmarkStart w:id="11" w:name="study-design"/>
-    <w:p>
-      <w:pPr>
-        <w:pStyle w:val="Heading2"/>
-      </w:pPr>
-      <w:r>
-        <w:t xml:space="preserve">3.1 Study design</w:t>
+        <w:t xml:space="preserve">‘index date’</w:t>
+      </w:r>
+      <w:r>
+        <w:t xml:space="preserve">), and then follow up their prescriptions for the following 4 years.</w:t>
+      </w:r>
+    </w:p>
+    <w:bookmarkStart w:id="15" w:name="inclusion-criteria"/>
+    <w:p>
+      <w:pPr>
+        <w:pStyle w:val="Heading3"/>
+      </w:pPr>
+      <w:r>
+        <w:t xml:space="preserve">3.3.1 Inclusion criteria</w:t>
       </w:r>
     </w:p>
     <w:p>
@@ -559,25 +585,7 @@
         <w:pStyle w:val="FirstParagraph"/>
       </w:pPr>
       <w:r>
-        <w:t xml:space="preserve">We will conduct cross-sectional and longitudinal analyses of a retrospective cohort of individuals living with advanced kidney disease living in England.</w:t>
-      </w:r>
-    </w:p>
-    <w:bookmarkEnd w:id="11"/>
-    <w:bookmarkStart w:id="12" w:name="data-sources"/>
-    <w:p>
-      <w:pPr>
-        <w:pStyle w:val="Heading2"/>
-      </w:pPr>
-      <w:r>
-        <w:t xml:space="preserve">3.2 Data sources</w:t>
-      </w:r>
-    </w:p>
-    <w:p>
-      <w:pPr>
-        <w:pStyle w:val="FirstParagraph"/>
-      </w:pPr>
-      <w:r>
-        <w:t xml:space="preserve">We will analyse the primary care record data of people living in England that is stored and managed by The Phoenix Partnership (TPP), specifically through utilisation of the OpenSAFELY-TPP secure analytical database. We will utilise OpenSAFELY-TPP’s established linkages to:</w:t>
+        <w:t xml:space="preserve">Individuals will be included in the cohort if on the index date they meet all the following criteria:</w:t>
       </w:r>
     </w:p>
     <w:p>
@@ -589,7 +597,7 @@
         </w:numPr>
       </w:pPr>
       <w:r>
-        <w:t xml:space="preserve">Office for National Statistics (ONS) data on registered deaths</w:t>
+        <w:t xml:space="preserve">Alive</w:t>
       </w:r>
     </w:p>
     <w:p>
@@ -601,42 +609,7 @@
         </w:numPr>
       </w:pPr>
       <w:r>
-        <w:t xml:space="preserve">NHS Secondary Uses Service data, which includes information regarding hospital admissions, and is used to derive each individual’s ethnicity</w:t>
-      </w:r>
-    </w:p>
-    <w:bookmarkEnd w:id="12"/>
-    <w:bookmarkStart w:id="20" w:name="study-population"/>
-    <w:p>
-      <w:pPr>
-        <w:pStyle w:val="Heading2"/>
-      </w:pPr>
-      <w:r>
-        <w:t xml:space="preserve">3.3 Study population</w:t>
-      </w:r>
-    </w:p>
-    <w:p>
-      <w:pPr>
-        <w:pStyle w:val="FirstParagraph"/>
-      </w:pPr>
-      <w:r>
-        <w:t xml:space="preserve">This retrospective cohort study will analyse the cohort of individuals living with advanced kidney disease on 01/03/2022, and then follow up their prescriptions for the following 4 years.</w:t>
-      </w:r>
-    </w:p>
-    <w:bookmarkStart w:id="15" w:name="inclusion-criteria"/>
-    <w:p>
-      <w:pPr>
-        <w:pStyle w:val="Heading3"/>
-      </w:pPr>
-      <w:r>
-        <w:t xml:space="preserve">3.3.1 Inclusion criteria</w:t>
-      </w:r>
-    </w:p>
-    <w:p>
-      <w:pPr>
-        <w:pStyle w:val="FirstParagraph"/>
-      </w:pPr>
-      <w:r>
-        <w:t xml:space="preserve">Individuals will be included in the cohort if on 01/03/2022 they meet all the following criteria:</w:t>
+        <w:t xml:space="preserve">Aged ≥18 and ≤110 years</w:t>
       </w:r>
     </w:p>
     <w:p>
@@ -644,11 +617,11 @@
         <w:pStyle w:val="Compact"/>
         <w:numPr>
           <w:ilvl w:val="0"/>
-          <w:numId w:val="1004"/>
+          <w:numId w:val="1003"/>
         </w:numPr>
       </w:pPr>
       <w:r>
-        <w:t xml:space="preserve">Alive</w:t>
+        <w:t xml:space="preserve">Continuous registration at a single GP practice that uses TPP software for at least the one year prior.</w:t>
       </w:r>
     </w:p>
     <w:p>
@@ -656,31 +629,7 @@
         <w:pStyle w:val="Compact"/>
         <w:numPr>
           <w:ilvl w:val="0"/>
-          <w:numId w:val="1004"/>
-        </w:numPr>
-      </w:pPr>
-      <w:r>
-        <w:t xml:space="preserve">Aged ≥18 and ≤110 years</w:t>
-      </w:r>
-    </w:p>
-    <w:p>
-      <w:pPr>
-        <w:pStyle w:val="Compact"/>
-        <w:numPr>
-          <w:ilvl w:val="0"/>
-          <w:numId w:val="1004"/>
-        </w:numPr>
-      </w:pPr>
-      <w:r>
-        <w:t xml:space="preserve">Continuous registration at a single GP practice that uses TPP software for at least the one year prior.</w:t>
-      </w:r>
-    </w:p>
-    <w:p>
-      <w:pPr>
-        <w:pStyle w:val="Compact"/>
-        <w:numPr>
-          <w:ilvl w:val="0"/>
-          <w:numId w:val="1004"/>
+          <w:numId w:val="1003"/>
         </w:numPr>
       </w:pPr>
       <w:r>
@@ -701,7 +650,7 @@
         <w:pStyle w:val="Compact"/>
         <w:numPr>
           <w:ilvl w:val="1"/>
-          <w:numId w:val="1005"/>
+          <w:numId w:val="1004"/>
         </w:numPr>
       </w:pPr>
       <w:r>
@@ -739,7 +688,7 @@
         <w:pStyle w:val="Compact"/>
         <w:numPr>
           <w:ilvl w:val="1"/>
-          <w:numId w:val="1005"/>
+          <w:numId w:val="1004"/>
         </w:numPr>
       </w:pPr>
       <w:r>
@@ -757,22 +706,76 @@
         <w:t xml:space="preserve">) on any prior date.</w:t>
       </w:r>
     </w:p>
-    <w:bookmarkEnd w:id="15"/>
-    <w:bookmarkStart w:id="17" w:name="exclusion-criteria"/>
-    <w:p>
-      <w:pPr>
-        <w:pStyle w:val="Heading3"/>
-      </w:pPr>
-      <w:r>
-        <w:t xml:space="preserve">3.3.2 Exclusion criteria</w:t>
-      </w:r>
-    </w:p>
     <w:p>
       <w:pPr>
         <w:pStyle w:val="Compact"/>
         <w:numPr>
           <w:ilvl w:val="0"/>
-          <w:numId w:val="1006"/>
+          <w:numId w:val="1003"/>
+        </w:numPr>
+      </w:pPr>
+      <w:r>
+        <w:t xml:space="preserve">Known sex that is exactly</w:t>
+      </w:r>
+      <w:r>
+        <w:t xml:space="preserve"> </w:t>
+      </w:r>
+      <w:r>
+        <w:t xml:space="preserve">‘male’</w:t>
+      </w:r>
+      <w:r>
+        <w:t xml:space="preserve"> </w:t>
+      </w:r>
+      <w:r>
+        <w:t xml:space="preserve">or</w:t>
+      </w:r>
+      <w:r>
+        <w:t xml:space="preserve"> </w:t>
+      </w:r>
+      <w:r>
+        <w:t xml:space="preserve">‘female’</w:t>
+      </w:r>
+    </w:p>
+    <w:p>
+      <w:pPr>
+        <w:pStyle w:val="Compact"/>
+        <w:numPr>
+          <w:ilvl w:val="0"/>
+          <w:numId w:val="1003"/>
+        </w:numPr>
+      </w:pPr>
+      <w:r>
+        <w:t xml:space="preserve">Known region</w:t>
+      </w:r>
+    </w:p>
+    <w:p>
+      <w:pPr>
+        <w:pStyle w:val="Compact"/>
+        <w:numPr>
+          <w:ilvl w:val="0"/>
+          <w:numId w:val="1003"/>
+        </w:numPr>
+      </w:pPr>
+      <w:r>
+        <w:t xml:space="preserve">Known IMD</w:t>
+      </w:r>
+    </w:p>
+    <w:bookmarkEnd w:id="15"/>
+    <w:bookmarkStart w:id="17" w:name="exclusion-criteria"/>
+    <w:p>
+      <w:pPr>
+        <w:pStyle w:val="Heading3"/>
+      </w:pPr>
+      <w:r>
+        <w:t xml:space="preserve">3.3.2 Exclusion criteria</w:t>
+      </w:r>
+    </w:p>
+    <w:p>
+      <w:pPr>
+        <w:pStyle w:val="Compact"/>
+        <w:numPr>
+          <w:ilvl w:val="0"/>
+          <w:numId w:val="1005"/>
         </w:numPr>
       </w:pPr>
       <w:r>
@@ -828,7 +831,7 @@
         <w:pStyle w:val="Compact"/>
         <w:numPr>
           <w:ilvl w:val="0"/>
-          <w:numId w:val="1007"/>
+          <w:numId w:val="1006"/>
         </w:numPr>
       </w:pPr>
       <w:r>
@@ -840,7 +843,7 @@
         <w:pStyle w:val="Compact"/>
         <w:numPr>
           <w:ilvl w:val="0"/>
-          <w:numId w:val="1007"/>
+          <w:numId w:val="1006"/>
         </w:numPr>
       </w:pPr>
       <w:r>
@@ -852,7 +855,7 @@
         <w:pStyle w:val="Compact"/>
         <w:numPr>
           <w:ilvl w:val="0"/>
-          <w:numId w:val="1007"/>
+          <w:numId w:val="1006"/>
         </w:numPr>
       </w:pPr>
       <w:r>
@@ -864,7 +867,7 @@
         <w:pStyle w:val="Compact"/>
         <w:numPr>
           <w:ilvl w:val="0"/>
-          <w:numId w:val="1007"/>
+          <w:numId w:val="1006"/>
         </w:numPr>
       </w:pPr>
       <w:r>
@@ -886,106 +889,51 @@
         <w:pStyle w:val="FirstParagraph"/>
       </w:pPr>
       <w:r>
-        <w:t xml:space="preserve">Individuals will only be included if they meet all the following criteria:</w:t>
-      </w:r>
-    </w:p>
-    <w:p>
-      <w:pPr>
-        <w:pStyle w:val="Compact"/>
-        <w:numPr>
-          <w:ilvl w:val="0"/>
-          <w:numId w:val="1008"/>
-        </w:numPr>
-      </w:pPr>
-      <w:r>
-        <w:t xml:space="preserve">Known sex that is exactly</w:t>
-      </w:r>
-      <w:r>
-        <w:t xml:space="preserve"> </w:t>
-      </w:r>
-      <w:r>
-        <w:t xml:space="preserve">‘male’</w:t>
-      </w:r>
-      <w:r>
-        <w:t xml:space="preserve"> </w:t>
-      </w:r>
-      <w:r>
-        <w:t xml:space="preserve">or</w:t>
-      </w:r>
-      <w:r>
-        <w:t xml:space="preserve"> </w:t>
-      </w:r>
-      <w:r>
-        <w:t xml:space="preserve">‘female’</w:t>
-      </w:r>
-    </w:p>
-    <w:p>
-      <w:pPr>
-        <w:pStyle w:val="Compact"/>
-        <w:numPr>
-          <w:ilvl w:val="0"/>
-          <w:numId w:val="1008"/>
-        </w:numPr>
-      </w:pPr>
-      <w:r>
-        <w:t xml:space="preserve">Known date of birth</w:t>
-      </w:r>
-    </w:p>
-    <w:p>
-      <w:pPr>
-        <w:pStyle w:val="Compact"/>
-        <w:numPr>
-          <w:ilvl w:val="0"/>
-          <w:numId w:val="1008"/>
-        </w:numPr>
-      </w:pPr>
-      <w:r>
-        <w:t xml:space="preserve">(Known IMD</w:t>
-      </w:r>
-    </w:p>
-    <w:p>
-      <w:pPr>
-        <w:pStyle w:val="Compact"/>
-        <w:numPr>
-          <w:ilvl w:val="0"/>
-          <w:numId w:val="1008"/>
-        </w:numPr>
-      </w:pPr>
-      <w:r>
-        <w:t xml:space="preserve">Known ethnicity</w:t>
-      </w:r>
-    </w:p>
-    <w:p>
-      <w:pPr>
-        <w:pStyle w:val="Compact"/>
-        <w:numPr>
-          <w:ilvl w:val="0"/>
-          <w:numId w:val="1008"/>
-        </w:numPr>
-      </w:pPr>
-      <w:r>
-        <w:t xml:space="preserve">Known STP) -</w:t>
-      </w:r>
-      <w:r>
-        <w:t xml:space="preserve"> </w:t>
-      </w:r>
-      <w:r>
-        <w:rPr>
-          <w:i/>
-          <w:iCs/>
-        </w:rPr>
-        <w:t xml:space="preserve">I’m not sure about these bottom three - they may well exclude people unnecessarily</w:t>
+        <w:t xml:space="preserve">We will remove patients whose data fails quality assurance checks:</w:t>
+      </w:r>
+      <w:r>
+        <w:t xml:space="preserve"> </w:t>
+      </w:r>
+      <w:r>
+        <w:t xml:space="preserve">- Remove patients whose year of birth is missing</w:t>
+      </w:r>
+      <w:r>
+        <w:t xml:space="preserve"> </w:t>
+      </w:r>
+      <w:r>
+        <w:t xml:space="preserve">- Remove patients whose year of birth after year of death</w:t>
+      </w:r>
+      <w:r>
+        <w:t xml:space="preserve"> </w:t>
+      </w:r>
+      <w:r>
+        <w:t xml:space="preserve">- Remove patients whose date of death is after today</w:t>
+      </w:r>
+      <w:r>
+        <w:t xml:space="preserve"> </w:t>
+      </w:r>
+      <w:r>
+        <w:t xml:space="preserve">- Remove patients whose year of birth is after today</w:t>
       </w:r>
     </w:p>
     <w:bookmarkEnd w:id="19"/>
     <w:bookmarkEnd w:id="20"/>
-    <w:bookmarkStart w:id="25" w:name="medication-data"/>
+    <w:bookmarkStart w:id="30" w:name="prescribing-information"/>
     <w:p>
       <w:pPr>
         <w:pStyle w:val="Heading2"/>
       </w:pPr>
       <w:r>
-        <w:t xml:space="preserve">3.4 Medication data</w:t>
+        <w:t xml:space="preserve">3.4 Prescribing information</w:t>
+      </w:r>
+    </w:p>
+    <w:bookmarkStart w:id="22" w:name="prescribing-data"/>
+    <w:p>
+      <w:pPr>
+        <w:pStyle w:val="Heading3"/>
+      </w:pPr>
+      <w:r>
+        <w:t xml:space="preserve">3.4.1 Prescribing data</w:t>
       </w:r>
     </w:p>
     <w:p>
@@ -1021,13 +969,14 @@
         <w:t xml:space="preserve">are the preferred mechanism through which medicinal product identification and communication occurs within the NHS. In OpenSAFELY, each dm+d code corresponds to the name (e.g. atorvastatin), strength (e.g. 40mg) and formulation (e.g. tablet) of a prescribed drug. Data on the dosing recommendation (e.g. take 1 tablet once a day), the quantity of a medication prescribed (e.g. 28 tablets), whether a prescription was dispensed, or whether the patient adhered to the medication as prescribed are not available.</w:t>
       </w:r>
     </w:p>
-    <w:bookmarkStart w:id="24" w:name="medication-data-handling"/>
+    <w:bookmarkEnd w:id="22"/>
+    <w:bookmarkStart w:id="25" w:name="prescribing-data-handling"/>
     <w:p>
       <w:pPr>
         <w:pStyle w:val="Heading3"/>
       </w:pPr>
       <w:r>
-        <w:t xml:space="preserve">3.4.1 Medication data handling</w:t>
+        <w:t xml:space="preserve">3.4.2 Prescribing data handling</w:t>
       </w:r>
     </w:p>
     <w:p>
@@ -1040,7 +989,7 @@
       <w:r>
         <w:t xml:space="preserve"> </w:t>
       </w:r>
-      <w:hyperlink r:id="rId22">
+      <w:hyperlink r:id="rId23">
         <w:r>
           <w:rPr>
             <w:rStyle w:val="Hyperlink"/>
@@ -1083,7 +1032,7 @@
       <w:r>
         <w:t xml:space="preserve"> </w:t>
       </w:r>
-      <w:hyperlink r:id="rId23">
+      <w:hyperlink r:id="rId24">
         <w:r>
           <w:rPr>
             <w:rStyle w:val="Hyperlink"/>
@@ -1095,15 +1044,14 @@
         <w:t xml:space="preserve">. BNF codes follow a clear hierarchical structure and allow for clinically meaningful analysis.</w:t>
       </w:r>
     </w:p>
-    <w:bookmarkEnd w:id="24"/>
     <w:bookmarkEnd w:id="25"/>
-    <w:bookmarkStart w:id="29" w:name="medication-inclusion-exclusion"/>
-    <w:p>
-      <w:pPr>
-        <w:pStyle w:val="Heading2"/>
-      </w:pPr>
-      <w:r>
-        <w:t xml:space="preserve">3.5 Medication inclusion / exclusion</w:t>
+    <w:bookmarkStart w:id="29" w:name="medication-inclusion-exclusion-criteria"/>
+    <w:p>
+      <w:pPr>
+        <w:pStyle w:val="Heading3"/>
+      </w:pPr>
+      <w:r>
+        <w:t xml:space="preserve">3.4.3 Medication inclusion / exclusion criteria</w:t>
       </w:r>
     </w:p>
     <w:p>
@@ -1136,10 +1084,10 @@
     <w:bookmarkStart w:id="26" w:name="scope"/>
     <w:p>
       <w:pPr>
-        <w:pStyle w:val="Heading3"/>
-      </w:pPr>
-      <w:r>
-        <w:t xml:space="preserve">3.5.1 Scope</w:t>
+        <w:pStyle w:val="Heading4"/>
+      </w:pPr>
+      <w:r>
+        <w:t xml:space="preserve">3.4.3.1 Scope</w:t>
       </w:r>
     </w:p>
     <w:p>
@@ -1155,7 +1103,7 @@
         <w:pStyle w:val="Compact"/>
         <w:numPr>
           <w:ilvl w:val="0"/>
-          <w:numId w:val="1009"/>
+          <w:numId w:val="1007"/>
         </w:numPr>
       </w:pPr>
       <w:r>
@@ -1167,7 +1115,7 @@
         <w:pStyle w:val="Compact"/>
         <w:numPr>
           <w:ilvl w:val="0"/>
-          <w:numId w:val="1009"/>
+          <w:numId w:val="1007"/>
         </w:numPr>
       </w:pPr>
       <w:r>
@@ -1186,10 +1134,10 @@
     <w:bookmarkStart w:id="27" w:name="uniqueness"/>
     <w:p>
       <w:pPr>
-        <w:pStyle w:val="Heading3"/>
-      </w:pPr>
-      <w:r>
-        <w:t xml:space="preserve">3.5.2 Uniqueness</w:t>
+        <w:pStyle w:val="Heading4"/>
+      </w:pPr>
+      <w:r>
+        <w:t xml:space="preserve">3.4.3.2 Uniqueness</w:t>
       </w:r>
     </w:p>
     <w:p>
@@ -1204,10 +1152,10 @@
     <w:bookmarkStart w:id="28" w:name="timeframe"/>
     <w:p>
       <w:pPr>
-        <w:pStyle w:val="Heading3"/>
-      </w:pPr>
-      <w:r>
-        <w:t xml:space="preserve">3.5.3 Timeframe</w:t>
+        <w:pStyle w:val="Heading4"/>
+      </w:pPr>
+      <w:r>
+        <w:t xml:space="preserve">3.4.3.3 Timeframe</w:t>
       </w:r>
     </w:p>
     <w:p>
@@ -1248,7 +1196,7 @@
         <w:pStyle w:val="BodyText"/>
       </w:pPr>
       <w:r>
-        <w:t xml:space="preserve">Considering this variability, we will define a medication as chronic, and include it in our analyses, if it is prescribed:</w:t>
+        <w:t xml:space="preserve">Considering this variability, we will define a medication as chronic, and include it in our analyses, if all of the following are true:</w:t>
       </w:r>
     </w:p>
     <w:p>
@@ -1256,11 +1204,55 @@
         <w:pStyle w:val="Compact"/>
         <w:numPr>
           <w:ilvl w:val="0"/>
-          <w:numId w:val="1010"/>
+          <w:numId w:val="1008"/>
         </w:numPr>
       </w:pPr>
       <w:r>
-        <w:t xml:space="preserve">Two or more times within the 180 days prior to study entry, and</w:t>
+        <w:t xml:space="preserve">In the 180 days prior to the index date:</w:t>
+      </w:r>
+    </w:p>
+    <w:p>
+      <w:pPr>
+        <w:pStyle w:val="Compact"/>
+        <w:numPr>
+          <w:ilvl w:val="1"/>
+          <w:numId w:val="1009"/>
+        </w:numPr>
+      </w:pPr>
+      <w:r>
+        <w:t xml:space="preserve">It is prescribed two or more times (</w:t>
+      </w:r>
+      <w:r>
+        <w:rPr>
+          <w:i/>
+          <w:iCs/>
+        </w:rPr>
+        <w:t xml:space="preserve">regular</w:t>
+      </w:r>
+      <w:r>
+        <w:t xml:space="preserve">)</w:t>
+      </w:r>
+    </w:p>
+    <w:p>
+      <w:pPr>
+        <w:pStyle w:val="Compact"/>
+        <w:numPr>
+          <w:ilvl w:val="1"/>
+          <w:numId w:val="1009"/>
+        </w:numPr>
+      </w:pPr>
+      <w:r>
+        <w:t xml:space="preserve">There are &gt;=21 days between the oldest and the most recent prescriptions (</w:t>
+      </w:r>
+      <w:r>
+        <w:rPr>
+          <w:i/>
+          <w:iCs/>
+        </w:rPr>
+        <w:t xml:space="preserve">sustained</w:t>
+      </w:r>
+      <w:r>
+        <w:t xml:space="preserve">)</w:t>
       </w:r>
     </w:p>
     <w:p>
@@ -1268,36 +1260,45 @@
         <w:pStyle w:val="Compact"/>
         <w:numPr>
           <w:ilvl w:val="0"/>
+          <w:numId w:val="1008"/>
+        </w:numPr>
+      </w:pPr>
+      <w:r>
+        <w:t xml:space="preserve">In the 90 days prior to the index date:</w:t>
+      </w:r>
+    </w:p>
+    <w:p>
+      <w:pPr>
+        <w:pStyle w:val="Compact"/>
+        <w:numPr>
+          <w:ilvl w:val="1"/>
           <w:numId w:val="1010"/>
         </w:numPr>
       </w:pPr>
       <w:r>
-        <w:t xml:space="preserve">At least once within the most recent 90 days.</w:t>
-      </w:r>
-    </w:p>
-    <w:p>
-      <w:pPr>
-        <w:pStyle w:val="FirstParagraph"/>
-      </w:pPr>
-      <w:r>
-        <w:t xml:space="preserve">Additionally, within those 180 days there must be &gt;=21 days between the first and last prescriptions</w:t>
-      </w:r>
-      <w:r>
-        <w:t xml:space="preserve"> </w:t>
-      </w:r>
-      <w:r>
-        <w:t xml:space="preserve">This effect of this definition on results will be explored through sensitivity analyses.</w:t>
+        <w:t xml:space="preserve">It is prescribed once or more (</w:t>
+      </w:r>
+      <w:r>
+        <w:rPr>
+          <w:i/>
+          <w:iCs/>
+        </w:rPr>
+        <w:t xml:space="preserve">recent</w:t>
+      </w:r>
+      <w:r>
+        <w:t xml:space="preserve">)</w:t>
       </w:r>
     </w:p>
     <w:bookmarkEnd w:id="28"/>
     <w:bookmarkEnd w:id="29"/>
-    <w:bookmarkStart w:id="30" w:name="medication-discontinuation"/>
+    <w:bookmarkEnd w:id="30"/>
+    <w:bookmarkStart w:id="31" w:name="outcome---medication-discontinuation"/>
     <w:p>
       <w:pPr>
         <w:pStyle w:val="Heading2"/>
       </w:pPr>
       <w:r>
-        <w:t xml:space="preserve">3.6 Medication discontinuation</w:t>
+        <w:t xml:space="preserve">3.5 Outcome - medication discontinuation</w:t>
       </w:r>
     </w:p>
     <w:p>
@@ -1305,7 +1306,15 @@
         <w:pStyle w:val="FirstParagraph"/>
       </w:pPr>
       <w:r>
-        <w:t xml:space="preserve">Medications prescribed at baseline will be followed longitudinally for up to 4 years to examine patterns of discontinuation. In line with previous publications</w:t>
+        <w:t xml:space="preserve">Medications prescribed at baseline will be followed longitudinally for up to 4 years to examine patterns of discontinuation.</w:t>
+      </w:r>
+    </w:p>
+    <w:p>
+      <w:pPr>
+        <w:pStyle w:val="BodyText"/>
+      </w:pPr>
+      <w:r>
+        <w:t xml:space="preserve">Within OpenSAFELY-TPP the duration of each prescription is unknown. In line with previous publications</w:t>
       </w:r>
       <w:r>
         <w:t xml:space="preserve"> </w:t>
@@ -1314,7 +1323,7 @@
         <w:t xml:space="preserve">(15)</w:t>
       </w:r>
       <w:r>
-        <w:t xml:space="preserve">, discontinuation will be defined by a gap in prescribing of a chronic medicine. Initially a gap of ≥90 days will be used, but sensitivity analyses will explore the effect of using gaps of: ≥30 days, ≥60 days and ≥180 days. The discontinuation date will be defined as the date after the end of the gap following the last prescription.</w:t>
+        <w:t xml:space="preserve">, discontinuation will be defined as a gap of a prescription of a chronic medicine of 120 days or more. This will allow a window of time for re-prescription to occur even if the prescription was issued for 84 days (the maximum length in usual practice in England). The date of discontinuation will be defined as the date of the last prescription.</w:t>
       </w:r>
     </w:p>
     <w:p>
@@ -1322,23 +1331,21 @@
         <w:pStyle w:val="BodyText"/>
       </w:pPr>
       <w:r>
-        <w:t xml:space="preserve">— dose reduction? —</w:t>
-      </w:r>
-      <w:r>
-        <w:t xml:space="preserve"> </w:t>
-      </w:r>
-      <w:r>
-        <w:t xml:space="preserve">— modelling prior gaps? —</w:t>
-      </w:r>
-    </w:p>
-    <w:bookmarkEnd w:id="30"/>
-    <w:bookmarkStart w:id="34" w:name="covariates"/>
+        <w:rPr>
+          <w:i/>
+          <w:iCs/>
+        </w:rPr>
+        <w:t xml:space="preserve">This needs discussion - could this be operationalised better? We could look at dose reduction, or something more complex modelling prior gaps</w:t>
+      </w:r>
+    </w:p>
+    <w:bookmarkEnd w:id="31"/>
+    <w:bookmarkStart w:id="33" w:name="covariates"/>
     <w:p>
       <w:pPr>
         <w:pStyle w:val="Heading2"/>
       </w:pPr>
       <w:r>
-        <w:t xml:space="preserve">3.7 Covariates</w:t>
+        <w:t xml:space="preserve">3.6 Covariates</w:t>
       </w:r>
     </w:p>
     <w:p>
@@ -1346,7 +1353,7 @@
         <w:pStyle w:val="FirstParagraph"/>
       </w:pPr>
       <w:r>
-        <w:t xml:space="preserve">The effect of various participant characteristics on prescribing at study entry and medication discontinuation will be explored. The characteristics have been chosen for two different reasons:</w:t>
+        <w:t xml:space="preserve">Covariates have been chosen for two different reasons:</w:t>
       </w:r>
     </w:p>
     <w:p>
@@ -1378,7 +1385,1309 @@
         <w:pStyle w:val="FirstParagraph"/>
       </w:pPr>
       <w:r>
-        <w:t xml:space="preserve">Covariates, which will be defined on the index date are:</w:t>
+        <w:t xml:space="preserve">Covariates, which will be defined on the index date, are described in the table below.</w:t>
+      </w:r>
+    </w:p>
+    <w:tbl>
+      <w:tblPr>
+        <w:tblStyle w:val="Table"/>
+        <w:tblW w:type="pct" w:w="4946"/>
+        <w:tblLayout w:type="fixed"/>
+        <w:tblLook w:firstRow="1" w:lastRow="0" w:firstColumn="0" w:lastColumn="0" w:noHBand="0" w:noVBand="0" w:val="0020"/>
+      </w:tblPr>
+      <w:tblGrid>
+        <w:gridCol w:w="2469"/>
+        <w:gridCol w:w="1362"/>
+        <w:gridCol w:w="4002"/>
+      </w:tblGrid>
+      <w:tr>
+        <w:trPr>
+          <w:tblHeader w:val="on"/>
+        </w:trPr>
+        <w:tc>
+          <w:tcPr/>
+          <w:p>
+            <w:pPr>
+              <w:pStyle w:val="Compact"/>
+            </w:pPr>
+            <w:r>
+              <w:rPr>
+                <w:b/>
+                <w:bCs/>
+              </w:rPr>
+              <w:t xml:space="preserve">Covariate</w:t>
+            </w:r>
+          </w:p>
+        </w:tc>
+        <w:tc>
+          <w:tcPr/>
+          <w:p>
+            <w:pPr>
+              <w:pStyle w:val="Compact"/>
+            </w:pPr>
+            <w:r>
+              <w:rPr>
+                <w:b/>
+                <w:bCs/>
+              </w:rPr>
+              <w:t xml:space="preserve">Type</w:t>
+            </w:r>
+          </w:p>
+        </w:tc>
+        <w:tc>
+          <w:tcPr/>
+          <w:p>
+            <w:pPr>
+              <w:pStyle w:val="Compact"/>
+            </w:pPr>
+            <w:r>
+              <w:rPr>
+                <w:b/>
+                <w:bCs/>
+              </w:rPr>
+              <w:t xml:space="preserve">Definition</w:t>
+            </w:r>
+          </w:p>
+        </w:tc>
+      </w:tr>
+      <w:tr>
+        <w:tc>
+          <w:tcPr/>
+          <w:p>
+            <w:pPr>
+              <w:pStyle w:val="Compact"/>
+            </w:pPr>
+            <w:r>
+              <w:t xml:space="preserve">Age</w:t>
+            </w:r>
+          </w:p>
+        </w:tc>
+        <w:tc>
+          <w:tcPr/>
+          <w:p>
+            <w:pPr>
+              <w:pStyle w:val="Compact"/>
+            </w:pPr>
+            <w:r>
+              <w:t xml:space="preserve">Continuous</w:t>
+            </w:r>
+          </w:p>
+        </w:tc>
+        <w:tc>
+          <w:tcPr/>
+          <w:p>
+            <w:pPr>
+              <w:pStyle w:val="BodyText"/>
+            </w:pPr>
+            <w:r>
+              <w:t xml:space="preserve">Age in years calculated from year of birth.</w:t>
+            </w:r>
+            <w:r>
+              <w:t xml:space="preserve"> </w:t>
+            </w:r>
+            <w:r>
+              <w:t xml:space="preserve">Will be modelled using splines</w:t>
+            </w:r>
+          </w:p>
+          <w:p>
+            <w:pPr>
+              <w:pStyle w:val="BodyText"/>
+            </w:pPr>
+            <w:r>
+              <w:t xml:space="preserve">Strata: 18–49, 50–64, 65–74, 75–84, ≥85</w:t>
+            </w:r>
+          </w:p>
+        </w:tc>
+      </w:tr>
+      <w:tr>
+        <w:tc>
+          <w:tcPr/>
+          <w:p>
+            <w:pPr>
+              <w:pStyle w:val="Compact"/>
+            </w:pPr>
+            <w:r>
+              <w:t xml:space="preserve">Sex</w:t>
+            </w:r>
+          </w:p>
+        </w:tc>
+        <w:tc>
+          <w:tcPr/>
+          <w:p>
+            <w:pPr>
+              <w:pStyle w:val="Compact"/>
+            </w:pPr>
+            <w:r>
+              <w:t xml:space="preserve">Categorical</w:t>
+            </w:r>
+          </w:p>
+        </w:tc>
+        <w:tc>
+          <w:tcPr/>
+          <w:p>
+            <w:pPr>
+              <w:pStyle w:val="Compact"/>
+            </w:pPr>
+            <w:r>
+              <w:t xml:space="preserve">Male or female</w:t>
+            </w:r>
+          </w:p>
+        </w:tc>
+      </w:tr>
+      <w:tr>
+        <w:tc>
+          <w:tcPr/>
+          <w:p>
+            <w:pPr>
+              <w:pStyle w:val="Compact"/>
+            </w:pPr>
+            <w:r>
+              <w:t xml:space="preserve">Ethnicity</w:t>
+            </w:r>
+          </w:p>
+        </w:tc>
+        <w:tc>
+          <w:tcPr/>
+          <w:p>
+            <w:pPr>
+              <w:pStyle w:val="Compact"/>
+            </w:pPr>
+            <w:r>
+              <w:t xml:space="preserve">Categorical</w:t>
+            </w:r>
+          </w:p>
+        </w:tc>
+        <w:tc>
+          <w:tcPr/>
+          <w:p>
+            <w:pPr>
+              <w:pStyle w:val="BodyText"/>
+            </w:pPr>
+            <w:r>
+              <w:t xml:space="preserve">Derived from GP record and NHS</w:t>
+            </w:r>
+            <w:r>
+              <w:t xml:space="preserve"> </w:t>
+            </w:r>
+            <w:r>
+              <w:t xml:space="preserve">Secondary Uses Service data, using</w:t>
+            </w:r>
+            <w:r>
+              <w:t xml:space="preserve"> </w:t>
+            </w:r>
+            <w:r>
+              <w:t xml:space="preserve">the most recent non-missing value. Strata:</w:t>
+            </w:r>
+          </w:p>
+          <w:p>
+            <w:pPr>
+              <w:pStyle w:val="BodyText"/>
+            </w:pPr>
+            <w:r>
+              <w:t xml:space="preserve">White</w:t>
+            </w:r>
+            <w:r>
+              <w:br/>
+            </w:r>
+            <w:r>
+              <w:t xml:space="preserve">Mixed / Multiple ethnic</w:t>
+            </w:r>
+            <w:r>
+              <w:br/>
+            </w:r>
+            <w:r>
+              <w:t xml:space="preserve">Asian / Asian British</w:t>
+            </w:r>
+            <w:r>
+              <w:br/>
+            </w:r>
+            <w:r>
+              <w:t xml:space="preserve">Black / African / Caribbean / Black British</w:t>
+            </w:r>
+            <w:r>
+              <w:br/>
+            </w:r>
+            <w:r>
+              <w:t xml:space="preserve">Other ethnic group</w:t>
+            </w:r>
+            <w:r>
+              <w:br/>
+            </w:r>
+            <w:r>
+              <w:t xml:space="preserve">Not stated / Not known</w:t>
+            </w:r>
+            <w:r>
+              <w:br/>
+            </w:r>
+          </w:p>
+        </w:tc>
+      </w:tr>
+      <w:tr>
+        <w:tc>
+          <w:tcPr/>
+          <w:p>
+            <w:pPr>
+              <w:pStyle w:val="Compact"/>
+            </w:pPr>
+            <w:r>
+              <w:t xml:space="preserve">Deprivation</w:t>
+            </w:r>
+          </w:p>
+        </w:tc>
+        <w:tc>
+          <w:tcPr/>
+          <w:p>
+            <w:pPr>
+              <w:pStyle w:val="Compact"/>
+            </w:pPr>
+            <w:r>
+              <w:t xml:space="preserve">Categorical</w:t>
+            </w:r>
+          </w:p>
+        </w:tc>
+        <w:tc>
+          <w:tcPr/>
+          <w:p>
+            <w:pPr>
+              <w:pStyle w:val="Compact"/>
+            </w:pPr>
+            <w:r>
+              <w:t xml:space="preserve">Deciles of Index of Multiple Deprivation</w:t>
+            </w:r>
+            <w:r>
+              <w:t xml:space="preserve"> </w:t>
+            </w:r>
+            <w:r>
+              <w:t xml:space="preserve">(IMD) based on address on index date</w:t>
+            </w:r>
+          </w:p>
+        </w:tc>
+      </w:tr>
+      <w:tr>
+        <w:tc>
+          <w:tcPr/>
+          <w:p>
+            <w:pPr>
+              <w:pStyle w:val="Compact"/>
+            </w:pPr>
+            <w:r>
+              <w:t xml:space="preserve">eGFR</w:t>
+            </w:r>
+          </w:p>
+        </w:tc>
+        <w:tc>
+          <w:tcPr/>
+          <w:p>
+            <w:pPr>
+              <w:pStyle w:val="Compact"/>
+            </w:pPr>
+            <w:r>
+              <w:t xml:space="preserve">Continuous</w:t>
+            </w:r>
+          </w:p>
+        </w:tc>
+        <w:tc>
+          <w:tcPr/>
+          <w:p>
+            <w:pPr>
+              <w:pStyle w:val="Compact"/>
+            </w:pPr>
+            <w:r>
+              <w:t xml:space="preserve">Estimated glomerular filtration rate</w:t>
+            </w:r>
+            <w:r>
+              <w:t xml:space="preserve"> </w:t>
+            </w:r>
+            <w:r>
+              <w:t xml:space="preserve">on the index date, calculated from</w:t>
+            </w:r>
+            <w:r>
+              <w:t xml:space="preserve"> </w:t>
+            </w:r>
+            <w:r>
+              <w:t xml:space="preserve">the most recent serum creatinine</w:t>
+            </w:r>
+            <w:r>
+              <w:t xml:space="preserve"> </w:t>
+            </w:r>
+            <w:r>
+              <w:t xml:space="preserve">using the 2009 CKD-EPI equation</w:t>
+            </w:r>
+          </w:p>
+        </w:tc>
+      </w:tr>
+      <w:tr>
+        <w:tc>
+          <w:tcPr/>
+          <w:p>
+            <w:pPr>
+              <w:pStyle w:val="Compact"/>
+            </w:pPr>
+            <w:r>
+              <w:t xml:space="preserve">Number of chronic</w:t>
+            </w:r>
+            <w:r>
+              <w:t xml:space="preserve"> </w:t>
+            </w:r>
+            <w:r>
+              <w:t xml:space="preserve">prescriptions</w:t>
+            </w:r>
+          </w:p>
+        </w:tc>
+        <w:tc>
+          <w:tcPr/>
+          <w:p>
+            <w:pPr>
+              <w:pStyle w:val="Compact"/>
+            </w:pPr>
+            <w:r>
+              <w:t xml:space="preserve">Continuous</w:t>
+            </w:r>
+          </w:p>
+        </w:tc>
+        <w:tc>
+          <w:tcPr/>
+          <w:p>
+            <w:pPr>
+              <w:pStyle w:val="Compact"/>
+            </w:pPr>
+            <w:r>
+              <w:t xml:space="preserve">Count of distinct included chronic</w:t>
+            </w:r>
+            <w:r>
+              <w:t xml:space="preserve"> </w:t>
+            </w:r>
+            <w:r>
+              <w:t xml:space="preserve">medications on the index date</w:t>
+            </w:r>
+          </w:p>
+        </w:tc>
+      </w:tr>
+      <w:tr>
+        <w:tc>
+          <w:tcPr/>
+          <w:p>
+            <w:pPr>
+              <w:pStyle w:val="Compact"/>
+            </w:pPr>
+            <w:r>
+              <w:t xml:space="preserve">Region</w:t>
+            </w:r>
+          </w:p>
+        </w:tc>
+        <w:tc>
+          <w:tcPr/>
+          <w:p>
+            <w:pPr>
+              <w:pStyle w:val="Compact"/>
+            </w:pPr>
+            <w:r>
+              <w:t xml:space="preserve">Categorical</w:t>
+            </w:r>
+          </w:p>
+        </w:tc>
+        <w:tc>
+          <w:tcPr/>
+          <w:p>
+            <w:pPr>
+              <w:pStyle w:val="Compact"/>
+            </w:pPr>
+            <w:r>
+              <w:t xml:space="preserve">East of England</w:t>
+            </w:r>
+            <w:r>
+              <w:br/>
+            </w:r>
+            <w:r>
+              <w:t xml:space="preserve">London</w:t>
+            </w:r>
+            <w:r>
+              <w:br/>
+            </w:r>
+            <w:r>
+              <w:t xml:space="preserve">Midlands</w:t>
+            </w:r>
+            <w:r>
+              <w:br/>
+            </w:r>
+            <w:r>
+              <w:t xml:space="preserve">North East and Yorkshire</w:t>
+            </w:r>
+            <w:r>
+              <w:br/>
+            </w:r>
+            <w:r>
+              <w:t xml:space="preserve">North West</w:t>
+            </w:r>
+            <w:r>
+              <w:br/>
+            </w:r>
+            <w:r>
+              <w:t xml:space="preserve">South East</w:t>
+            </w:r>
+            <w:r>
+              <w:br/>
+            </w:r>
+            <w:r>
+              <w:t xml:space="preserve">South West</w:t>
+            </w:r>
+            <w:r>
+              <w:br/>
+            </w:r>
+          </w:p>
+        </w:tc>
+      </w:tr>
+      <w:tr>
+        <w:tc>
+          <w:tcPr/>
+          <w:p>
+            <w:pPr>
+              <w:pStyle w:val="Compact"/>
+            </w:pPr>
+            <w:r>
+              <w:t xml:space="preserve">Frailty</w:t>
+            </w:r>
+          </w:p>
+        </w:tc>
+        <w:tc>
+          <w:tcPr/>
+          <w:p>
+            <w:pPr>
+              <w:pStyle w:val="Compact"/>
+            </w:pPr>
+            <w:r>
+              <w:t xml:space="preserve">Categorical</w:t>
+            </w:r>
+          </w:p>
+        </w:tc>
+        <w:tc>
+          <w:tcPr/>
+          <w:p>
+            <w:pPr>
+              <w:pStyle w:val="Compact"/>
+            </w:pPr>
+            <w:r>
+              <w:t xml:space="preserve">Characterised using the electronic</w:t>
+            </w:r>
+            <w:r>
+              <w:t xml:space="preserve"> </w:t>
+            </w:r>
+            <w:r>
+              <w:t xml:space="preserve">frailty index (eFI, ideally eFI2</w:t>
+            </w:r>
+            <w:r>
+              <w:t xml:space="preserve"> </w:t>
+            </w:r>
+            <w:r>
+              <w:t xml:space="preserve">(16)</w:t>
+            </w:r>
+            <w:r>
+              <w:t xml:space="preserve">), a widely used metric</w:t>
+            </w:r>
+            <w:r>
+              <w:t xml:space="preserve"> </w:t>
+            </w:r>
+            <w:r>
+              <w:t xml:space="preserve">for identifying frailty in</w:t>
+            </w:r>
+            <w:r>
+              <w:t xml:space="preserve"> </w:t>
+            </w:r>
+            <w:r>
+              <w:t xml:space="preserve">electronic health records.</w:t>
+            </w:r>
+            <w:r>
+              <w:t xml:space="preserve"> </w:t>
+            </w:r>
+            <w:r>
+              <w:t xml:space="preserve">This is all tbc - watch the OS Slack</w:t>
+            </w:r>
+            <w:r>
+              <w:t xml:space="preserve"> </w:t>
+            </w:r>
+            <w:r>
+              <w:t xml:space="preserve">Strata: non-frail, mildly frail,</w:t>
+            </w:r>
+            <w:r>
+              <w:t xml:space="preserve"> </w:t>
+            </w:r>
+            <w:r>
+              <w:t xml:space="preserve">moderately frail, severely frail</w:t>
+            </w:r>
+            <w:r>
+              <w:t xml:space="preserve"> </w:t>
+            </w:r>
+            <w:r>
+              <w:t xml:space="preserve">https://github.com/opensafely/covid_collater</w:t>
+            </w:r>
+            <w:r>
+              <w:t xml:space="preserve"> </w:t>
+            </w:r>
+            <w:r>
+              <w:t xml:space="preserve">al_hf_update/blob/236c243cf4882e73393761083d</w:t>
+            </w:r>
+            <w:r>
+              <w:t xml:space="preserve"> </w:t>
+            </w:r>
+            <w:r>
+              <w:t xml:space="preserve">ee1be2340b8d6a/analysis/eFI_calc_hf.do</w:t>
+            </w:r>
+          </w:p>
+        </w:tc>
+      </w:tr>
+      <w:tr>
+        <w:tc>
+          <w:tcPr/>
+          <w:p>
+            <w:pPr>
+              <w:pStyle w:val="Compact"/>
+            </w:pPr>
+            <w:r>
+              <w:t xml:space="preserve">Care home status</w:t>
+            </w:r>
+          </w:p>
+        </w:tc>
+        <w:tc>
+          <w:tcPr/>
+          <w:p>
+            <w:pPr>
+              <w:pStyle w:val="Compact"/>
+            </w:pPr>
+            <w:r>
+              <w:t xml:space="preserve">Binary</w:t>
+            </w:r>
+          </w:p>
+        </w:tc>
+        <w:tc>
+          <w:tcPr/>
+          <w:p>
+            <w:pPr>
+              <w:pStyle w:val="Compact"/>
+            </w:pPr>
+            <w:r>
+              <w:t xml:space="preserve">Using TPP’s algorithm to determine if a</w:t>
+            </w:r>
+            <w:r>
+              <w:t xml:space="preserve"> </w:t>
+            </w:r>
+            <w:r>
+              <w:t xml:space="preserve">person is a likely care home resident</w:t>
+            </w:r>
+          </w:p>
+        </w:tc>
+      </w:tr>
+      <w:tr>
+        <w:tc>
+          <w:tcPr/>
+          <w:p>
+            <w:pPr>
+              <w:pStyle w:val="Compact"/>
+            </w:pPr>
+            <w:r>
+              <w:t xml:space="preserve">Consultation rate</w:t>
+            </w:r>
+          </w:p>
+        </w:tc>
+        <w:tc>
+          <w:tcPr/>
+          <w:p>
+            <w:pPr>
+              <w:pStyle w:val="Compact"/>
+            </w:pPr>
+            <w:r>
+              <w:t xml:space="preserve">Continuous</w:t>
+            </w:r>
+          </w:p>
+        </w:tc>
+        <w:tc>
+          <w:tcPr/>
+          <w:p>
+            <w:pPr>
+              <w:pStyle w:val="Compact"/>
+            </w:pPr>
+            <w:r>
+              <w:t xml:space="preserve">Number of GP consultations 12 months</w:t>
+            </w:r>
+            <w:r>
+              <w:t xml:space="preserve"> </w:t>
+            </w:r>
+            <w:r>
+              <w:t xml:space="preserve">prior to the index date</w:t>
+            </w:r>
+          </w:p>
+        </w:tc>
+      </w:tr>
+      <w:tr>
+        <w:tc>
+          <w:tcPr/>
+          <w:p>
+            <w:pPr>
+              <w:pStyle w:val="Compact"/>
+            </w:pPr>
+            <w:r>
+              <w:t xml:space="preserve">Dementia</w:t>
+            </w:r>
+          </w:p>
+        </w:tc>
+        <w:tc>
+          <w:tcPr/>
+          <w:p>
+            <w:pPr>
+              <w:pStyle w:val="Compact"/>
+            </w:pPr>
+            <w:r>
+              <w:t xml:space="preserve">Binary</w:t>
+            </w:r>
+          </w:p>
+        </w:tc>
+        <w:tc>
+          <w:tcPr/>
+          <w:p>
+            <w:pPr>
+              <w:pStyle w:val="Compact"/>
+            </w:pPr>
+            <w:r>
+              <w:t xml:space="preserve">1 if diagnosis present; 0 otherwise</w:t>
+            </w:r>
+            <w:r>
+              <w:t xml:space="preserve"> </w:t>
+            </w:r>
+            <w:r>
+              <w:t xml:space="preserve">I could try to make this more granular?</w:t>
+            </w:r>
+          </w:p>
+        </w:tc>
+      </w:tr>
+      <w:tr>
+        <w:tc>
+          <w:tcPr/>
+          <w:p>
+            <w:pPr>
+              <w:pStyle w:val="Compact"/>
+            </w:pPr>
+            <w:r>
+              <w:t xml:space="preserve">Liver disease</w:t>
+            </w:r>
+          </w:p>
+        </w:tc>
+        <w:tc>
+          <w:tcPr/>
+          <w:p>
+            <w:pPr>
+              <w:pStyle w:val="Compact"/>
+            </w:pPr>
+            <w:r>
+              <w:t xml:space="preserve">Binary</w:t>
+            </w:r>
+          </w:p>
+        </w:tc>
+        <w:tc>
+          <w:tcPr/>
+          <w:p>
+            <w:pPr>
+              <w:pStyle w:val="Compact"/>
+            </w:pPr>
+            <w:r>
+              <w:t xml:space="preserve">1 if diagnosis present; 0 otherwise</w:t>
+            </w:r>
+          </w:p>
+        </w:tc>
+      </w:tr>
+      <w:tr>
+        <w:tc>
+          <w:tcPr/>
+          <w:p>
+            <w:pPr>
+              <w:pStyle w:val="Compact"/>
+            </w:pPr>
+            <w:r>
+              <w:t xml:space="preserve">Cancer</w:t>
+            </w:r>
+          </w:p>
+        </w:tc>
+        <w:tc>
+          <w:tcPr/>
+          <w:p>
+            <w:pPr>
+              <w:pStyle w:val="Compact"/>
+            </w:pPr>
+            <w:r>
+              <w:t xml:space="preserve">Categorical</w:t>
+            </w:r>
+          </w:p>
+        </w:tc>
+        <w:tc>
+          <w:tcPr/>
+          <w:p>
+            <w:pPr>
+              <w:pStyle w:val="Compact"/>
+            </w:pPr>
+            <w:r>
+              <w:t xml:space="preserve">1 if diagnosis present; 0 otherwise</w:t>
+            </w:r>
+          </w:p>
+        </w:tc>
+      </w:tr>
+      <w:tr>
+        <w:tc>
+          <w:tcPr/>
+          <w:p>
+            <w:pPr>
+              <w:pStyle w:val="Compact"/>
+            </w:pPr>
+            <w:r>
+              <w:t xml:space="preserve">Diabetes</w:t>
+            </w:r>
+          </w:p>
+        </w:tc>
+        <w:tc>
+          <w:tcPr/>
+          <w:p>
+            <w:pPr>
+              <w:pStyle w:val="Compact"/>
+            </w:pPr>
+            <w:r>
+              <w:t xml:space="preserve">Binary</w:t>
+            </w:r>
+          </w:p>
+        </w:tc>
+        <w:tc>
+          <w:tcPr/>
+          <w:p>
+            <w:pPr>
+              <w:pStyle w:val="Compact"/>
+            </w:pPr>
+            <w:r>
+              <w:t xml:space="preserve">1 if diagnosis present; 0 otherwise</w:t>
+            </w:r>
+          </w:p>
+        </w:tc>
+      </w:tr>
+      <w:tr>
+        <w:tc>
+          <w:tcPr/>
+          <w:p>
+            <w:pPr>
+              <w:pStyle w:val="Compact"/>
+            </w:pPr>
+            <w:r>
+              <w:t xml:space="preserve">Cambridge Multimorbidity</w:t>
+            </w:r>
+            <w:r>
+              <w:t xml:space="preserve"> </w:t>
+            </w:r>
+            <w:r>
+              <w:t xml:space="preserve">Score</w:t>
+            </w:r>
+          </w:p>
+        </w:tc>
+        <w:tc>
+          <w:tcPr/>
+          <w:p>
+            <w:pPr>
+              <w:pStyle w:val="Compact"/>
+            </w:pPr>
+            <w:r>
+              <w:t xml:space="preserve">Continuous</w:t>
+            </w:r>
+          </w:p>
+        </w:tc>
+        <w:tc>
+          <w:tcPr/>
+          <w:p>
+            <w:pPr>
+              <w:pStyle w:val="Compact"/>
+            </w:pPr>
+            <w:r>
+              <w:t xml:space="preserve">https://github.com/opensafely/</w:t>
+            </w:r>
+            <w:r>
+              <w:t xml:space="preserve"> </w:t>
+            </w:r>
+            <w:r>
+              <w:t xml:space="preserve">NeurodegenerativeDiseaseBurden/blob/</w:t>
+            </w:r>
+            <w:r>
+              <w:t xml:space="preserve"> </w:t>
+            </w:r>
+            <w:r>
+              <w:t xml:space="preserve">33c6a297c0e46a49643890363e4aca9191f87ed0/</w:t>
+            </w:r>
+            <w:r>
+              <w:t xml:space="preserve"> </w:t>
+            </w:r>
+            <w:r>
+              <w:t xml:space="preserve">analysis/dataset_definition/</w:t>
+            </w:r>
+            <w:r>
+              <w:t xml:space="preserve"> </w:t>
+            </w:r>
+            <w:r>
+              <w:t xml:space="preserve">variable_helper_functions.py#L45-L96</w:t>
+            </w:r>
+          </w:p>
+        </w:tc>
+      </w:tr>
+      <w:tr>
+        <w:tc>
+          <w:tcPr/>
+          <w:p>
+            <w:pPr>
+              <w:pStyle w:val="Compact"/>
+            </w:pPr>
+            <w:r>
+              <w:t xml:space="preserve">COPD</w:t>
+            </w:r>
+          </w:p>
+        </w:tc>
+        <w:tc>
+          <w:tcPr/>
+          <w:p>
+            <w:pPr>
+              <w:pStyle w:val="Compact"/>
+            </w:pPr>
+            <w:r>
+              <w:t xml:space="preserve">Binary</w:t>
+            </w:r>
+          </w:p>
+        </w:tc>
+        <w:tc>
+          <w:tcPr/>
+          <w:p>
+            <w:pPr>
+              <w:pStyle w:val="Compact"/>
+            </w:pPr>
+            <w:r>
+              <w:t xml:space="preserve">1 if diagnosis present; 0 otherwise</w:t>
+            </w:r>
+          </w:p>
+        </w:tc>
+      </w:tr>
+      <w:tr>
+        <w:tc>
+          <w:tcPr/>
+          <w:p>
+            <w:pPr>
+              <w:pStyle w:val="Compact"/>
+            </w:pPr>
+            <w:r>
+              <w:t xml:space="preserve">Previous cardiovascular</w:t>
+            </w:r>
+            <w:r>
+              <w:t xml:space="preserve"> </w:t>
+            </w:r>
+            <w:r>
+              <w:t xml:space="preserve">disease</w:t>
+            </w:r>
+          </w:p>
+        </w:tc>
+        <w:tc>
+          <w:tcPr/>
+          <w:p>
+            <w:pPr>
+              <w:pStyle w:val="Compact"/>
+            </w:pPr>
+            <w:r>
+              <w:t xml:space="preserve">Binary</w:t>
+            </w:r>
+          </w:p>
+        </w:tc>
+        <w:tc>
+          <w:tcPr/>
+          <w:p>
+            <w:pPr>
+              <w:pStyle w:val="Compact"/>
+            </w:pPr>
+            <w:r>
+              <w:t xml:space="preserve">fill</w:t>
+            </w:r>
+            <w:r>
+              <w:t xml:space="preserve"> </w:t>
+            </w:r>
+            <w:r>
+              <w:t xml:space="preserve">in</w:t>
+            </w:r>
+          </w:p>
+        </w:tc>
+      </w:tr>
+      <w:tr>
+        <w:tc>
+          <w:tcPr/>
+          <w:p>
+            <w:pPr>
+              <w:pStyle w:val="Compact"/>
+            </w:pPr>
+            <w:r>
+              <w:t xml:space="preserve">Having had another</w:t>
+            </w:r>
+            <w:r>
+              <w:t xml:space="preserve"> </w:t>
+            </w:r>
+            <w:r>
+              <w:t xml:space="preserve">medicine stopped in last</w:t>
+            </w:r>
+            <w:r>
+              <w:t xml:space="preserve"> </w:t>
+            </w:r>
+            <w:r>
+              <w:t xml:space="preserve">12 months</w:t>
+            </w:r>
+          </w:p>
+        </w:tc>
+        <w:tc>
+          <w:tcPr/>
+          <w:p>
+            <w:pPr>
+              <w:pStyle w:val="Compact"/>
+            </w:pPr>
+            <w:r>
+              <w:t xml:space="preserve">Binary</w:t>
+            </w:r>
+          </w:p>
+        </w:tc>
+        <w:tc>
+          <w:tcPr/>
+          <w:p>
+            <w:pPr>
+              <w:pStyle w:val="Compact"/>
+            </w:pPr>
+            <w:r>
+              <w:t xml:space="preserve">Is this possible?</w:t>
+            </w:r>
+          </w:p>
+        </w:tc>
+      </w:tr>
+      <w:tr>
+        <w:tc>
+          <w:tcPr/>
+          <w:p>
+            <w:pPr>
+              <w:pStyle w:val="Compact"/>
+            </w:pPr>
+            <w:r>
+              <w:t xml:space="preserve">Discharge from a hospital</w:t>
+            </w:r>
+            <w:r>
+              <w:t xml:space="preserve"> </w:t>
+            </w:r>
+            <w:r>
+              <w:t xml:space="preserve">admission within last 6</w:t>
+            </w:r>
+            <w:r>
+              <w:t xml:space="preserve"> </w:t>
+            </w:r>
+            <w:r>
+              <w:t xml:space="preserve">months</w:t>
+            </w:r>
+          </w:p>
+        </w:tc>
+        <w:tc>
+          <w:tcPr/>
+          <w:p>
+            <w:pPr>
+              <w:pStyle w:val="Compact"/>
+            </w:pPr>
+            <w:r>
+              <w:t xml:space="preserve">Binary</w:t>
+            </w:r>
+          </w:p>
+        </w:tc>
+        <w:tc>
+          <w:tcPr/>
+          <w:p>
+            <w:pPr>
+              <w:pStyle w:val="Compact"/>
+            </w:pPr>
+          </w:p>
+        </w:tc>
+      </w:tr>
+      <w:tr>
+        <w:tc>
+          <w:tcPr/>
+          <w:p>
+            <w:pPr>
+              <w:pStyle w:val="Compact"/>
+            </w:pPr>
+            <w:r>
+              <w:t xml:space="preserve">The effect of recent</w:t>
+            </w:r>
+            <w:r>
+              <w:t xml:space="preserve"> </w:t>
+            </w:r>
+            <w:r>
+              <w:t xml:space="preserve">interaction with secondary</w:t>
+            </w:r>
+            <w:r>
+              <w:t xml:space="preserve"> </w:t>
+            </w:r>
+            <w:r>
+              <w:t xml:space="preserve">care</w:t>
+            </w:r>
+          </w:p>
+        </w:tc>
+        <w:tc>
+          <w:tcPr/>
+          <w:p>
+            <w:pPr>
+              <w:pStyle w:val="Compact"/>
+            </w:pPr>
+          </w:p>
+        </w:tc>
+        <w:tc>
+          <w:tcPr/>
+          <w:p>
+            <w:pPr>
+              <w:pStyle w:val="Compact"/>
+            </w:pPr>
+          </w:p>
+        </w:tc>
+      </w:tr>
+      <w:tr>
+        <w:tc>
+          <w:tcPr/>
+          <w:p>
+            <w:pPr>
+              <w:pStyle w:val="Compact"/>
+            </w:pPr>
+            <w:r>
+              <w:t xml:space="preserve">Something about adverse</w:t>
+            </w:r>
+            <w:r>
+              <w:t xml:space="preserve"> </w:t>
+            </w:r>
+            <w:r>
+              <w:t xml:space="preserve">effects</w:t>
+            </w:r>
+          </w:p>
+        </w:tc>
+        <w:tc>
+          <w:tcPr/>
+          <w:p>
+            <w:pPr>
+              <w:pStyle w:val="Compact"/>
+            </w:pPr>
+          </w:p>
+        </w:tc>
+        <w:tc>
+          <w:tcPr/>
+          <w:p>
+            <w:pPr>
+              <w:pStyle w:val="Compact"/>
+            </w:pPr>
+          </w:p>
+        </w:tc>
+      </w:tr>
+      <w:tr>
+        <w:tc>
+          <w:tcPr/>
+          <w:p>
+            <w:pPr>
+              <w:pStyle w:val="Compact"/>
+            </w:pPr>
+            <w:r>
+              <w:t xml:space="preserve">Use drawio to decide rest</w:t>
+            </w:r>
+          </w:p>
+        </w:tc>
+        <w:tc>
+          <w:tcPr/>
+          <w:p>
+            <w:pPr>
+              <w:pStyle w:val="Compact"/>
+            </w:pPr>
+          </w:p>
+        </w:tc>
+        <w:tc>
+          <w:tcPr/>
+          <w:p>
+            <w:pPr>
+              <w:pStyle w:val="Compact"/>
+            </w:pPr>
+          </w:p>
+        </w:tc>
+      </w:tr>
+    </w:tbl>
+    <w:bookmarkStart w:id="32" w:name="other-covariates"/>
+    <w:p>
+      <w:pPr>
+        <w:pStyle w:val="Heading3"/>
+      </w:pPr>
+      <w:r>
+        <w:t xml:space="preserve">3.6.1 Other covariates</w:t>
+      </w:r>
+    </w:p>
+    <w:tbl>
+      <w:tblPr>
+        <w:tblStyle w:val="Table"/>
+        <w:tblW w:type="pct" w:w="4946"/>
+        <w:tblLayout w:type="fixed"/>
+        <w:tblLook w:firstRow="0" w:lastRow="0" w:firstColumn="0" w:lastColumn="0" w:noHBand="0" w:noVBand="0" w:val="0000"/>
+      </w:tblPr>
+      <w:tblGrid>
+        <w:gridCol w:w="2469"/>
+        <w:gridCol w:w="1362"/>
+        <w:gridCol w:w="4002"/>
+      </w:tblGrid>
+      <w:tr>
+        <w:tc>
+          <w:tcPr/>
+          <w:p>
+            <w:pPr>
+              <w:pStyle w:val="Compact"/>
+            </w:pPr>
+            <w:r>
+              <w:t xml:space="preserve">Risk of mortality</w:t>
+            </w:r>
+          </w:p>
+        </w:tc>
+        <w:tc>
+          <w:tcPr/>
+          <w:p>
+            <w:pPr>
+              <w:pStyle w:val="Compact"/>
+            </w:pPr>
+            <w:r>
+              <w:t xml:space="preserve">Continuous /</w:t>
+            </w:r>
+            <w:r>
+              <w:t xml:space="preserve"> </w:t>
+            </w:r>
+            <w:r>
+              <w:t xml:space="preserve">categorical</w:t>
+            </w:r>
+          </w:p>
+        </w:tc>
+        <w:tc>
+          <w:tcPr/>
+          <w:p>
+            <w:pPr>
+              <w:pStyle w:val="BodyText"/>
+            </w:pPr>
+            <w:r>
+              <w:t xml:space="preserve">Estimated 4-year risk of mortality</w:t>
+            </w:r>
+            <w:r>
+              <w:t xml:space="preserve"> </w:t>
+            </w:r>
+            <w:r>
+              <w:t xml:space="preserve">using the CKD G4+ prediction tool</w:t>
+            </w:r>
+            <w:r>
+              <w:t xml:space="preserve"> </w:t>
+            </w:r>
+            <w:r>
+              <w:t xml:space="preserve">(17)</w:t>
+            </w:r>
+            <w:r>
+              <w:t xml:space="preserve">. This tool is suggested for use</w:t>
+            </w:r>
+            <w:r>
+              <w:t xml:space="preserve"> </w:t>
+            </w:r>
+            <w:r>
+              <w:t xml:space="preserve">in the 2024 KDIGO CKD management guideline</w:t>
+            </w:r>
+            <w:r>
+              <w:t xml:space="preserve"> </w:t>
+            </w:r>
+            <w:r>
+              <w:t xml:space="preserve">(9)</w:t>
+            </w:r>
+            <w:r>
+              <w:t xml:space="preserve">. It requires 8 variables:</w:t>
+            </w:r>
+            <w:r>
+              <w:t xml:space="preserve"> </w:t>
+            </w:r>
+            <w:r>
+              <w:t xml:space="preserve">Requires: age (30–85),</w:t>
+            </w:r>
+            <w:r>
+              <w:t xml:space="preserve"> </w:t>
+            </w:r>
+            <w:r>
+              <w:t xml:space="preserve">sex, race (black or white),</w:t>
+            </w:r>
+            <w:r>
+              <w:t xml:space="preserve"> </w:t>
+            </w:r>
+            <w:r>
+              <w:t xml:space="preserve">proteinuria (uPCR or uACR), smoking</w:t>
+            </w:r>
+            <w:r>
+              <w:t xml:space="preserve"> </w:t>
+            </w:r>
+            <w:r>
+              <w:t xml:space="preserve">status, diabetes status, history of</w:t>
+            </w:r>
+            <w:r>
+              <w:t xml:space="preserve"> </w:t>
+            </w:r>
+            <w:r>
+              <w:t xml:space="preserve">cardiovascular disease, eGFR (15–30),</w:t>
+            </w:r>
+            <w:r>
+              <w:t xml:space="preserve"> </w:t>
+            </w:r>
+            <w:r>
+              <w:t xml:space="preserve">systolic BP (90–180).</w:t>
+            </w:r>
+          </w:p>
+          <w:p>
+            <w:pPr>
+              <w:pStyle w:val="BodyText"/>
+            </w:pPr>
+            <w:r>
+              <w:t xml:space="preserve">Strata: &lt;25%, 25–49%, 50–74%, ≥75%</w:t>
+            </w:r>
+          </w:p>
+        </w:tc>
+      </w:tr>
+    </w:tbl>
+    <w:bookmarkEnd w:id="32"/>
+    <w:bookmarkEnd w:id="33"/>
+    <w:bookmarkStart w:id="42" w:name="statistical-methods"/>
+    <w:p>
+      <w:pPr>
+        <w:pStyle w:val="Heading2"/>
+      </w:pPr>
+      <w:r>
+        <w:t xml:space="preserve">3.7 Statistical methods</w:t>
+      </w:r>
+    </w:p>
+    <w:bookmarkStart w:id="34" w:name="cohort-characteristics"/>
+    <w:p>
+      <w:pPr>
+        <w:pStyle w:val="Heading3"/>
+      </w:pPr>
+      <w:r>
+        <w:t xml:space="preserve">3.7.1 Cohort characteristics</w:t>
+      </w:r>
+    </w:p>
+    <w:p>
+      <w:pPr>
+        <w:pStyle w:val="FirstParagraph"/>
+      </w:pPr>
+      <w:r>
+        <w:t xml:space="preserve">We will produce a flowchart to show the numbers of individuals that are included / excluded at each stage of cohort development. Descriptive statistics will be used to describe this group’s baseline characteristics: mean, median and measure of variance for continuous variables, and frequencies and proportions for categorical variables.</w:t>
+      </w:r>
+    </w:p>
+    <w:bookmarkEnd w:id="34"/>
+    <w:bookmarkStart w:id="35" w:name="baseline-prescribing"/>
+    <w:p>
+      <w:pPr>
+        <w:pStyle w:val="Heading3"/>
+      </w:pPr>
+      <w:r>
+        <w:t xml:space="preserve">3.7.2 Baseline prescribing</w:t>
+      </w:r>
+    </w:p>
+    <w:p>
+      <w:pPr>
+        <w:pStyle w:val="FirstParagraph"/>
+      </w:pPr>
+      <w:r>
+        <w:t xml:space="preserve">We will present:</w:t>
       </w:r>
     </w:p>
     <w:p>
@@ -1390,7 +2699,7 @@
         </w:numPr>
       </w:pPr>
       <w:r>
-        <w:t xml:space="preserve">Age</w:t>
+        <w:t xml:space="preserve">The average total number of prescribed medications per person on the index date, and</w:t>
       </w:r>
     </w:p>
     <w:p>
@@ -1402,79 +2711,7 @@
         </w:numPr>
       </w:pPr>
       <w:r>
-        <w:t xml:space="preserve">Sex</w:t>
-      </w:r>
-    </w:p>
-    <w:p>
-      <w:pPr>
-        <w:pStyle w:val="Compact"/>
-        <w:numPr>
-          <w:ilvl w:val="0"/>
-          <w:numId w:val="1012"/>
-        </w:numPr>
-      </w:pPr>
-      <w:r>
-        <w:t xml:space="preserve">Ethnicity</w:t>
-      </w:r>
-    </w:p>
-    <w:p>
-      <w:pPr>
-        <w:pStyle w:val="Compact"/>
-        <w:numPr>
-          <w:ilvl w:val="0"/>
-          <w:numId w:val="1012"/>
-        </w:numPr>
-      </w:pPr>
-      <w:r>
-        <w:t xml:space="preserve">eGFR</w:t>
-      </w:r>
-    </w:p>
-    <w:p>
-      <w:pPr>
-        <w:pStyle w:val="Compact"/>
-        <w:numPr>
-          <w:ilvl w:val="0"/>
-          <w:numId w:val="1012"/>
-        </w:numPr>
-      </w:pPr>
-      <w:r>
-        <w:t xml:space="preserve">Number of chronic prescriptions</w:t>
-      </w:r>
-    </w:p>
-    <w:p>
-      <w:pPr>
-        <w:pStyle w:val="Compact"/>
-        <w:numPr>
-          <w:ilvl w:val="0"/>
-          <w:numId w:val="1012"/>
-        </w:numPr>
-      </w:pPr>
-      <w:r>
-        <w:t xml:space="preserve">Risk of mortality (see below)</w:t>
-      </w:r>
-    </w:p>
-    <w:p>
-      <w:pPr>
-        <w:pStyle w:val="Compact"/>
-        <w:numPr>
-          <w:ilvl w:val="0"/>
-          <w:numId w:val="1012"/>
-        </w:numPr>
-      </w:pPr>
-      <w:r>
-        <w:t xml:space="preserve">Frailty (see below)</w:t>
-      </w:r>
-    </w:p>
-    <w:p>
-      <w:pPr>
-        <w:pStyle w:val="Compact"/>
-        <w:numPr>
-          <w:ilvl w:val="0"/>
-          <w:numId w:val="1012"/>
-        </w:numPr>
-      </w:pPr>
-      <w:r>
-        <w:t xml:space="preserve">Presence or absence of comorbidities</w:t>
+        <w:t xml:space="preserve">The proportions of the population prescribed each of the most common categories of medication (grouped by BNF subchapter).</w:t>
       </w:r>
     </w:p>
     <w:p>
@@ -1482,16 +2719,27 @@
         <w:pStyle w:val="FirstParagraph"/>
       </w:pPr>
       <w:r>
-        <w:t xml:space="preserve">— clinical events? e.g. falls/hospitalisations - probably would need to be examined longitudinally</w:t>
-      </w:r>
-    </w:p>
-    <w:bookmarkStart w:id="32" w:name="risk-of-mortality"/>
+        <w:t xml:space="preserve">We will explore the associations between age, sex, ethnicity and deprivation and the total number of prescribed medications on the index date through individual x,y plots and then multivariable Poisson regression (</w:t>
+      </w:r>
+      <w:r>
+        <w:rPr>
+          <w:i/>
+          <w:iCs/>
+        </w:rPr>
+        <w:t xml:space="preserve">or negative binomial because prescribing data likely to be overdispersed?</w:t>
+      </w:r>
+      <w:r>
+        <w:t xml:space="preserve">)</w:t>
+      </w:r>
+    </w:p>
+    <w:bookmarkEnd w:id="35"/>
+    <w:bookmarkStart w:id="38" w:name="medication-discontinuation"/>
     <w:p>
       <w:pPr>
         <w:pStyle w:val="Heading3"/>
       </w:pPr>
       <w:r>
-        <w:t xml:space="preserve">3.7.1 Risk of mortality</w:t>
+        <w:t xml:space="preserve">3.7.3 Medication discontinuation</w:t>
       </w:r>
     </w:p>
     <w:p>
@@ -1499,39 +2747,7 @@
         <w:pStyle w:val="FirstParagraph"/>
       </w:pPr>
       <w:r>
-        <w:t xml:space="preserve">The estimated 4-yr risk of mortality at baseline will be estimated using the mortality prediction tool</w:t>
-      </w:r>
-      <w:r>
-        <w:t xml:space="preserve"> </w:t>
-      </w:r>
-      <w:hyperlink r:id="rId31">
-        <w:r>
-          <w:rPr>
-            <w:rStyle w:val="Hyperlink"/>
-          </w:rPr>
-          <w:t xml:space="preserve">CKD G4+</w:t>
-        </w:r>
-      </w:hyperlink>
-      <w:r>
-        <w:t xml:space="preserve"> </w:t>
-      </w:r>
-      <w:r>
-        <w:t xml:space="preserve">(16)</w:t>
-      </w:r>
-      <w:r>
-        <w:t xml:space="preserve"> </w:t>
-      </w:r>
-      <w:r>
-        <w:t xml:space="preserve">referenced in the 2024 KDIGO CKD clinical practice guideline</w:t>
-      </w:r>
-      <w:r>
-        <w:t xml:space="preserve"> </w:t>
-      </w:r>
-      <w:r>
-        <w:t xml:space="preserve">(8)</w:t>
-      </w:r>
-      <w:r>
-        <w:t xml:space="preserve">. This tool requires the following clinical and demographic data:</w:t>
+        <w:t xml:space="preserve">Competing events:</w:t>
       </w:r>
     </w:p>
     <w:p>
@@ -1543,7 +2759,7 @@
         </w:numPr>
       </w:pPr>
       <w:r>
-        <w:t xml:space="preserve">Age (values between 30 and 85)</w:t>
+        <w:t xml:space="preserve">Death (all-cause)</w:t>
       </w:r>
     </w:p>
     <w:p>
@@ -1555,7 +2771,101 @@
         </w:numPr>
       </w:pPr>
       <w:r>
-        <w:t xml:space="preserve">Sex (male or female)</w:t>
+        <w:t xml:space="preserve">Initiation of kidney replacement therapy</w:t>
+      </w:r>
+    </w:p>
+    <w:bookmarkStart w:id="36" w:name="cumulative-incidence-of-discontinuation"/>
+    <w:p>
+      <w:pPr>
+        <w:pStyle w:val="Heading4"/>
+      </w:pPr>
+      <w:r>
+        <w:t xml:space="preserve">3.7.3.1 Cumulative incidence of discontinuation</w:t>
+      </w:r>
+    </w:p>
+    <w:p>
+      <w:pPr>
+        <w:pStyle w:val="FirstParagraph"/>
+      </w:pPr>
+      <w:r>
+        <w:t xml:space="preserve">For each of the studied medication classes, cumulative incidence functions (CIFs) for medication discontinuation over the follow-up period will be plotted. These will model death and the initiation of KRT as competing events.</w:t>
+      </w:r>
+    </w:p>
+    <w:p>
+      <w:pPr>
+        <w:pStyle w:val="BodyText"/>
+      </w:pPr>
+      <w:r>
+        <w:t xml:space="preserve">Time to first discontinuation event</w:t>
+      </w:r>
+    </w:p>
+    <w:p>
+      <w:pPr>
+        <w:pStyle w:val="BodyText"/>
+      </w:pPr>
+      <w:r>
+        <w:t xml:space="preserve">What about people who start the medication after the index date - i.e. new initiators vs prevalent users?</w:t>
+      </w:r>
+    </w:p>
+    <w:bookmarkEnd w:id="36"/>
+    <w:bookmarkStart w:id="37" w:name="predictors-of-discontinuation"/>
+    <w:p>
+      <w:pPr>
+        <w:pStyle w:val="Heading4"/>
+      </w:pPr>
+      <w:r>
+        <w:t xml:space="preserve">3.7.3.2 Predictors of discontinuation</w:t>
+      </w:r>
+    </w:p>
+    <w:bookmarkEnd w:id="37"/>
+    <w:bookmarkEnd w:id="38"/>
+    <w:bookmarkStart w:id="40" w:name="software"/>
+    <w:p>
+      <w:pPr>
+        <w:pStyle w:val="Heading3"/>
+      </w:pPr>
+      <w:r>
+        <w:t xml:space="preserve">3.7.4 Software</w:t>
+      </w:r>
+    </w:p>
+    <w:p>
+      <w:pPr>
+        <w:pStyle w:val="FirstParagraph"/>
+      </w:pPr>
+      <w:r>
+        <w:t xml:space="preserve">All analyses will be conducted using R. OpenSAFELY analyses control the version of R (4.4.3) and the packages that can be used - and these are publicly available</w:t>
+      </w:r>
+      <w:r>
+        <w:t xml:space="preserve"> </w:t>
+      </w:r>
+      <w:hyperlink r:id="rId39">
+        <w:r>
+          <w:rPr>
+            <w:rStyle w:val="Hyperlink"/>
+          </w:rPr>
+          <w:t xml:space="preserve">here</w:t>
+        </w:r>
+      </w:hyperlink>
+      <w:r>
+        <w:t xml:space="preserve">.</w:t>
+      </w:r>
+    </w:p>
+    <w:bookmarkEnd w:id="40"/>
+    <w:bookmarkStart w:id="41" w:name="sensitivity-analyses"/>
+    <w:p>
+      <w:pPr>
+        <w:pStyle w:val="Heading3"/>
+      </w:pPr>
+      <w:r>
+        <w:t xml:space="preserve">3.7.5 Sensitivity analyses</w:t>
+      </w:r>
+    </w:p>
+    <w:p>
+      <w:pPr>
+        <w:pStyle w:val="FirstParagraph"/>
+      </w:pPr>
+      <w:r>
+        <w:t xml:space="preserve">In sensitivity analyses, we will explore the effect of:</w:t>
       </w:r>
     </w:p>
     <w:p>
@@ -1563,11 +2873,11 @@
         <w:pStyle w:val="Compact"/>
         <w:numPr>
           <w:ilvl w:val="0"/>
-          <w:numId w:val="1013"/>
+          <w:numId w:val="1014"/>
         </w:numPr>
       </w:pPr>
       <w:r>
-        <w:t xml:space="preserve">Race (black or white)</w:t>
+        <w:t xml:space="preserve">Including drugs that are administered through other routes.</w:t>
       </w:r>
     </w:p>
     <w:p>
@@ -1575,11 +2885,11 @@
         <w:pStyle w:val="Compact"/>
         <w:numPr>
           <w:ilvl w:val="0"/>
-          <w:numId w:val="1013"/>
+          <w:numId w:val="1014"/>
         </w:numPr>
       </w:pPr>
       <w:r>
-        <w:t xml:space="preserve">Proteinuria quantification (uPCR or uACR)</w:t>
+        <w:t xml:space="preserve">Varying the definition of a chronic medicines (using different numbers/timeframes of prescriptions).</w:t>
       </w:r>
     </w:p>
     <w:p>
@@ -1587,196 +2897,77 @@
         <w:pStyle w:val="Compact"/>
         <w:numPr>
           <w:ilvl w:val="0"/>
-          <w:numId w:val="1013"/>
+          <w:numId w:val="1014"/>
         </w:numPr>
       </w:pPr>
       <w:r>
-        <w:t xml:space="preserve">Smoking status (current vs never/ex)</w:t>
-      </w:r>
-    </w:p>
-    <w:p>
-      <w:pPr>
-        <w:pStyle w:val="Compact"/>
-        <w:numPr>
-          <w:ilvl w:val="0"/>
-          <w:numId w:val="1013"/>
-        </w:numPr>
-      </w:pPr>
-      <w:r>
-        <w:t xml:space="preserve">Diabetes status (yes or no)</w:t>
-      </w:r>
-    </w:p>
-    <w:p>
-      <w:pPr>
-        <w:pStyle w:val="Compact"/>
-        <w:numPr>
-          <w:ilvl w:val="0"/>
-          <w:numId w:val="1013"/>
-        </w:numPr>
-      </w:pPr>
-      <w:r>
-        <w:t xml:space="preserve">History of cardiovascular disease (yes or no)</w:t>
-      </w:r>
-    </w:p>
-    <w:p>
-      <w:pPr>
-        <w:pStyle w:val="Compact"/>
-        <w:numPr>
-          <w:ilvl w:val="0"/>
-          <w:numId w:val="1013"/>
-        </w:numPr>
-      </w:pPr>
-      <w:r>
-        <w:t xml:space="preserve">eGFR (values between 15 and 30)</w:t>
-      </w:r>
-    </w:p>
-    <w:p>
-      <w:pPr>
-        <w:pStyle w:val="Compact"/>
-        <w:numPr>
-          <w:ilvl w:val="0"/>
-          <w:numId w:val="1013"/>
-        </w:numPr>
-      </w:pPr>
-      <w:r>
-        <w:t xml:space="preserve">Systolic BP (values between 90–180)</w:t>
-      </w:r>
-    </w:p>
-    <w:p>
-      <w:pPr>
-        <w:pStyle w:val="FirstParagraph"/>
-      </w:pPr>
-      <w:r>
-        <w:t xml:space="preserve">Four strata will be viewed: &lt;25%, 25–49%, 50–74%, ≥75%</w:t>
-      </w:r>
-    </w:p>
-    <w:bookmarkEnd w:id="32"/>
-    <w:bookmarkStart w:id="33" w:name="frailty"/>
-    <w:p>
-      <w:pPr>
-        <w:pStyle w:val="Heading3"/>
-      </w:pPr>
-      <w:r>
-        <w:t xml:space="preserve">3.7.2 Frailty</w:t>
-      </w:r>
-    </w:p>
-    <w:p>
-      <w:pPr>
-        <w:pStyle w:val="FirstParagraph"/>
-      </w:pPr>
-      <w:r>
-        <w:t xml:space="preserve">Frailty at baseline will be characterised using the electronic frailty index (eFI — ideally eFI2</w:t>
-      </w:r>
-      <w:r>
-        <w:t xml:space="preserve"> </w:t>
-      </w:r>
-      <w:r>
-        <w:t xml:space="preserve">(17)</w:t>
-      </w:r>
-      <w:r>
-        <w:t xml:space="preserve">) a widely utilised metric for identifying frailty within electronic health records. Using eFI (or similar) to identify potentially frail people in primary care in England is a GP contractual obligation, and those identified as severely frail are recommended for annual structured medication review according to NHS England.</w:t>
-      </w:r>
-    </w:p>
-    <w:p>
-      <w:pPr>
-        <w:pStyle w:val="BodyText"/>
-      </w:pPr>
-      <w:r>
-        <w:t xml:space="preserve">Four strata will be viewed: non-frail, mildly frail, moderately frail, severely frail.</w:t>
-      </w:r>
-    </w:p>
-    <w:bookmarkEnd w:id="33"/>
-    <w:bookmarkEnd w:id="34"/>
-    <w:bookmarkStart w:id="36" w:name="statistical-methods"/>
-    <w:p>
-      <w:pPr>
-        <w:pStyle w:val="Heading2"/>
-      </w:pPr>
-      <w:r>
-        <w:t xml:space="preserve">3.8 Statistical methods</w:t>
-      </w:r>
-    </w:p>
-    <w:bookmarkStart w:id="35" w:name="sensitivity-analysis"/>
-    <w:p>
-      <w:pPr>
-        <w:pStyle w:val="Heading3"/>
-      </w:pPr>
-      <w:r>
-        <w:t xml:space="preserve">3.8.1 Sensitivity analysis</w:t>
-      </w:r>
-    </w:p>
-    <w:p>
-      <w:pPr>
-        <w:pStyle w:val="FirstParagraph"/>
-      </w:pPr>
-      <w:r>
-        <w:t xml:space="preserve">In sensitivity analyses, we will explore the effect of including drugs that are administered through other routes.</w:t>
-      </w:r>
-    </w:p>
-    <w:bookmarkEnd w:id="35"/>
-    <w:bookmarkEnd w:id="36"/>
-    <w:bookmarkStart w:id="37" w:name="tables-and-figures"/>
-    <w:p>
-      <w:pPr>
-        <w:pStyle w:val="Heading2"/>
-      </w:pPr>
-      <w:r>
-        <w:t xml:space="preserve">3.9 Tables and figures</w:t>
-      </w:r>
-    </w:p>
-    <w:bookmarkEnd w:id="37"/>
-    <w:bookmarkStart w:id="38" w:name="study-limitations"/>
-    <w:p>
-      <w:pPr>
-        <w:pStyle w:val="Heading2"/>
-      </w:pPr>
-      <w:r>
-        <w:t xml:space="preserve">3.10 Study limitations</w:t>
-      </w:r>
-    </w:p>
-    <w:bookmarkEnd w:id="38"/>
-    <w:bookmarkEnd w:id="39"/>
-    <w:bookmarkStart w:id="42" w:name="other-information"/>
-    <w:p>
-      <w:pPr>
-        <w:pStyle w:val="Heading1"/>
-      </w:pPr>
-      <w:r>
-        <w:t xml:space="preserve">4. Other information</w:t>
-      </w:r>
-    </w:p>
-    <w:bookmarkStart w:id="40" w:name="funding"/>
-    <w:p>
-      <w:pPr>
-        <w:pStyle w:val="Heading2"/>
-      </w:pPr>
-      <w:r>
-        <w:t xml:space="preserve">4.1 Funding</w:t>
-      </w:r>
-    </w:p>
-    <w:bookmarkEnd w:id="40"/>
-    <w:bookmarkStart w:id="41" w:name="ppie"/>
-    <w:p>
-      <w:pPr>
-        <w:pStyle w:val="Heading2"/>
-      </w:pPr>
-      <w:r>
-        <w:t xml:space="preserve">4.2 PPIE</w:t>
+        <w:t xml:space="preserve">Defining discontinuation using a gap of: ≥30 days, ≥60 days and ≥180 days.</w:t>
       </w:r>
     </w:p>
     <w:bookmarkEnd w:id="41"/>
     <w:bookmarkEnd w:id="42"/>
-    <w:bookmarkStart w:id="74" w:name="references"/>
+    <w:bookmarkStart w:id="43" w:name="tables-and-figures"/>
+    <w:p>
+      <w:pPr>
+        <w:pStyle w:val="Heading2"/>
+      </w:pPr>
+      <w:r>
+        <w:t xml:space="preserve">3.8 Tables and figures</w:t>
+      </w:r>
+    </w:p>
+    <w:bookmarkEnd w:id="43"/>
+    <w:bookmarkStart w:id="44" w:name="study-limitations"/>
+    <w:p>
+      <w:pPr>
+        <w:pStyle w:val="Heading2"/>
+      </w:pPr>
+      <w:r>
+        <w:t xml:space="preserve">3.9 Study limitations</w:t>
+      </w:r>
+    </w:p>
+    <w:bookmarkEnd w:id="44"/>
+    <w:bookmarkEnd w:id="45"/>
+    <w:bookmarkStart w:id="48" w:name="other-information"/>
     <w:p>
       <w:pPr>
         <w:pStyle w:val="Heading1"/>
       </w:pPr>
       <w:r>
+        <w:t xml:space="preserve">4. Other information</w:t>
+      </w:r>
+    </w:p>
+    <w:bookmarkStart w:id="46" w:name="funding"/>
+    <w:p>
+      <w:pPr>
+        <w:pStyle w:val="Heading2"/>
+      </w:pPr>
+      <w:r>
+        <w:t xml:space="preserve">4.1 Funding</w:t>
+      </w:r>
+    </w:p>
+    <w:bookmarkEnd w:id="46"/>
+    <w:bookmarkStart w:id="47" w:name="ppie"/>
+    <w:p>
+      <w:pPr>
+        <w:pStyle w:val="Heading2"/>
+      </w:pPr>
+      <w:r>
+        <w:t xml:space="preserve">4.2 PPIE</w:t>
+      </w:r>
+    </w:p>
+    <w:bookmarkEnd w:id="47"/>
+    <w:bookmarkEnd w:id="48"/>
+    <w:bookmarkStart w:id="80" w:name="references"/>
+    <w:p>
+      <w:pPr>
+        <w:pStyle w:val="Heading1"/>
+      </w:pPr>
+      <w:r>
         <w:t xml:space="preserve">References</w:t>
       </w:r>
     </w:p>
-    <w:bookmarkStart w:id="73" w:name="refs"/>
-    <w:bookmarkStart w:id="44" w:name="ref-Brown2024"/>
+    <w:bookmarkStart w:id="79" w:name="refs"/>
+    <w:bookmarkStart w:id="50" w:name="ref-Brown2024"/>
     <w:p>
       <w:pPr>
         <w:pStyle w:val="Bibliography"/>
@@ -1793,7 +2984,7 @@
       <w:r>
         <w:t xml:space="preserve">Brown JP, Hunnicutt JN, Ali MS, Bhaskaran K, Cole A, Langan SM, et al. Quantifying possible bias in clinical and epidemiological studies with quantitative bias analysis: Common approaches and limitations. BMJ. 2024;e076365. doi:</w:t>
       </w:r>
-      <w:hyperlink r:id="rId43">
+      <w:hyperlink r:id="rId49">
         <w:r>
           <w:rPr>
             <w:rStyle w:val="Hyperlink"/>
@@ -1802,8 +2993,8 @@
         </w:r>
       </w:hyperlink>
     </w:p>
-    <w:bookmarkEnd w:id="44"/>
-    <w:bookmarkStart w:id="46" w:name="ref-Hawthorne2023"/>
+    <w:bookmarkEnd w:id="50"/>
+    <w:bookmarkStart w:id="52" w:name="ref-Hawthorne2023"/>
     <w:p>
       <w:pPr>
         <w:pStyle w:val="Bibliography"/>
@@ -1832,7 +3023,7 @@
       <w:r>
         <w:t xml:space="preserve">cohort study. International Urology and Nephrology. 2023;55(8):2047–57. doi:</w:t>
       </w:r>
-      <w:hyperlink r:id="rId45">
+      <w:hyperlink r:id="rId51">
         <w:r>
           <w:rPr>
             <w:rStyle w:val="Hyperlink"/>
@@ -1841,8 +3032,8 @@
         </w:r>
       </w:hyperlink>
     </w:p>
-    <w:bookmarkEnd w:id="46"/>
-    <w:bookmarkStart w:id="48" w:name="ref-vanOosten2021"/>
+    <w:bookmarkEnd w:id="52"/>
+    <w:bookmarkStart w:id="54" w:name="ref-vanOosten2021"/>
     <w:p>
       <w:pPr>
         <w:pStyle w:val="Bibliography"/>
@@ -1859,7 +3050,7 @@
       <w:r>
         <w:t xml:space="preserve">Oosten MJM van, Logtenberg SJJ, Hemmellder MH, Leegte MJH, Bilo HJG, Jager KJ, et al. Polypharmacy and medication use in patients with chronic kidney disease with and without kidney replacement therapy compared to matched controls. Clinical Kidney Journal. 2021;14(12):2497–523. doi:</w:t>
       </w:r>
-      <w:hyperlink r:id="rId47">
+      <w:hyperlink r:id="rId53">
         <w:r>
           <w:rPr>
             <w:rStyle w:val="Hyperlink"/>
@@ -1868,8 +3059,8 @@
         </w:r>
       </w:hyperlink>
     </w:p>
-    <w:bookmarkEnd w:id="48"/>
-    <w:bookmarkStart w:id="50" w:name="ref-Fried2014"/>
+    <w:bookmarkEnd w:id="54"/>
+    <w:bookmarkStart w:id="56" w:name="ref-Fried2014"/>
     <w:p>
       <w:pPr>
         <w:pStyle w:val="Bibliography"/>
@@ -1886,7 +3077,7 @@
       <w:r>
         <w:t xml:space="preserve">Fried TR, O’Leary J, Towle V, Goldstein MK, Trentalange M, Martin DK. Health outcomes associated with polypharmacy in community-dwelling older adults: A systematic review. Journal of the American Geriatrics Society. 2014;62(12):2261–72. doi:</w:t>
       </w:r>
-      <w:hyperlink r:id="rId49">
+      <w:hyperlink r:id="rId55">
         <w:r>
           <w:rPr>
             <w:rStyle w:val="Hyperlink"/>
@@ -1895,8 +3086,8 @@
         </w:r>
       </w:hyperlink>
     </w:p>
-    <w:bookmarkEnd w:id="50"/>
-    <w:bookmarkStart w:id="51" w:name="ref-WHO2023"/>
+    <w:bookmarkEnd w:id="56"/>
+    <w:bookmarkStart w:id="57" w:name="ref-WHO2023"/>
     <w:p>
       <w:pPr>
         <w:pStyle w:val="Bibliography"/>
@@ -1914,8 +3105,8 @@
         <w:t xml:space="preserve">World Health Organization. Medication without harm: Policy brief. World Health Organization; 2023.</w:t>
       </w:r>
     </w:p>
-    <w:bookmarkEnd w:id="51"/>
-    <w:bookmarkStart w:id="52" w:name="ref-Mohottige2021"/>
+    <w:bookmarkEnd w:id="57"/>
+    <w:bookmarkStart w:id="59" w:name="ref-Laville2020"/>
     <w:p>
       <w:pPr>
         <w:pStyle w:val="Bibliography"/>
@@ -1930,17 +3121,47 @@
         <w:t xml:space="preserve">	</w:t>
       </w:r>
       <w:r>
+        <w:t xml:space="preserve">Laville SM, Gras-Champel V, Moragny J, Metzger M, Jacquelinet C, Combe C, et al.</w:t>
+      </w:r>
+      <w:r>
+        <w:t xml:space="preserve"> Adverse drug reactions in patients with CKD [Journal Article]. Clinical Journal of the American Society of Nephrology. 2020;15(8):1090–102. doi:</w:t>
+      </w:r>
+      <w:hyperlink r:id="rId58">
+        <w:r>
+          <w:rPr>
+            <w:rStyle w:val="Hyperlink"/>
+          </w:rPr>
+          <w:t xml:space="preserve">10.2215/cjn.01030120</w:t>
+        </w:r>
+      </w:hyperlink>
+    </w:p>
+    <w:bookmarkEnd w:id="59"/>
+    <w:bookmarkStart w:id="60" w:name="ref-Mohottige2021"/>
+    <w:p>
+      <w:pPr>
+        <w:pStyle w:val="Bibliography"/>
+      </w:pPr>
+      <w:r>
+        <w:t xml:space="preserve">7.</w:t>
+      </w:r>
+      <w:r>
+        <w:t xml:space="preserve"> </w:t>
+      </w:r>
+      <w:r>
+        <w:t xml:space="preserve">	</w:t>
+      </w:r>
+      <w:r>
         <w:t xml:space="preserve">Mohottige D, Manley HJ, Hall RK. Less is more: Deprescribing medications in older adults with kidney disease: A review. Kidney360. 2021;2(9):1510–22.</w:t>
       </w:r>
     </w:p>
-    <w:bookmarkEnd w:id="52"/>
-    <w:bookmarkStart w:id="54" w:name="ref-Colombijn2024"/>
+    <w:bookmarkEnd w:id="60"/>
+    <w:bookmarkStart w:id="62" w:name="ref-Colombijn2024"/>
     <w:p>
       <w:pPr>
         <w:pStyle w:val="Bibliography"/>
       </w:pPr>
       <w:r>
-        <w:t xml:space="preserve">7.</w:t>
+        <w:t xml:space="preserve">8.</w:t>
       </w:r>
       <w:r>
         <w:t xml:space="preserve"> </w:t>
@@ -1951,7 +3172,7 @@
       <w:r>
         <w:t xml:space="preserve">Colombijn JMT, Idema DL, Van Beem S, Blokland AM, Van Der Braak K, Handoko ML, et al. Representation of patients with chronic kidney disease in clinical trials of cardiovascular disease medications. JAMA Network Open. 2024;7(3):e240427. doi:</w:t>
       </w:r>
-      <w:hyperlink r:id="rId53">
+      <w:hyperlink r:id="rId61">
         <w:r>
           <w:rPr>
             <w:rStyle w:val="Hyperlink"/>
@@ -1960,14 +3181,14 @@
         </w:r>
       </w:hyperlink>
     </w:p>
-    <w:bookmarkEnd w:id="54"/>
-    <w:bookmarkStart w:id="56" w:name="ref-Stevens2024"/>
+    <w:bookmarkEnd w:id="62"/>
+    <w:bookmarkStart w:id="64" w:name="ref-Stevens2024"/>
     <w:p>
       <w:pPr>
         <w:pStyle w:val="Bibliography"/>
       </w:pPr>
       <w:r>
-        <w:t xml:space="preserve">8.</w:t>
+        <w:t xml:space="preserve">9.</w:t>
       </w:r>
       <w:r>
         <w:t xml:space="preserve"> </w:t>
@@ -1990,7 +3211,7 @@
       <w:r>
         <w:t xml:space="preserve">2024 clinical practice guideline for the evaluation and management of chronic kidney disease. Kidney International. 2024;105(4):S117–314. doi:</w:t>
       </w:r>
-      <w:hyperlink r:id="rId55">
+      <w:hyperlink r:id="rId63">
         <w:r>
           <w:rPr>
             <w:rStyle w:val="Hyperlink"/>
@@ -1999,14 +3220,14 @@
         </w:r>
       </w:hyperlink>
     </w:p>
-    <w:bookmarkEnd w:id="56"/>
-    <w:bookmarkStart w:id="58" w:name="ref-Letts2024"/>
+    <w:bookmarkEnd w:id="64"/>
+    <w:bookmarkStart w:id="66" w:name="ref-Letts2024"/>
     <w:p>
       <w:pPr>
         <w:pStyle w:val="Bibliography"/>
       </w:pPr>
       <w:r>
-        <w:t xml:space="preserve">9.</w:t>
+        <w:t xml:space="preserve">10.</w:t>
       </w:r>
       <w:r>
         <w:t xml:space="preserve"> </w:t>
@@ -2017,7 +3238,7 @@
       <w:r>
         <w:t xml:space="preserve">Letts M, Chesnaye NC, Pippias M, Caskey F, Jager KJ, Dekker FW, et al. Prescribing patterns in older people with advanced chronic kidney disease towards the end of life. Clinical Kidney Journal. 2024. doi:</w:t>
       </w:r>
-      <w:hyperlink r:id="rId57">
+      <w:hyperlink r:id="rId65">
         <w:r>
           <w:rPr>
             <w:rStyle w:val="Hyperlink"/>
@@ -2026,14 +3247,14 @@
         </w:r>
       </w:hyperlink>
     </w:p>
-    <w:bookmarkEnd w:id="58"/>
-    <w:bookmarkStart w:id="60" w:name="ref-DHSC2021"/>
+    <w:bookmarkEnd w:id="66"/>
+    <w:bookmarkStart w:id="67" w:name="ref-Sparks2025"/>
     <w:p>
       <w:pPr>
         <w:pStyle w:val="Bibliography"/>
       </w:pPr>
       <w:r>
-        <w:t xml:space="preserve">10.</w:t>
+        <w:t xml:space="preserve">11.</w:t>
       </w:r>
       <w:r>
         <w:t xml:space="preserve"> </w:t>
@@ -2042,28 +3263,17 @@
         <w:t xml:space="preserve">	</w:t>
       </w:r>
       <w:r>
-        <w:t xml:space="preserve">Health &amp; Social Care UD of. Good for you, good for us, good for everybody [Electronic Book] [Internet]. 2021. Available from:</w:t>
-      </w:r>
-      <w:r>
-        <w:t xml:space="preserve"> </w:t>
-      </w:r>
-      <w:hyperlink r:id="rId59">
-        <w:r>
-          <w:rPr>
-            <w:rStyle w:val="Hyperlink"/>
-          </w:rPr>
-          <w:t xml:space="preserve">https://assets.publishing.service.gov.uk/government/uploads/system/uploads/attachment_data/file/1019475/good-for-you-good-for-us-good-for-everybody.pdf</w:t>
-        </w:r>
-      </w:hyperlink>
-    </w:p>
-    <w:bookmarkEnd w:id="60"/>
-    <w:bookmarkStart w:id="61" w:name="ref-Sparks2025"/>
+        <w:t xml:space="preserve">Sparks C, Steinberg AG, Toussaint ND. Identifying and characterising a chronic kidney disease electronic-phenotype using electronic health record-derived data: A narrative review of strategies and applications. Nephrology. 2025;30(9).</w:t>
+      </w:r>
+    </w:p>
+    <w:bookmarkEnd w:id="67"/>
+    <w:bookmarkStart w:id="69" w:name="ref-Santhakumaran2024"/>
     <w:p>
       <w:pPr>
         <w:pStyle w:val="Bibliography"/>
       </w:pPr>
       <w:r>
-        <w:t xml:space="preserve">11.</w:t>
+        <w:t xml:space="preserve">12.</w:t>
       </w:r>
       <w:r>
         <w:t xml:space="preserve"> </w:t>
@@ -2072,25 +3282,6 @@
         <w:t xml:space="preserve">	</w:t>
       </w:r>
       <w:r>
-        <w:t xml:space="preserve">Sparks C, Steinberg AG, Toussaint ND. Identifying and characterising a chronic kidney disease electronic-phenotype using electronic health record-derived data: A narrative review of strategies and applications. Nephrology. 2025;30(9).</w:t>
-      </w:r>
-    </w:p>
-    <w:bookmarkEnd w:id="61"/>
-    <w:bookmarkStart w:id="63" w:name="ref-Santhakumaran2024"/>
-    <w:p>
-      <w:pPr>
-        <w:pStyle w:val="Bibliography"/>
-      </w:pPr>
-      <w:r>
-        <w:t xml:space="preserve">12.</w:t>
-      </w:r>
-      <w:r>
-        <w:t xml:space="preserve"> </w:t>
-      </w:r>
-      <w:r>
-        <w:t xml:space="preserve">	</w:t>
-      </w:r>
-      <w:r>
         <w:t xml:space="preserve">Santhakumaran S, Fisher L, Zheng B, Mahalingasivam V, Plumb L, Parker EPK, et al. Identification of patients undergoing chronic kidney replacement therapy in primary and secondary care data: Validation study based on</w:t>
       </w:r>
       <w:r>
@@ -2117,7 +3308,7 @@
       <w:r>
         <w:t xml:space="preserve">renal registry. BMJ Medicine. 2024;3(1):e000807. doi:</w:t>
       </w:r>
-      <w:hyperlink r:id="rId62">
+      <w:hyperlink r:id="rId68">
         <w:r>
           <w:rPr>
             <w:rStyle w:val="Hyperlink"/>
@@ -2126,8 +3317,8 @@
         </w:r>
       </w:hyperlink>
     </w:p>
-    <w:bookmarkEnd w:id="63"/>
-    <w:bookmarkStart w:id="65" w:name="ref-Goedken2016"/>
+    <w:bookmarkEnd w:id="69"/>
+    <w:bookmarkStart w:id="71" w:name="ref-Goedken2016"/>
     <w:p>
       <w:pPr>
         <w:pStyle w:val="Bibliography"/>
@@ -2144,7 +3335,7 @@
       <w:r>
         <w:t xml:space="preserve">Goedken AM, Lund BC, Cook EA, Schroeder MC, Brooks JM. Application of a framework for determining number of drugs. BMC Research Notes. 2016;9(1). doi:</w:t>
       </w:r>
-      <w:hyperlink r:id="rId64">
+      <w:hyperlink r:id="rId70">
         <w:r>
           <w:rPr>
             <w:rStyle w:val="Hyperlink"/>
@@ -2153,8 +3344,8 @@
         </w:r>
       </w:hyperlink>
     </w:p>
-    <w:bookmarkEnd w:id="65"/>
-    <w:bookmarkStart w:id="67" w:name="ref-Mackenna2025"/>
+    <w:bookmarkEnd w:id="71"/>
+    <w:bookmarkStart w:id="73" w:name="ref-Mackenna2025"/>
     <w:p>
       <w:pPr>
         <w:pStyle w:val="Bibliography"/>
@@ -2180,7 +3371,7 @@
       <w:r>
         <w:t xml:space="preserve">. British Journal of General Practice. 2025;75(756):e448–56. doi:</w:t>
       </w:r>
-      <w:hyperlink r:id="rId66">
+      <w:hyperlink r:id="rId72">
         <w:r>
           <w:rPr>
             <w:rStyle w:val="Hyperlink"/>
@@ -2189,8 +3380,8 @@
         </w:r>
       </w:hyperlink>
     </w:p>
-    <w:bookmarkEnd w:id="67"/>
-    <w:bookmarkStart w:id="69" w:name="ref-Bayliss2025"/>
+    <w:bookmarkEnd w:id="73"/>
+    <w:bookmarkStart w:id="75" w:name="ref-Bayliss2025"/>
     <w:p>
       <w:pPr>
         <w:pStyle w:val="Bibliography"/>
@@ -2207,7 +3398,7 @@
       <w:r>
         <w:t xml:space="preserve">Bayliss EA, Goodrich GK, Barrow JC, Harding B, Ripley CA, Kraus CR, et al. Discontinuation categories underlying gaps in dispensing for six medication groups. Pharmacoepidemiology and Drug Safety. 2025;34(4). doi:</w:t>
       </w:r>
-      <w:hyperlink r:id="rId68">
+      <w:hyperlink r:id="rId74">
         <w:r>
           <w:rPr>
             <w:rStyle w:val="Hyperlink"/>
@@ -2216,8 +3407,8 @@
         </w:r>
       </w:hyperlink>
     </w:p>
-    <w:bookmarkEnd w:id="69"/>
-    <w:bookmarkStart w:id="70" w:name="ref-Grams2018"/>
+    <w:bookmarkEnd w:id="75"/>
+    <w:bookmarkStart w:id="77" w:name="ref-Best2025"/>
     <w:p>
       <w:pPr>
         <w:pStyle w:val="Bibliography"/>
@@ -2232,31 +3423,9 @@
         <w:t xml:space="preserve">	</w:t>
       </w:r>
       <w:r>
-        <w:t xml:space="preserve">Grams ME et al.</w:t>
-      </w:r>
-      <w:r>
-        <w:t xml:space="preserve"> Predicting timing of clinical outcomes in patients with chronic kidney disease and severely decreased glomerular filtration rate. Kidney International. 2018;93(6):1442–51.</w:t>
-      </w:r>
-    </w:p>
-    <w:bookmarkEnd w:id="70"/>
-    <w:bookmarkStart w:id="72" w:name="ref-Best2025"/>
-    <w:p>
-      <w:pPr>
-        <w:pStyle w:val="Bibliography"/>
-      </w:pPr>
-      <w:r>
-        <w:t xml:space="preserve">17.</w:t>
-      </w:r>
-      <w:r>
-        <w:t xml:space="preserve"> </w:t>
-      </w:r>
-      <w:r>
-        <w:t xml:space="preserve">	</w:t>
-      </w:r>
-      <w:r>
         <w:t xml:space="preserve">Best K, Shuweihdi F, Alvarez JCB, Relton S, Avgerinou C, Nimmons D, et al. Development and external validation of the electronic frailty index 2 using routine primary care electronic health record data. Age and Ageing. 2025;54(4). doi:</w:t>
       </w:r>
-      <w:hyperlink r:id="rId71">
+      <w:hyperlink r:id="rId76">
         <w:r>
           <w:rPr>
             <w:rStyle w:val="Hyperlink"/>
@@ -2265,9 +3434,31 @@
         </w:r>
       </w:hyperlink>
     </w:p>
-    <w:bookmarkEnd w:id="72"/>
-    <w:bookmarkEnd w:id="73"/>
-    <w:bookmarkEnd w:id="74"/>
+    <w:bookmarkEnd w:id="77"/>
+    <w:bookmarkStart w:id="78" w:name="ref-Grams2018"/>
+    <w:p>
+      <w:pPr>
+        <w:pStyle w:val="Bibliography"/>
+      </w:pPr>
+      <w:r>
+        <w:t xml:space="preserve">17.</w:t>
+      </w:r>
+      <w:r>
+        <w:t xml:space="preserve"> </w:t>
+      </w:r>
+      <w:r>
+        <w:t xml:space="preserve">	</w:t>
+      </w:r>
+      <w:r>
+        <w:t xml:space="preserve">Grams ME et al.</w:t>
+      </w:r>
+      <w:r>
+        <w:t xml:space="preserve"> Predicting timing of clinical outcomes in patients with chronic kidney disease and severely decreased glomerular filtration rate. Kidney International. 2018;93(6):1442–51.</w:t>
+      </w:r>
+    </w:p>
+    <w:bookmarkEnd w:id="78"/>
+    <w:bookmarkEnd w:id="79"/>
+    <w:bookmarkEnd w:id="80"/>
     <w:sectPr>
       <w:footnotePr>
         <w:numRestart w:val="eachSect"/>
@@ -2378,6 +3569,91 @@
       </w:pPr>
     </w:lvl>
   </w:abstractNum>
+  <w:abstractNum w:abstractNumId="99411">
+    <w:nsid w:val="00A99411"/>
+    <w:multiLevelType w:val="multilevel"/>
+    <w:lvl w:ilvl="0">
+      <w:start w:val="1"/>
+      <w:numFmt w:val="decimal"/>
+      <w:lvlText w:val="%1."/>
+      <w:lvlJc w:val="left"/>
+      <w:pPr>
+        <w:ind w:left="720" w:hanging="360"/>
+      </w:pPr>
+    </w:lvl>
+    <w:lvl w:ilvl="1">
+      <w:start w:val="1"/>
+      <w:numFmt w:val="decimal"/>
+      <w:lvlText w:val="%2."/>
+      <w:lvlJc w:val="left"/>
+      <w:pPr>
+        <w:ind w:left="1440" w:hanging="360"/>
+      </w:pPr>
+    </w:lvl>
+    <w:lvl w:ilvl="2">
+      <w:start w:val="1"/>
+      <w:numFmt w:val="decimal"/>
+      <w:lvlText w:val="%3."/>
+      <w:lvlJc w:val="left"/>
+      <w:pPr>
+        <w:ind w:left="2160" w:hanging="360"/>
+      </w:pPr>
+    </w:lvl>
+    <w:lvl w:ilvl="3">
+      <w:start w:val="1"/>
+      <w:numFmt w:val="decimal"/>
+      <w:lvlText w:val="%4."/>
+      <w:lvlJc w:val="left"/>
+      <w:pPr>
+        <w:ind w:left="2880" w:hanging="360"/>
+      </w:pPr>
+    </w:lvl>
+    <w:lvl w:ilvl="4">
+      <w:start w:val="1"/>
+      <w:numFmt w:val="decimal"/>
+      <w:lvlText w:val="%5."/>
+      <w:lvlJc w:val="left"/>
+      <w:pPr>
+        <w:ind w:left="3600" w:hanging="360"/>
+      </w:pPr>
+    </w:lvl>
+    <w:lvl w:ilvl="5">
+      <w:start w:val="1"/>
+      <w:numFmt w:val="decimal"/>
+      <w:lvlText w:val="%6."/>
+      <w:lvlJc w:val="left"/>
+      <w:pPr>
+        <w:ind w:left="4320" w:hanging="360"/>
+      </w:pPr>
+    </w:lvl>
+    <w:lvl w:ilvl="6">
+      <w:start w:val="1"/>
+      <w:numFmt w:val="decimal"/>
+      <w:lvlText w:val="%7."/>
+      <w:lvlJc w:val="left"/>
+      <w:pPr>
+        <w:ind w:left="5040" w:hanging="360"/>
+      </w:pPr>
+    </w:lvl>
+    <w:lvl w:ilvl="7">
+      <w:start w:val="1"/>
+      <w:numFmt w:val="decimal"/>
+      <w:lvlText w:val="%8."/>
+      <w:lvlJc w:val="left"/>
+      <w:pPr>
+        <w:ind w:left="5760" w:hanging="360"/>
+      </w:pPr>
+    </w:lvl>
+    <w:lvl w:ilvl="8">
+      <w:start w:val="1"/>
+      <w:numFmt w:val="decimal"/>
+      <w:lvlText w:val="%9."/>
+      <w:lvlJc w:val="left"/>
+      <w:pPr>
+        <w:ind w:left="6480" w:hanging="360"/>
+      </w:pPr>
+    </w:lvl>
+  </w:abstractNum>
   <w:abstractNum w:abstractNumId="991">
     <w:nsid w:val="0000A991"/>
     <w:multiLevelType w:val="multilevel"/>
@@ -2481,183 +3757,10 @@
       </w:rPr>
     </w:lvl>
   </w:abstractNum>
-  <w:abstractNum w:abstractNumId="99411">
-    <w:nsid w:val="00A99411"/>
-    <w:multiLevelType w:val="multilevel"/>
-    <w:lvl w:ilvl="0">
-      <w:start w:val="1"/>
-      <w:numFmt w:val="decimal"/>
-      <w:lvlText w:val="%1."/>
-      <w:lvlJc w:val="left"/>
-      <w:pPr>
-        <w:ind w:left="720" w:hanging="360"/>
-      </w:pPr>
-    </w:lvl>
-    <w:lvl w:ilvl="1">
-      <w:start w:val="1"/>
-      <w:numFmt w:val="decimal"/>
-      <w:lvlText w:val="%2."/>
-      <w:lvlJc w:val="left"/>
-      <w:pPr>
-        <w:ind w:left="1440" w:hanging="360"/>
-      </w:pPr>
-    </w:lvl>
-    <w:lvl w:ilvl="2">
-      <w:start w:val="1"/>
-      <w:numFmt w:val="decimal"/>
-      <w:lvlText w:val="%3."/>
-      <w:lvlJc w:val="left"/>
-      <w:pPr>
-        <w:ind w:left="2160" w:hanging="360"/>
-      </w:pPr>
-    </w:lvl>
-    <w:lvl w:ilvl="3">
-      <w:start w:val="1"/>
-      <w:numFmt w:val="decimal"/>
-      <w:lvlText w:val="%4."/>
-      <w:lvlJc w:val="left"/>
-      <w:pPr>
-        <w:ind w:left="2880" w:hanging="360"/>
-      </w:pPr>
-    </w:lvl>
-    <w:lvl w:ilvl="4">
-      <w:start w:val="1"/>
-      <w:numFmt w:val="decimal"/>
-      <w:lvlText w:val="%5."/>
-      <w:lvlJc w:val="left"/>
-      <w:pPr>
-        <w:ind w:left="3600" w:hanging="360"/>
-      </w:pPr>
-    </w:lvl>
-    <w:lvl w:ilvl="5">
-      <w:start w:val="1"/>
-      <w:numFmt w:val="decimal"/>
-      <w:lvlText w:val="%6."/>
-      <w:lvlJc w:val="left"/>
-      <w:pPr>
-        <w:ind w:left="4320" w:hanging="360"/>
-      </w:pPr>
-    </w:lvl>
-    <w:lvl w:ilvl="6">
-      <w:start w:val="1"/>
-      <w:numFmt w:val="decimal"/>
-      <w:lvlText w:val="%7."/>
-      <w:lvlJc w:val="left"/>
-      <w:pPr>
-        <w:ind w:left="5040" w:hanging="360"/>
-      </w:pPr>
-    </w:lvl>
-    <w:lvl w:ilvl="7">
-      <w:start w:val="1"/>
-      <w:numFmt w:val="decimal"/>
-      <w:lvlText w:val="%8."/>
-      <w:lvlJc w:val="left"/>
-      <w:pPr>
-        <w:ind w:left="5760" w:hanging="360"/>
-      </w:pPr>
-    </w:lvl>
-    <w:lvl w:ilvl="8">
-      <w:start w:val="1"/>
-      <w:numFmt w:val="decimal"/>
-      <w:lvlText w:val="%9."/>
-      <w:lvlJc w:val="left"/>
-      <w:pPr>
-        <w:ind w:left="6480" w:hanging="360"/>
-      </w:pPr>
-    </w:lvl>
-  </w:abstractNum>
-  <w:abstractNum w:abstractNumId="99711">
-    <w:nsid w:val="00A99711"/>
-    <w:multiLevelType w:val="multilevel"/>
-    <w:lvl w:ilvl="0">
-      <w:start w:val="1"/>
-      <w:numFmt w:val="lowerLetter"/>
-      <w:lvlText w:val="%1."/>
-      <w:lvlJc w:val="left"/>
-      <w:pPr>
-        <w:ind w:left="720" w:hanging="360"/>
-      </w:pPr>
-    </w:lvl>
-    <w:lvl w:ilvl="1">
-      <w:start w:val="1"/>
-      <w:numFmt w:val="lowerLetter"/>
-      <w:lvlText w:val="%2."/>
-      <w:lvlJc w:val="left"/>
-      <w:pPr>
-        <w:ind w:left="1440" w:hanging="360"/>
-      </w:pPr>
-    </w:lvl>
-    <w:lvl w:ilvl="2">
-      <w:start w:val="1"/>
-      <w:numFmt w:val="lowerLetter"/>
-      <w:lvlText w:val="%3."/>
-      <w:lvlJc w:val="left"/>
-      <w:pPr>
-        <w:ind w:left="2160" w:hanging="360"/>
-      </w:pPr>
-    </w:lvl>
-    <w:lvl w:ilvl="3">
-      <w:start w:val="1"/>
-      <w:numFmt w:val="lowerLetter"/>
-      <w:lvlText w:val="%4."/>
-      <w:lvlJc w:val="left"/>
-      <w:pPr>
-        <w:ind w:left="2880" w:hanging="360"/>
-      </w:pPr>
-    </w:lvl>
-    <w:lvl w:ilvl="4">
-      <w:start w:val="1"/>
-      <w:numFmt w:val="lowerLetter"/>
-      <w:lvlText w:val="%5."/>
-      <w:lvlJc w:val="left"/>
-      <w:pPr>
-        <w:ind w:left="3600" w:hanging="360"/>
-      </w:pPr>
-    </w:lvl>
-    <w:lvl w:ilvl="5">
-      <w:start w:val="1"/>
-      <w:numFmt w:val="lowerLetter"/>
-      <w:lvlText w:val="%6."/>
-      <w:lvlJc w:val="left"/>
-      <w:pPr>
-        <w:ind w:left="4320" w:hanging="360"/>
-      </w:pPr>
-    </w:lvl>
-    <w:lvl w:ilvl="6">
-      <w:start w:val="1"/>
-      <w:numFmt w:val="lowerLetter"/>
-      <w:lvlText w:val="%7."/>
-      <w:lvlJc w:val="left"/>
-      <w:pPr>
-        <w:ind w:left="5040" w:hanging="360"/>
-      </w:pPr>
-    </w:lvl>
-    <w:lvl w:ilvl="7">
-      <w:start w:val="1"/>
-      <w:numFmt w:val="lowerLetter"/>
-      <w:lvlText w:val="%8."/>
-      <w:lvlJc w:val="left"/>
-      <w:pPr>
-        <w:ind w:left="5760" w:hanging="360"/>
-      </w:pPr>
-    </w:lvl>
-    <w:lvl w:ilvl="8">
-      <w:start w:val="1"/>
-      <w:numFmt w:val="lowerLetter"/>
-      <w:lvlText w:val="%9."/>
-      <w:lvlJc w:val="left"/>
-      <w:pPr>
-        <w:ind w:left="6480" w:hanging="360"/>
-      </w:pPr>
-    </w:lvl>
-  </w:abstractNum>
   <w:num w:numId="1000">
     <w:abstractNumId w:val="990"/>
   </w:num>
   <w:num w:numId="1001">
-    <w:abstractNumId w:val="991"/>
-  </w:num>
-  <w:num w:numId="1002">
     <w:abstractNumId w:val="99411"/>
     <w:lvlOverride w:ilvl="0">
       <w:startOverride w:val="1"/>
@@ -2687,6 +3790,9 @@
       <w:startOverride w:val="1"/>
     </w:lvlOverride>
   </w:num>
+  <w:num w:numId="1002">
+    <w:abstractNumId w:val="991"/>
+  </w:num>
   <w:num w:numId="1003">
     <w:abstractNumId w:val="991"/>
   </w:num>
@@ -2715,10 +3821,7 @@
     <w:abstractNumId w:val="991"/>
   </w:num>
   <w:num w:numId="1012">
-    <w:abstractNumId w:val="991"/>
-  </w:num>
-  <w:num w:numId="1013">
-    <w:abstractNumId w:val="99711"/>
+    <w:abstractNumId w:val="99411"/>
     <w:lvlOverride w:ilvl="0">
       <w:startOverride w:val="1"/>
     </w:lvlOverride>
@@ -2746,6 +3849,12 @@
     <w:lvlOverride w:ilvl="8">
       <w:startOverride w:val="1"/>
     </w:lvlOverride>
+  </w:num>
+  <w:num w:numId="1013">
+    <w:abstractNumId w:val="991"/>
+  </w:num>
+  <w:num w:numId="1014">
+    <w:abstractNumId w:val="991"/>
   </w:num>
 </w:numbering>
 </file>

</xml_diff>

<commit_message>
updated protocol and readme
</commit_message>
<xml_diff>
--- a/protocols/protocol.docx
+++ b/protocols/protocol.docx
@@ -7,7 +7,7 @@
         <w:pStyle w:val="Title"/>
       </w:pPr>
       <w:r>
-        <w:t xml:space="preserve">Protocol: Descriptive Analysis of Deprescribing Patterns for People Living with Advanced Chronic Kidney Disease</w:t>
+        <w:t xml:space="preserve">Protocol: Descriptive Analysis of Medication Discontinuation for People Living with Advanced Chronic Kidney Disease</w:t>
       </w:r>
     </w:p>
     <w:p>
@@ -161,98 +161,25 @@
         </w:pict>
       </w:r>
     </w:p>
-    <w:tbl>
-      <w:tblPr>
-        <w:tblStyle w:val="Table"/>
-        <w:tblW w:type="pct" w:w="5000"/>
-        <w:tblLayout w:type="fixed"/>
-        <w:tblLook w:firstRow="1" w:lastRow="0" w:firstColumn="0" w:lastColumn="0" w:noHBand="0" w:noVBand="0" w:val="0020"/>
-      </w:tblPr>
-      <w:tblGrid>
-        <w:gridCol w:w="2545"/>
-        <w:gridCol w:w="3677"/>
-        <w:gridCol w:w="1697"/>
-      </w:tblGrid>
-      <w:tr>
-        <w:trPr>
-          <w:tblHeader w:val="on"/>
-        </w:trPr>
-        <w:tc>
-          <w:tcPr/>
-          <w:p>
-            <w:pPr>
-              <w:pStyle w:val="Compact"/>
-            </w:pPr>
-            <w:r>
-              <w:t xml:space="preserve">Version</w:t>
-            </w:r>
-          </w:p>
-        </w:tc>
-        <w:tc>
-          <w:tcPr/>
-          <w:p>
-            <w:pPr>
-              <w:pStyle w:val="Compact"/>
-            </w:pPr>
-            <w:r>
-              <w:t xml:space="preserve">Description</w:t>
-            </w:r>
-          </w:p>
-        </w:tc>
-        <w:tc>
-          <w:tcPr/>
-          <w:p>
-            <w:pPr>
-              <w:pStyle w:val="Compact"/>
-            </w:pPr>
-            <w:r>
-              <w:t xml:space="preserve">Date</w:t>
-            </w:r>
-          </w:p>
-        </w:tc>
-      </w:tr>
-      <w:tr>
-        <w:tc>
-          <w:tcPr/>
-          <w:p>
-            <w:pPr>
-              <w:pStyle w:val="Compact"/>
-            </w:pPr>
-            <w:r>
-              <w:t xml:space="preserve">1.0</w:t>
-            </w:r>
-          </w:p>
-        </w:tc>
-        <w:tc>
-          <w:tcPr/>
-          <w:p>
-            <w:pPr>
-              <w:pStyle w:val="Compact"/>
-            </w:pPr>
-            <w:r>
-              <w:t xml:space="preserve">Initial protocol developed and structured according to RECORD-PE</w:t>
-            </w:r>
-            <w:r>
-              <w:t xml:space="preserve"> </w:t>
-            </w:r>
-            <w:r>
-              <w:t xml:space="preserve">(1)</w:t>
-            </w:r>
-          </w:p>
-        </w:tc>
-        <w:tc>
-          <w:tcPr/>
-          <w:p>
-            <w:pPr>
-              <w:pStyle w:val="Compact"/>
-            </w:pPr>
-            <w:r>
-              <w:t xml:space="preserve">22/05/2026</w:t>
-            </w:r>
-          </w:p>
-        </w:tc>
-      </w:tr>
-    </w:tbl>
+    <w:p>
+      <w:pPr>
+        <w:pStyle w:val="FirstParagraph"/>
+      </w:pPr>
+      <w:r>
+        <w:t xml:space="preserve">Version controlled via</w:t>
+      </w:r>
+      <w:r>
+        <w:t xml:space="preserve"> </w:t>
+      </w:r>
+      <w:hyperlink r:id="rId9">
+        <w:r>
+          <w:rPr>
+            <w:rStyle w:val="Hyperlink"/>
+          </w:rPr>
+          <w:t xml:space="preserve">GitHub</w:t>
+        </w:r>
+      </w:hyperlink>
+    </w:p>
     <w:p>
       <w:r>
         <w:pict>
@@ -260,7 +187,7 @@
         </w:pict>
       </w:r>
     </w:p>
-    <w:bookmarkStart w:id="9" w:name="background"/>
+    <w:bookmarkStart w:id="10" w:name="background"/>
     <w:p>
       <w:pPr>
         <w:pStyle w:val="Heading1"/>
@@ -280,25 +207,25 @@
         <w:t xml:space="preserve"> </w:t>
       </w:r>
       <w:r>
+        <w:t xml:space="preserve">(1)</w:t>
+      </w:r>
+      <w:r>
+        <w:t xml:space="preserve">. Resultantly, polypharmacy is highly prevalent - this group are prescribed on average 8-9 medicines per day (and &gt;100 pills per week)</w:t>
+      </w:r>
+      <w:r>
+        <w:t xml:space="preserve"> </w:t>
+      </w:r>
+      <w:r>
         <w:t xml:space="preserve">(2)</w:t>
       </w:r>
       <w:r>
-        <w:t xml:space="preserve">. Resultantly, polypharmacy is highly prevalent - this group are prescribed on average 8-9 medicines per day (and &gt;100 pills per week)</w:t>
+        <w:t xml:space="preserve">. Polypharmacy is well linked to avoidable harms such as falls and hospitalisations</w:t>
       </w:r>
       <w:r>
         <w:t xml:space="preserve"> </w:t>
       </w:r>
       <w:r>
         <w:t xml:space="preserve">(3)</w:t>
-      </w:r>
-      <w:r>
-        <w:t xml:space="preserve">. Polypharmacy is well linked to avoidable harms such as falls and hospitalisations</w:t>
-      </w:r>
-      <w:r>
-        <w:t xml:space="preserve"> </w:t>
-      </w:r>
-      <w:r>
-        <w:t xml:space="preserve">(4)</w:t>
       </w:r>
       <w:r>
         <w:t xml:space="preserve"> </w:t>
@@ -320,10 +247,19 @@
         <w:t xml:space="preserve"> </w:t>
       </w:r>
       <w:r>
+        <w:t xml:space="preserve">(4)</w:t>
+      </w:r>
+      <w:r>
+        <w:t xml:space="preserve">. For people with CKD 4/5, the risk of medication-related harm is augmented by unpredictable drug handling and excretion - 1 in 5 experience a medication-related harm each year</w:t>
+      </w:r>
+      <w:r>
+        <w:t xml:space="preserve"> </w:t>
+      </w:r>
+      <w:r>
         <w:t xml:space="preserve">(5)</w:t>
       </w:r>
       <w:r>
-        <w:t xml:space="preserve">. For people with CKD 4/5, the risk of medication-related harm is augmented by unpredictable drug handling and excretion - 1 in 5 experience a medication-related harm each year</w:t>
+        <w:t xml:space="preserve">, making them a high priority group to study</w:t>
       </w:r>
       <w:r>
         <w:t xml:space="preserve"> </w:t>
@@ -332,22 +268,13 @@
         <w:t xml:space="preserve">(6)</w:t>
       </w:r>
       <w:r>
-        <w:t xml:space="preserve">, making them a high priority group to study</w:t>
+        <w:t xml:space="preserve">. Added to this, clinical trials that establish the safety and effectiveness of medicines often exclude people living with CKD 4/5, and do not reflect their comorbidity and diversity</w:t>
       </w:r>
       <w:r>
         <w:t xml:space="preserve"> </w:t>
       </w:r>
       <w:r>
         <w:t xml:space="preserve">(7)</w:t>
-      </w:r>
-      <w:r>
-        <w:t xml:space="preserve">. Added to this, clinical trials that establish the safety and effectiveness of medicines often exclude people living with CKD 4/5, and do not reflect their comorbidity and diversity</w:t>
-      </w:r>
-      <w:r>
-        <w:t xml:space="preserve"> </w:t>
-      </w:r>
-      <w:r>
-        <w:t xml:space="preserve">(8)</w:t>
       </w:r>
       <w:r>
         <w:t xml:space="preserve">.</w:t>
@@ -371,25 +298,16 @@
         <w:t xml:space="preserve">Medication management and Drug Stewardship</w:t>
       </w:r>
       <w:r>
-        <w:t xml:space="preserve">, however this includes an acknowledgment that evidence to guide deprescribing is limited</w:t>
-      </w:r>
-      <w:r>
-        <w:t xml:space="preserve"> </w:t>
-      </w:r>
-      <w:r>
-        <w:t xml:space="preserve">(9)</w:t>
-      </w:r>
-      <w:r>
-        <w:t xml:space="preserve">. We have shown that a proportion of people with advanced kidney disease are having medications such as statins discontinued in their last years of life</w:t>
-      </w:r>
-      <w:r>
-        <w:t xml:space="preserve"> </w:t>
-      </w:r>
-      <w:r>
-        <w:t xml:space="preserve">(10)</w:t>
-      </w:r>
-      <w:r>
-        <w:t xml:space="preserve">, but wider-scale information is lacking. Currently there is little guidance for clinicians about what medicines can be deprescribed and when.</w:t>
+        <w:t xml:space="preserve">, in which the authors acknowledge that evidence to guide deprescribing in CKD is limited</w:t>
+      </w:r>
+      <w:r>
+        <w:t xml:space="preserve"> </w:t>
+      </w:r>
+      <w:r>
+        <w:t xml:space="preserve">(8)</w:t>
+      </w:r>
+      <w:r>
+        <w:t xml:space="preserve">. Currently there is little guidance for clinicians about what medicines can be deprescribed and when, and more research into the effects of deprescribing on clinically-relevant outcomes is needed.</w:t>
       </w:r>
     </w:p>
     <w:p>
@@ -397,7 +315,15 @@
         <w:pStyle w:val="BodyText"/>
       </w:pPr>
       <w:r>
-        <w:t xml:space="preserve">We aim to describe the current patterns of discontinuation of common medicines in people living with advanced CKD in England, and evaluate the clinical and sociodemographic factors that lead to variances in these patterns. In routine healthcare data, deprescribing is largely observable as medication</w:t>
+        <w:t xml:space="preserve">This study will briefly characterise population-level prescribing patterns for people living with CKD 4/5 in England, and then describe the patterns of discontinuation of common medicines, going on to evaluate the clinical and sociodemographic factors that lead to variances in these patterns.</w:t>
+      </w:r>
+    </w:p>
+    <w:p>
+      <w:pPr>
+        <w:pStyle w:val="BodyText"/>
+      </w:pPr>
+      <w:r>
+        <w:t xml:space="preserve">As an aside, in routine healthcare data, deprescribing is observable as medication</w:t>
       </w:r>
       <w:r>
         <w:t xml:space="preserve"> </w:t>
@@ -410,11 +336,11 @@
         <w:t xml:space="preserve">discontinuation</w:t>
       </w:r>
       <w:r>
-        <w:t xml:space="preserve">, which will therefore be the primary focus of this study.</w:t>
-      </w:r>
-    </w:p>
-    <w:bookmarkEnd w:id="9"/>
-    <w:bookmarkStart w:id="10" w:name="objectives"/>
+        <w:t xml:space="preserve">, so this will therefore be the primary focus of this study.</w:t>
+      </w:r>
+    </w:p>
+    <w:bookmarkEnd w:id="10"/>
+    <w:bookmarkStart w:id="11" w:name="objectives"/>
     <w:p>
       <w:pPr>
         <w:pStyle w:val="Heading1"/>
@@ -444,7 +370,7 @@
         </w:numPr>
       </w:pPr>
       <w:r>
-        <w:t xml:space="preserve">To establish the patterns of discontinuation of medicines in people in England living with advanced CKD.</w:t>
+        <w:t xml:space="preserve">To establish the patterns of discontinuation of common medicines in people in England living with advanced CKD.</w:t>
       </w:r>
     </w:p>
     <w:p>
@@ -459,8 +385,8 @@
         <w:t xml:space="preserve">To identify the clinical and sociodemographic factors associated with variances in these patterns.</w:t>
       </w:r>
     </w:p>
-    <w:bookmarkEnd w:id="10"/>
-    <w:bookmarkStart w:id="45" w:name="methods"/>
+    <w:bookmarkEnd w:id="11"/>
+    <w:bookmarkStart w:id="43" w:name="methods"/>
     <w:p>
       <w:pPr>
         <w:pStyle w:val="Heading1"/>
@@ -469,7 +395,7 @@
         <w:t xml:space="preserve">3. Methods</w:t>
       </w:r>
     </w:p>
-    <w:bookmarkStart w:id="11" w:name="study-design"/>
+    <w:bookmarkStart w:id="12" w:name="study-design"/>
     <w:p>
       <w:pPr>
         <w:pStyle w:val="Heading2"/>
@@ -486,8 +412,8 @@
         <w:t xml:space="preserve">We will conduct cross-sectional and longitudinal analyses of a retrospective cohort of individuals living with advanced kidney disease living in England.</w:t>
       </w:r>
     </w:p>
-    <w:bookmarkEnd w:id="11"/>
-    <w:bookmarkStart w:id="12" w:name="data-sources"/>
+    <w:bookmarkEnd w:id="12"/>
+    <w:bookmarkStart w:id="13" w:name="data-sources"/>
     <w:p>
       <w:pPr>
         <w:pStyle w:val="Heading2"/>
@@ -540,8 +466,8 @@
         <w:t xml:space="preserve">Data on Index of Multiple Deprivation (IMD)</w:t>
       </w:r>
     </w:p>
-    <w:bookmarkEnd w:id="12"/>
-    <w:bookmarkStart w:id="20" w:name="study-population"/>
+    <w:bookmarkEnd w:id="13"/>
+    <w:bookmarkStart w:id="19" w:name="study-population"/>
     <w:p>
       <w:pPr>
         <w:pStyle w:val="Heading2"/>
@@ -639,7 +565,7 @@
         <w:t xml:space="preserve"> </w:t>
       </w:r>
       <w:r>
-        <w:t xml:space="preserve">(11)</w:t>
+        <w:t xml:space="preserve">(9)</w:t>
       </w:r>
       <w:r>
         <w:t xml:space="preserve">:</w:t>
@@ -654,7 +580,7 @@
         </w:numPr>
       </w:pPr>
       <w:r>
-        <w:t xml:space="preserve">The two most recent serum creatinine measurements that are &gt;90 days apart are consistent with an estimated glomerular filtration rate (eGFR) &lt;30 mls/min/1.73m</w:t>
+        <w:t xml:space="preserve">The two most recent, plausible serum creatinine measurements that are &gt;90 days apart are consistent with an estimated glomerular filtration rate (eGFR) &lt;30 mls/min/1.73m</w:t>
       </w:r>
       <w:r>
         <w:rPr>
@@ -671,7 +597,7 @@
       <w:r>
         <w:t xml:space="preserve"> </w:t>
       </w:r>
-      <w:hyperlink r:id="rId13">
+      <w:hyperlink r:id="rId14">
         <w:r>
           <w:rPr>
             <w:rStyle w:val="Hyperlink"/>
@@ -692,18 +618,7 @@
         </w:numPr>
       </w:pPr>
       <w:r>
-        <w:t xml:space="preserve">A SNOMED code indicating a diagnosis of CKD 4 and 5 (</w:t>
-      </w:r>
-      <w:hyperlink r:id="rId14">
-        <w:r>
-          <w:rPr>
-            <w:rStyle w:val="Hyperlink"/>
-          </w:rPr>
-          <w:t xml:space="preserve">OpenCodelists</w:t>
-        </w:r>
-      </w:hyperlink>
-      <w:r>
-        <w:t xml:space="preserve">) on any prior date.</w:t>
+        <w:t xml:space="preserve">A prior SNOMED code indicating a diagnosis of CKD, with the most recent stage being CKD 4 and 5</w:t>
       </w:r>
     </w:p>
     <w:p>
@@ -761,7 +676,7 @@
       </w:r>
     </w:p>
     <w:bookmarkEnd w:id="15"/>
-    <w:bookmarkStart w:id="17" w:name="exclusion-criteria"/>
+    <w:bookmarkStart w:id="16" w:name="exclusion-criteria"/>
     <w:p>
       <w:pPr>
         <w:pStyle w:val="Heading3"/>
@@ -779,37 +694,20 @@
         </w:numPr>
       </w:pPr>
       <w:r>
-        <w:t xml:space="preserve">People in receipt of kidney replacement therapy (KRT). This is defined as a</w:t>
-      </w:r>
-      <w:r>
-        <w:t xml:space="preserve"> </w:t>
-      </w:r>
-      <w:hyperlink r:id="rId16">
-        <w:r>
-          <w:rPr>
-            <w:rStyle w:val="Hyperlink"/>
-          </w:rPr>
-          <w:t xml:space="preserve">code</w:t>
-        </w:r>
-      </w:hyperlink>
-      <w:r>
-        <w:t xml:space="preserve"> </w:t>
-      </w:r>
-      <w:r>
-        <w:t xml:space="preserve">indicating dialysis or transplant prior to the index date, or on the index date itself. This method has been shown to be sensitive for identifying the prevalent KRT population in England</w:t>
-      </w:r>
-      <w:r>
-        <w:t xml:space="preserve"> </w:t>
-      </w:r>
-      <w:r>
-        <w:t xml:space="preserve">(12)</w:t>
+        <w:t xml:space="preserve">People in receipt of kidney replacement therapy (KRT). This is defined as a code indicating dialysis or transplant prior to the index date, or on the index date itself. This method has been shown to be sensitive for identifying the prevalent KRT population in England</w:t>
+      </w:r>
+      <w:r>
+        <w:t xml:space="preserve"> </w:t>
+      </w:r>
+      <w:r>
+        <w:t xml:space="preserve">(10)</w:t>
       </w:r>
       <w:r>
         <w:t xml:space="preserve">.</w:t>
       </w:r>
     </w:p>
-    <w:bookmarkEnd w:id="17"/>
-    <w:bookmarkStart w:id="18" w:name="follow-up"/>
+    <w:bookmarkEnd w:id="16"/>
+    <w:bookmarkStart w:id="17" w:name="follow-up"/>
     <w:p>
       <w:pPr>
         <w:pStyle w:val="Heading3"/>
@@ -874,14 +772,66 @@
         <w:t xml:space="preserve">End of registration with GP practice that uses TPP software</w:t>
       </w:r>
     </w:p>
+    <w:bookmarkEnd w:id="17"/>
+    <w:bookmarkStart w:id="18" w:name="data-quality-assurance-criteria"/>
+    <w:p>
+      <w:pPr>
+        <w:pStyle w:val="Heading3"/>
+      </w:pPr>
+      <w:r>
+        <w:t xml:space="preserve">3.3.4 Data quality assurance criteria</w:t>
+      </w:r>
+    </w:p>
+    <w:p>
+      <w:pPr>
+        <w:pStyle w:val="FirstParagraph"/>
+      </w:pPr>
+      <w:r>
+        <w:t xml:space="preserve">We will remove patients whose data fails quality assurance checks:</w:t>
+      </w:r>
+      <w:r>
+        <w:t xml:space="preserve"> </w:t>
+      </w:r>
+      <w:r>
+        <w:t xml:space="preserve">- Remove patients whose year of birth is missing</w:t>
+      </w:r>
+      <w:r>
+        <w:t xml:space="preserve"> </w:t>
+      </w:r>
+      <w:r>
+        <w:t xml:space="preserve">- Remove patients whose year of birth after year of death</w:t>
+      </w:r>
+      <w:r>
+        <w:t xml:space="preserve"> </w:t>
+      </w:r>
+      <w:r>
+        <w:t xml:space="preserve">- Remove patients whose date of death is after today</w:t>
+      </w:r>
+      <w:r>
+        <w:t xml:space="preserve"> </w:t>
+      </w:r>
+      <w:r>
+        <w:t xml:space="preserve">- Remove patients whose year of birth is after today</w:t>
+      </w:r>
+    </w:p>
     <w:bookmarkEnd w:id="18"/>
-    <w:bookmarkStart w:id="19" w:name="data-quality-assurance-criteria"/>
+    <w:bookmarkEnd w:id="19"/>
+    <w:bookmarkStart w:id="30" w:name="prescribing-information"/>
+    <w:p>
+      <w:pPr>
+        <w:pStyle w:val="Heading2"/>
+      </w:pPr>
+      <w:r>
+        <w:t xml:space="preserve">3.4 Prescribing information</w:t>
+      </w:r>
+    </w:p>
+    <w:bookmarkStart w:id="21" w:name="prescribing-data"/>
     <w:p>
       <w:pPr>
         <w:pStyle w:val="Heading3"/>
       </w:pPr>
       <w:r>
-        <w:t xml:space="preserve">3.3.4 Data quality assurance criteria</w:t>
+        <w:t xml:space="preserve">3.4.1 Prescribing data</w:t>
       </w:r>
     </w:p>
     <w:p>
@@ -889,58 +839,6 @@
         <w:pStyle w:val="FirstParagraph"/>
       </w:pPr>
       <w:r>
-        <w:t xml:space="preserve">We will remove patients whose data fails quality assurance checks:</w:t>
-      </w:r>
-      <w:r>
-        <w:t xml:space="preserve"> </w:t>
-      </w:r>
-      <w:r>
-        <w:t xml:space="preserve">- Remove patients whose year of birth is missing</w:t>
-      </w:r>
-      <w:r>
-        <w:t xml:space="preserve"> </w:t>
-      </w:r>
-      <w:r>
-        <w:t xml:space="preserve">- Remove patients whose year of birth after year of death</w:t>
-      </w:r>
-      <w:r>
-        <w:t xml:space="preserve"> </w:t>
-      </w:r>
-      <w:r>
-        <w:t xml:space="preserve">- Remove patients whose date of death is after today</w:t>
-      </w:r>
-      <w:r>
-        <w:t xml:space="preserve"> </w:t>
-      </w:r>
-      <w:r>
-        <w:t xml:space="preserve">- Remove patients whose year of birth is after today</w:t>
-      </w:r>
-    </w:p>
-    <w:bookmarkEnd w:id="19"/>
-    <w:bookmarkEnd w:id="20"/>
-    <w:bookmarkStart w:id="30" w:name="prescribing-information"/>
-    <w:p>
-      <w:pPr>
-        <w:pStyle w:val="Heading2"/>
-      </w:pPr>
-      <w:r>
-        <w:t xml:space="preserve">3.4 Prescribing information</w:t>
-      </w:r>
-    </w:p>
-    <w:bookmarkStart w:id="22" w:name="prescribing-data"/>
-    <w:p>
-      <w:pPr>
-        <w:pStyle w:val="Heading3"/>
-      </w:pPr>
-      <w:r>
-        <w:t xml:space="preserve">3.4.1 Prescribing data</w:t>
-      </w:r>
-    </w:p>
-    <w:p>
-      <w:pPr>
-        <w:pStyle w:val="FirstParagraph"/>
-      </w:pPr>
-      <w:r>
         <w:t xml:space="preserve">In this analysis we will study baseline prescribing on the index date, and the trends of medication discontinuation over time.</w:t>
       </w:r>
     </w:p>
@@ -954,7 +852,7 @@
       <w:r>
         <w:t xml:space="preserve"> </w:t>
       </w:r>
-      <w:hyperlink r:id="rId21">
+      <w:hyperlink r:id="rId20">
         <w:r>
           <w:rPr>
             <w:rStyle w:val="Hyperlink"/>
@@ -969,8 +867,8 @@
         <w:t xml:space="preserve">are the preferred mechanism through which medicinal product identification and communication occurs within the NHS. In OpenSAFELY, each dm+d code corresponds to the name (e.g. atorvastatin), strength (e.g. 40mg) and formulation (e.g. tablet) of a prescribed drug. Data on the dosing recommendation (e.g. take 1 tablet once a day), the quantity of a medication prescribed (e.g. 28 tablets), whether a prescription was dispensed, or whether the patient adhered to the medication as prescribed are not available.</w:t>
       </w:r>
     </w:p>
-    <w:bookmarkEnd w:id="22"/>
-    <w:bookmarkStart w:id="25" w:name="prescribing-data-handling"/>
+    <w:bookmarkEnd w:id="21"/>
+    <w:bookmarkStart w:id="24" w:name="prescribing-data-handling"/>
     <w:p>
       <w:pPr>
         <w:pStyle w:val="Heading3"/>
@@ -989,7 +887,7 @@
       <w:r>
         <w:t xml:space="preserve"> </w:t>
       </w:r>
-      <w:hyperlink r:id="rId23">
+      <w:hyperlink r:id="rId22">
         <w:r>
           <w:rPr>
             <w:rStyle w:val="Hyperlink"/>
@@ -1032,7 +930,7 @@
       <w:r>
         <w:t xml:space="preserve"> </w:t>
       </w:r>
-      <w:hyperlink r:id="rId24">
+      <w:hyperlink r:id="rId23">
         <w:r>
           <w:rPr>
             <w:rStyle w:val="Hyperlink"/>
@@ -1044,7 +942,7 @@
         <w:t xml:space="preserve">. BNF codes follow a clear hierarchical structure and allow for clinically meaningful analysis.</w:t>
       </w:r>
     </w:p>
-    <w:bookmarkEnd w:id="25"/>
+    <w:bookmarkEnd w:id="24"/>
     <w:bookmarkStart w:id="29" w:name="medication-inclusion-exclusion-criteria"/>
     <w:p>
       <w:pPr>
@@ -1075,7 +973,7 @@
         <w:t xml:space="preserve"> </w:t>
       </w:r>
       <w:r>
-        <w:t xml:space="preserve">(13)</w:t>
+        <w:t xml:space="preserve">(11)</w:t>
       </w:r>
       <w:r>
         <w:t xml:space="preserve">.</w:t>
@@ -1107,7 +1005,24 @@
         </w:numPr>
       </w:pPr>
       <w:r>
-        <w:t xml:space="preserve">Drug type. We will include medications within BNF chapters 1 to 13. BNF chapters 14 to 23 will be excluded as they represent specialist products that are unlikely to be common and not targets for discontinuation, and medical devices.</w:t>
+        <w:t xml:space="preserve">Drug type. We will include medications within BNF chapters 1, 2, 3, 4, 6, 7, 8, 9, and 10. These chapters, mirroring those used by the</w:t>
+      </w:r>
+      <w:r>
+        <w:t xml:space="preserve"> </w:t>
+      </w:r>
+      <w:hyperlink r:id="rId25">
+        <w:r>
+          <w:rPr>
+            <w:rStyle w:val="Hyperlink"/>
+          </w:rPr>
+          <w:t xml:space="preserve">NHSBSA medicines optimisation</w:t>
+        </w:r>
+      </w:hyperlink>
+      <w:r>
+        <w:t xml:space="preserve"> </w:t>
+      </w:r>
+      <w:r>
+        <w:t xml:space="preserve">dashboards, include the medicines that are most likely to be oral, and therefore contributing to pill burden and medication harm. Excluded BNF chapters include mainly non-oral,specialist products and devices that are unlikely to be targets for discontinuation.</w:t>
       </w:r>
     </w:p>
     <w:p>
@@ -1119,7 +1034,7 @@
         </w:numPr>
       </w:pPr>
       <w:r>
-        <w:t xml:space="preserve">Route. We will include medications that are orally administered. This is because oral medications are the most likely to be deprescribed in this population.</w:t>
+        <w:t xml:space="preserve">Route. We will only include medications that are orally administered.</w:t>
       </w:r>
     </w:p>
     <w:p>
@@ -1185,7 +1100,7 @@
         <w:t xml:space="preserve"> </w:t>
       </w:r>
       <w:r>
-        <w:t xml:space="preserve">(14)</w:t>
+        <w:t xml:space="preserve">(12)</w:t>
       </w:r>
       <w:r>
         <w:t xml:space="preserve">.</w:t>
@@ -1314,16 +1229,7 @@
         <w:pStyle w:val="BodyText"/>
       </w:pPr>
       <w:r>
-        <w:t xml:space="preserve">Within OpenSAFELY-TPP the duration of each prescription is unknown. In line with previous publications</w:t>
-      </w:r>
-      <w:r>
-        <w:t xml:space="preserve"> </w:t>
-      </w:r>
-      <w:r>
-        <w:t xml:space="preserve">(15)</w:t>
-      </w:r>
-      <w:r>
-        <w:t xml:space="preserve">, discontinuation will be defined as a gap of a prescription of a chronic medicine of 120 days or more. This will allow a window of time for re-prescription to occur even if the prescription was issued for 84 days (the maximum length in usual practice in England). The date of discontinuation will be defined as the date of the last prescription.</w:t>
+        <w:t xml:space="preserve">Within OpenSAFELY-TPP the duration of each prescription is unknown, and there is no standardised way of defined discontinuation within electronic healthcare record data.</w:t>
       </w:r>
     </w:p>
     <w:p>
@@ -1331,29 +1237,32 @@
         <w:pStyle w:val="BodyText"/>
       </w:pPr>
       <w:r>
-        <w:rPr>
-          <w:i/>
-          <w:iCs/>
-        </w:rPr>
-        <w:t xml:space="preserve">This needs discussion - could this be operationalised better? We could look at dose reduction, or something more complex modelling prior gaps</w:t>
-      </w:r>
-    </w:p>
-    <w:bookmarkEnd w:id="31"/>
-    <w:bookmarkStart w:id="33" w:name="covariates"/>
-    <w:p>
-      <w:pPr>
-        <w:pStyle w:val="Heading2"/>
-      </w:pPr>
-      <w:r>
-        <w:t xml:space="preserve">3.6 Covariates</w:t>
-      </w:r>
-    </w:p>
-    <w:p>
-      <w:pPr>
-        <w:pStyle w:val="FirstParagraph"/>
-      </w:pPr>
-      <w:r>
-        <w:t xml:space="preserve">Covariates have been chosen for two different reasons:</w:t>
+        <w:t xml:space="preserve">In this study, we will firstly calculate the average prescription duration (APD).</w:t>
+      </w:r>
+    </w:p>
+    <w:p>
+      <w:pPr>
+        <w:pStyle w:val="BodyText"/>
+      </w:pPr>
+      <w:r>
+        <w:t xml:space="preserve">Every medication for every individual will be placed into a category based on whether it appears to be prescribed every 7, 14, 28, 56, or 84 days – the typical prescribing durations in English primary care</w:t>
+      </w:r>
+      <w:r>
+        <w:t xml:space="preserve"> </w:t>
+      </w:r>
+      <w:r>
+        <w:t xml:space="preserve">(12)</w:t>
+      </w:r>
+      <w:r>
+        <w:t xml:space="preserve">. The APD will be the average gap length between prescriptions for each person-medicine prior to the index date, rounded to the nearest of 7, 14, 28, 56, or 84.</w:t>
+      </w:r>
+    </w:p>
+    <w:p>
+      <w:pPr>
+        <w:pStyle w:val="BodyText"/>
+      </w:pPr>
+      <w:r>
+        <w:t xml:space="preserve">Discontinuation post index date will then be defined as:</w:t>
       </w:r>
     </w:p>
     <w:p>
@@ -1365,7 +1274,19 @@
         </w:numPr>
       </w:pPr>
       <w:r>
-        <w:t xml:space="preserve">It is hypothesised that they will likely have an impact on medication discontinuation.</w:t>
+        <w:rPr>
+          <w:i/>
+          <w:iCs/>
+        </w:rPr>
+        <w:t xml:space="preserve">A gap between prescriptions &gt; APD + 60 days</w:t>
+      </w:r>
+    </w:p>
+    <w:p>
+      <w:pPr>
+        <w:pStyle w:val="FirstParagraph"/>
+      </w:pPr>
+      <w:r>
+        <w:t xml:space="preserve">And the date of discontinuation will be defined as:</w:t>
       </w:r>
     </w:p>
     <w:p>
@@ -1373,7 +1294,61 @@
         <w:pStyle w:val="Compact"/>
         <w:numPr>
           <w:ilvl w:val="0"/>
-          <w:numId w:val="1011"/>
+          <w:numId w:val="1012"/>
+        </w:numPr>
+      </w:pPr>
+      <w:r>
+        <w:rPr>
+          <w:i/>
+          <w:iCs/>
+        </w:rPr>
+        <w:t xml:space="preserve">The date of the last prescription before discontinuation + APD</w:t>
+      </w:r>
+    </w:p>
+    <w:p>
+      <w:pPr>
+        <w:pStyle w:val="FirstParagraph"/>
+      </w:pPr>
+      <w:r>
+        <w:t xml:space="preserve">Sensitivity analyses will explore the effect of not including an APD, and varying the length of gap required to define discontinuation.</w:t>
+      </w:r>
+    </w:p>
+    <w:bookmarkEnd w:id="31"/>
+    <w:bookmarkStart w:id="32" w:name="covariates"/>
+    <w:p>
+      <w:pPr>
+        <w:pStyle w:val="Heading2"/>
+      </w:pPr>
+      <w:r>
+        <w:t xml:space="preserve">3.6 Covariates</w:t>
+      </w:r>
+    </w:p>
+    <w:p>
+      <w:pPr>
+        <w:pStyle w:val="FirstParagraph"/>
+      </w:pPr>
+      <w:r>
+        <w:t xml:space="preserve">Covariates have been chosen for two different reasons:</w:t>
+      </w:r>
+    </w:p>
+    <w:p>
+      <w:pPr>
+        <w:pStyle w:val="Compact"/>
+        <w:numPr>
+          <w:ilvl w:val="0"/>
+          <w:numId w:val="1013"/>
+        </w:numPr>
+      </w:pPr>
+      <w:r>
+        <w:t xml:space="preserve">It is hypothesised that they will likely have an impact on medication discontinuation.</w:t>
+      </w:r>
+    </w:p>
+    <w:p>
+      <w:pPr>
+        <w:pStyle w:val="Compact"/>
+        <w:numPr>
+          <w:ilvl w:val="0"/>
+          <w:numId w:val="1013"/>
         </w:numPr>
       </w:pPr>
       <w:r>
@@ -1879,7 +1854,7 @@
               <w:t xml:space="preserve"> </w:t>
             </w:r>
             <w:r>
-              <w:t xml:space="preserve">(16)</w:t>
+              <w:t xml:space="preserve">(13)</w:t>
             </w:r>
             <w:r>
               <w:t xml:space="preserve">), a widely used metric</w:t>
@@ -1913,24 +1888,6 @@
             </w:r>
             <w:r>
               <w:t xml:space="preserve">moderately frail, severely frail</w:t>
-            </w:r>
-            <w:r>
-              <w:t xml:space="preserve"> </w:t>
-            </w:r>
-            <w:r>
-              <w:t xml:space="preserve">https://github.com/opensafely/covid_collater</w:t>
-            </w:r>
-            <w:r>
-              <w:t xml:space="preserve"> </w:t>
-            </w:r>
-            <w:r>
-              <w:t xml:space="preserve">al_hf_update/blob/236c243cf4882e73393761083d</w:t>
-            </w:r>
-            <w:r>
-              <w:t xml:space="preserve"> </w:t>
-            </w:r>
-            <w:r>
-              <w:t xml:space="preserve">ee1be2340b8d6a/analysis/eFI_calc_hf.do</w:t>
             </w:r>
           </w:p>
         </w:tc>
@@ -2177,53 +2134,29 @@
               <w:t xml:space="preserve"> </w:t>
             </w:r>
             <w:r>
-              <w:t xml:space="preserve">Score</w:t>
-            </w:r>
-          </w:p>
-        </w:tc>
-        <w:tc>
-          <w:tcPr/>
-          <w:p>
-            <w:pPr>
-              <w:pStyle w:val="Compact"/>
-            </w:pPr>
-            <w:r>
-              <w:t xml:space="preserve">Continuous</w:t>
-            </w:r>
-          </w:p>
-        </w:tc>
-        <w:tc>
-          <w:tcPr/>
-          <w:p>
-            <w:pPr>
-              <w:pStyle w:val="Compact"/>
-            </w:pPr>
-            <w:r>
-              <w:t xml:space="preserve">https://github.com/opensafely/</w:t>
-            </w:r>
-            <w:r>
-              <w:t xml:space="preserve"> </w:t>
-            </w:r>
-            <w:r>
-              <w:t xml:space="preserve">NeurodegenerativeDiseaseBurden/blob/</w:t>
-            </w:r>
-            <w:r>
-              <w:t xml:space="preserve"> </w:t>
-            </w:r>
-            <w:r>
-              <w:t xml:space="preserve">33c6a297c0e46a49643890363e4aca9191f87ed0/</w:t>
-            </w:r>
-            <w:r>
-              <w:t xml:space="preserve"> </w:t>
-            </w:r>
-            <w:r>
-              <w:t xml:space="preserve">analysis/dataset_definition/</w:t>
-            </w:r>
-            <w:r>
-              <w:t xml:space="preserve"> </w:t>
-            </w:r>
-            <w:r>
-              <w:t xml:space="preserve">variable_helper_functions.py#L45-L96</w:t>
+              <w:t xml:space="preserve">Score (CMS)</w:t>
+            </w:r>
+          </w:p>
+        </w:tc>
+        <w:tc>
+          <w:tcPr/>
+          <w:p>
+            <w:pPr>
+              <w:pStyle w:val="Compact"/>
+            </w:pPr>
+            <w:r>
+              <w:t xml:space="preserve">Strata</w:t>
+            </w:r>
+          </w:p>
+        </w:tc>
+        <w:tc>
+          <w:tcPr/>
+          <w:p>
+            <w:pPr>
+              <w:pStyle w:val="Compact"/>
+            </w:pPr>
+            <w:r>
+              <w:t xml:space="preserve">Strata: quartiles of CMS</w:t>
             </w:r>
           </w:p>
         </w:tc>
@@ -2271,327 +2204,62 @@
               <w:pStyle w:val="Compact"/>
             </w:pPr>
             <w:r>
-              <w:t xml:space="preserve">Previous cardiovascular</w:t>
+              <w:t xml:space="preserve">Risk of mortality</w:t>
+            </w:r>
+          </w:p>
+        </w:tc>
+        <w:tc>
+          <w:tcPr/>
+          <w:p>
+            <w:pPr>
+              <w:pStyle w:val="Compact"/>
+            </w:pPr>
+            <w:r>
+              <w:t xml:space="preserve">Continuous /</w:t>
             </w:r>
             <w:r>
               <w:t xml:space="preserve"> </w:t>
             </w:r>
             <w:r>
-              <w:t xml:space="preserve">disease</w:t>
-            </w:r>
-          </w:p>
-        </w:tc>
-        <w:tc>
-          <w:tcPr/>
-          <w:p>
-            <w:pPr>
-              <w:pStyle w:val="Compact"/>
-            </w:pPr>
-            <w:r>
-              <w:t xml:space="preserve">Binary</w:t>
-            </w:r>
-          </w:p>
-        </w:tc>
-        <w:tc>
-          <w:tcPr/>
-          <w:p>
-            <w:pPr>
-              <w:pStyle w:val="Compact"/>
-            </w:pPr>
-            <w:r>
-              <w:t xml:space="preserve">fill</w:t>
+              <w:t xml:space="preserve">categorical</w:t>
+            </w:r>
+          </w:p>
+        </w:tc>
+        <w:tc>
+          <w:tcPr/>
+          <w:p>
+            <w:pPr>
+              <w:pStyle w:val="BodyText"/>
+            </w:pPr>
+            <w:r>
+              <w:t xml:space="preserve">Estimated 4-year risk of mortality</w:t>
             </w:r>
             <w:r>
               <w:t xml:space="preserve"> </w:t>
             </w:r>
             <w:r>
-              <w:t xml:space="preserve">in</w:t>
-            </w:r>
-          </w:p>
-        </w:tc>
-      </w:tr>
-      <w:tr>
-        <w:tc>
-          <w:tcPr/>
-          <w:p>
-            <w:pPr>
-              <w:pStyle w:val="Compact"/>
-            </w:pPr>
-            <w:r>
-              <w:t xml:space="preserve">Having had another</w:t>
+              <w:t xml:space="preserve">using the CKD G4+ prediction tool</w:t>
             </w:r>
             <w:r>
               <w:t xml:space="preserve"> </w:t>
             </w:r>
             <w:r>
-              <w:t xml:space="preserve">medicine stopped in last</w:t>
+              <w:t xml:space="preserve">(14)</w:t>
+            </w:r>
+            <w:r>
+              <w:t xml:space="preserve">. This tool is suggested for use</w:t>
             </w:r>
             <w:r>
               <w:t xml:space="preserve"> </w:t>
             </w:r>
             <w:r>
-              <w:t xml:space="preserve">12 months</w:t>
-            </w:r>
-          </w:p>
-        </w:tc>
-        <w:tc>
-          <w:tcPr/>
-          <w:p>
-            <w:pPr>
-              <w:pStyle w:val="Compact"/>
-            </w:pPr>
-            <w:r>
-              <w:t xml:space="preserve">Binary</w:t>
-            </w:r>
-          </w:p>
-        </w:tc>
-        <w:tc>
-          <w:tcPr/>
-          <w:p>
-            <w:pPr>
-              <w:pStyle w:val="Compact"/>
-            </w:pPr>
-            <w:r>
-              <w:t xml:space="preserve">Is this possible?</w:t>
-            </w:r>
-          </w:p>
-        </w:tc>
-      </w:tr>
-      <w:tr>
-        <w:tc>
-          <w:tcPr/>
-          <w:p>
-            <w:pPr>
-              <w:pStyle w:val="Compact"/>
-            </w:pPr>
-            <w:r>
-              <w:t xml:space="preserve">Discharge from a hospital</w:t>
+              <w:t xml:space="preserve">in the 2024 KDIGO CKD management guideline</w:t>
             </w:r>
             <w:r>
               <w:t xml:space="preserve"> </w:t>
             </w:r>
             <w:r>
-              <w:t xml:space="preserve">admission within last 6</w:t>
-            </w:r>
-            <w:r>
-              <w:t xml:space="preserve"> </w:t>
-            </w:r>
-            <w:r>
-              <w:t xml:space="preserve">months</w:t>
-            </w:r>
-          </w:p>
-        </w:tc>
-        <w:tc>
-          <w:tcPr/>
-          <w:p>
-            <w:pPr>
-              <w:pStyle w:val="Compact"/>
-            </w:pPr>
-            <w:r>
-              <w:t xml:space="preserve">Binary</w:t>
-            </w:r>
-          </w:p>
-        </w:tc>
-        <w:tc>
-          <w:tcPr/>
-          <w:p>
-            <w:pPr>
-              <w:pStyle w:val="Compact"/>
-            </w:pPr>
-          </w:p>
-        </w:tc>
-      </w:tr>
-      <w:tr>
-        <w:tc>
-          <w:tcPr/>
-          <w:p>
-            <w:pPr>
-              <w:pStyle w:val="Compact"/>
-            </w:pPr>
-            <w:r>
-              <w:t xml:space="preserve">The effect of recent</w:t>
-            </w:r>
-            <w:r>
-              <w:t xml:space="preserve"> </w:t>
-            </w:r>
-            <w:r>
-              <w:t xml:space="preserve">interaction with secondary</w:t>
-            </w:r>
-            <w:r>
-              <w:t xml:space="preserve"> </w:t>
-            </w:r>
-            <w:r>
-              <w:t xml:space="preserve">care</w:t>
-            </w:r>
-          </w:p>
-        </w:tc>
-        <w:tc>
-          <w:tcPr/>
-          <w:p>
-            <w:pPr>
-              <w:pStyle w:val="Compact"/>
-            </w:pPr>
-          </w:p>
-        </w:tc>
-        <w:tc>
-          <w:tcPr/>
-          <w:p>
-            <w:pPr>
-              <w:pStyle w:val="Compact"/>
-            </w:pPr>
-          </w:p>
-        </w:tc>
-      </w:tr>
-      <w:tr>
-        <w:tc>
-          <w:tcPr/>
-          <w:p>
-            <w:pPr>
-              <w:pStyle w:val="Compact"/>
-            </w:pPr>
-            <w:r>
-              <w:t xml:space="preserve">Something about adverse</w:t>
-            </w:r>
-            <w:r>
-              <w:t xml:space="preserve"> </w:t>
-            </w:r>
-            <w:r>
-              <w:t xml:space="preserve">effects</w:t>
-            </w:r>
-          </w:p>
-        </w:tc>
-        <w:tc>
-          <w:tcPr/>
-          <w:p>
-            <w:pPr>
-              <w:pStyle w:val="Compact"/>
-            </w:pPr>
-          </w:p>
-        </w:tc>
-        <w:tc>
-          <w:tcPr/>
-          <w:p>
-            <w:pPr>
-              <w:pStyle w:val="Compact"/>
-            </w:pPr>
-          </w:p>
-        </w:tc>
-      </w:tr>
-      <w:tr>
-        <w:tc>
-          <w:tcPr/>
-          <w:p>
-            <w:pPr>
-              <w:pStyle w:val="Compact"/>
-            </w:pPr>
-            <w:r>
-              <w:t xml:space="preserve">Use drawio to decide rest</w:t>
-            </w:r>
-          </w:p>
-        </w:tc>
-        <w:tc>
-          <w:tcPr/>
-          <w:p>
-            <w:pPr>
-              <w:pStyle w:val="Compact"/>
-            </w:pPr>
-          </w:p>
-        </w:tc>
-        <w:tc>
-          <w:tcPr/>
-          <w:p>
-            <w:pPr>
-              <w:pStyle w:val="Compact"/>
-            </w:pPr>
-          </w:p>
-        </w:tc>
-      </w:tr>
-    </w:tbl>
-    <w:bookmarkStart w:id="32" w:name="other-covariates"/>
-    <w:p>
-      <w:pPr>
-        <w:pStyle w:val="Heading3"/>
-      </w:pPr>
-      <w:r>
-        <w:t xml:space="preserve">3.6.1 Other covariates</w:t>
-      </w:r>
-    </w:p>
-    <w:tbl>
-      <w:tblPr>
-        <w:tblStyle w:val="Table"/>
-        <w:tblW w:type="pct" w:w="4946"/>
-        <w:tblLayout w:type="fixed"/>
-        <w:tblLook w:firstRow="0" w:lastRow="0" w:firstColumn="0" w:lastColumn="0" w:noHBand="0" w:noVBand="0" w:val="0000"/>
-      </w:tblPr>
-      <w:tblGrid>
-        <w:gridCol w:w="2469"/>
-        <w:gridCol w:w="1362"/>
-        <w:gridCol w:w="4002"/>
-      </w:tblGrid>
-      <w:tr>
-        <w:tc>
-          <w:tcPr/>
-          <w:p>
-            <w:pPr>
-              <w:pStyle w:val="Compact"/>
-            </w:pPr>
-            <w:r>
-              <w:t xml:space="preserve">Risk of mortality</w:t>
-            </w:r>
-          </w:p>
-        </w:tc>
-        <w:tc>
-          <w:tcPr/>
-          <w:p>
-            <w:pPr>
-              <w:pStyle w:val="Compact"/>
-            </w:pPr>
-            <w:r>
-              <w:t xml:space="preserve">Continuous /</w:t>
-            </w:r>
-            <w:r>
-              <w:t xml:space="preserve"> </w:t>
-            </w:r>
-            <w:r>
-              <w:t xml:space="preserve">categorical</w:t>
-            </w:r>
-          </w:p>
-        </w:tc>
-        <w:tc>
-          <w:tcPr/>
-          <w:p>
-            <w:pPr>
-              <w:pStyle w:val="BodyText"/>
-            </w:pPr>
-            <w:r>
-              <w:t xml:space="preserve">Estimated 4-year risk of mortality</w:t>
-            </w:r>
-            <w:r>
-              <w:t xml:space="preserve"> </w:t>
-            </w:r>
-            <w:r>
-              <w:t xml:space="preserve">using the CKD G4+ prediction tool</w:t>
-            </w:r>
-            <w:r>
-              <w:t xml:space="preserve"> </w:t>
-            </w:r>
-            <w:r>
-              <w:t xml:space="preserve">(17)</w:t>
-            </w:r>
-            <w:r>
-              <w:t xml:space="preserve">. This tool is suggested for use</w:t>
-            </w:r>
-            <w:r>
-              <w:t xml:space="preserve"> </w:t>
-            </w:r>
-            <w:r>
-              <w:t xml:space="preserve">in the 2024 KDIGO CKD management guideline</w:t>
-            </w:r>
-            <w:r>
-              <w:t xml:space="preserve"> </w:t>
-            </w:r>
-            <w:r>
-              <w:t xml:space="preserve">(9)</w:t>
+              <w:t xml:space="preserve">(8)</w:t>
             </w:r>
             <w:r>
               <w:t xml:space="preserve">. It requires 8 variables:</w:t>
@@ -2645,23 +2313,40 @@
       </w:tr>
     </w:tbl>
     <w:bookmarkEnd w:id="32"/>
+    <w:bookmarkStart w:id="40" w:name="statistical-methods"/>
+    <w:p>
+      <w:pPr>
+        <w:pStyle w:val="Heading2"/>
+      </w:pPr>
+      <w:r>
+        <w:t xml:space="preserve">3.7 Statistical methods</w:t>
+      </w:r>
+    </w:p>
+    <w:bookmarkStart w:id="33" w:name="cohort-characteristics"/>
+    <w:p>
+      <w:pPr>
+        <w:pStyle w:val="Heading3"/>
+      </w:pPr>
+      <w:r>
+        <w:t xml:space="preserve">3.7.1 Cohort characteristics</w:t>
+      </w:r>
+    </w:p>
+    <w:p>
+      <w:pPr>
+        <w:pStyle w:val="FirstParagraph"/>
+      </w:pPr>
+      <w:r>
+        <w:t xml:space="preserve">We will produce a flowchart to show the numbers of individuals that are included / excluded at each stage of cohort development. Descriptive statistics will be used to describe this group’s baseline characteristics split based on whether they are living with CKD G4 of CKD G5: mean, median and measure of variance for continuous variables, and frequencies and proportions for categorical variables.</w:t>
+      </w:r>
+    </w:p>
     <w:bookmarkEnd w:id="33"/>
-    <w:bookmarkStart w:id="42" w:name="statistical-methods"/>
-    <w:p>
-      <w:pPr>
-        <w:pStyle w:val="Heading2"/>
-      </w:pPr>
-      <w:r>
-        <w:t xml:space="preserve">3.7 Statistical methods</w:t>
-      </w:r>
-    </w:p>
-    <w:bookmarkStart w:id="34" w:name="cohort-characteristics"/>
+    <w:bookmarkStart w:id="34" w:name="baseline-prescribing"/>
     <w:p>
       <w:pPr>
         <w:pStyle w:val="Heading3"/>
       </w:pPr>
       <w:r>
-        <w:t xml:space="preserve">3.7.1 Cohort characteristics</w:t>
+        <w:t xml:space="preserve">3.7.2 Baseline prescribing</w:t>
       </w:r>
     </w:p>
     <w:p>
@@ -2669,203 +2354,7 @@
         <w:pStyle w:val="FirstParagraph"/>
       </w:pPr>
       <w:r>
-        <w:t xml:space="preserve">We will produce a flowchart to show the numbers of individuals that are included / excluded at each stage of cohort development. Descriptive statistics will be used to describe this group’s baseline characteristics: mean, median and measure of variance for continuous variables, and frequencies and proportions for categorical variables.</w:t>
-      </w:r>
-    </w:p>
-    <w:bookmarkEnd w:id="34"/>
-    <w:bookmarkStart w:id="35" w:name="baseline-prescribing"/>
-    <w:p>
-      <w:pPr>
-        <w:pStyle w:val="Heading3"/>
-      </w:pPr>
-      <w:r>
-        <w:t xml:space="preserve">3.7.2 Baseline prescribing</w:t>
-      </w:r>
-    </w:p>
-    <w:p>
-      <w:pPr>
-        <w:pStyle w:val="FirstParagraph"/>
-      </w:pPr>
-      <w:r>
         <w:t xml:space="preserve">We will present:</w:t>
-      </w:r>
-    </w:p>
-    <w:p>
-      <w:pPr>
-        <w:pStyle w:val="Compact"/>
-        <w:numPr>
-          <w:ilvl w:val="0"/>
-          <w:numId w:val="1012"/>
-        </w:numPr>
-      </w:pPr>
-      <w:r>
-        <w:t xml:space="preserve">The average total number of prescribed medications per person on the index date, and</w:t>
-      </w:r>
-    </w:p>
-    <w:p>
-      <w:pPr>
-        <w:pStyle w:val="Compact"/>
-        <w:numPr>
-          <w:ilvl w:val="0"/>
-          <w:numId w:val="1012"/>
-        </w:numPr>
-      </w:pPr>
-      <w:r>
-        <w:t xml:space="preserve">The proportions of the population prescribed each of the most common categories of medication (grouped by BNF subchapter).</w:t>
-      </w:r>
-    </w:p>
-    <w:p>
-      <w:pPr>
-        <w:pStyle w:val="FirstParagraph"/>
-      </w:pPr>
-      <w:r>
-        <w:t xml:space="preserve">We will explore the associations between age, sex, ethnicity and deprivation and the total number of prescribed medications on the index date through individual x,y plots and then multivariable Poisson regression (</w:t>
-      </w:r>
-      <w:r>
-        <w:rPr>
-          <w:i/>
-          <w:iCs/>
-        </w:rPr>
-        <w:t xml:space="preserve">or negative binomial because prescribing data likely to be overdispersed?</w:t>
-      </w:r>
-      <w:r>
-        <w:t xml:space="preserve">)</w:t>
-      </w:r>
-    </w:p>
-    <w:bookmarkEnd w:id="35"/>
-    <w:bookmarkStart w:id="38" w:name="medication-discontinuation"/>
-    <w:p>
-      <w:pPr>
-        <w:pStyle w:val="Heading3"/>
-      </w:pPr>
-      <w:r>
-        <w:t xml:space="preserve">3.7.3 Medication discontinuation</w:t>
-      </w:r>
-    </w:p>
-    <w:p>
-      <w:pPr>
-        <w:pStyle w:val="FirstParagraph"/>
-      </w:pPr>
-      <w:r>
-        <w:t xml:space="preserve">Competing events:</w:t>
-      </w:r>
-    </w:p>
-    <w:p>
-      <w:pPr>
-        <w:pStyle w:val="Compact"/>
-        <w:numPr>
-          <w:ilvl w:val="0"/>
-          <w:numId w:val="1013"/>
-        </w:numPr>
-      </w:pPr>
-      <w:r>
-        <w:t xml:space="preserve">Death (all-cause)</w:t>
-      </w:r>
-    </w:p>
-    <w:p>
-      <w:pPr>
-        <w:pStyle w:val="Compact"/>
-        <w:numPr>
-          <w:ilvl w:val="0"/>
-          <w:numId w:val="1013"/>
-        </w:numPr>
-      </w:pPr>
-      <w:r>
-        <w:t xml:space="preserve">Initiation of kidney replacement therapy</w:t>
-      </w:r>
-    </w:p>
-    <w:bookmarkStart w:id="36" w:name="cumulative-incidence-of-discontinuation"/>
-    <w:p>
-      <w:pPr>
-        <w:pStyle w:val="Heading4"/>
-      </w:pPr>
-      <w:r>
-        <w:t xml:space="preserve">3.7.3.1 Cumulative incidence of discontinuation</w:t>
-      </w:r>
-    </w:p>
-    <w:p>
-      <w:pPr>
-        <w:pStyle w:val="FirstParagraph"/>
-      </w:pPr>
-      <w:r>
-        <w:t xml:space="preserve">For each of the studied medication classes, cumulative incidence functions (CIFs) for medication discontinuation over the follow-up period will be plotted. These will model death and the initiation of KRT as competing events.</w:t>
-      </w:r>
-    </w:p>
-    <w:p>
-      <w:pPr>
-        <w:pStyle w:val="BodyText"/>
-      </w:pPr>
-      <w:r>
-        <w:t xml:space="preserve">Time to first discontinuation event</w:t>
-      </w:r>
-    </w:p>
-    <w:p>
-      <w:pPr>
-        <w:pStyle w:val="BodyText"/>
-      </w:pPr>
-      <w:r>
-        <w:t xml:space="preserve">What about people who start the medication after the index date - i.e. new initiators vs prevalent users?</w:t>
-      </w:r>
-    </w:p>
-    <w:bookmarkEnd w:id="36"/>
-    <w:bookmarkStart w:id="37" w:name="predictors-of-discontinuation"/>
-    <w:p>
-      <w:pPr>
-        <w:pStyle w:val="Heading4"/>
-      </w:pPr>
-      <w:r>
-        <w:t xml:space="preserve">3.7.3.2 Predictors of discontinuation</w:t>
-      </w:r>
-    </w:p>
-    <w:bookmarkEnd w:id="37"/>
-    <w:bookmarkEnd w:id="38"/>
-    <w:bookmarkStart w:id="40" w:name="software"/>
-    <w:p>
-      <w:pPr>
-        <w:pStyle w:val="Heading3"/>
-      </w:pPr>
-      <w:r>
-        <w:t xml:space="preserve">3.7.4 Software</w:t>
-      </w:r>
-    </w:p>
-    <w:p>
-      <w:pPr>
-        <w:pStyle w:val="FirstParagraph"/>
-      </w:pPr>
-      <w:r>
-        <w:t xml:space="preserve">All analyses will be conducted using R. OpenSAFELY analyses control the version of R (4.4.3) and the packages that can be used - and these are publicly available</w:t>
-      </w:r>
-      <w:r>
-        <w:t xml:space="preserve"> </w:t>
-      </w:r>
-      <w:hyperlink r:id="rId39">
-        <w:r>
-          <w:rPr>
-            <w:rStyle w:val="Hyperlink"/>
-          </w:rPr>
-          <w:t xml:space="preserve">here</w:t>
-        </w:r>
-      </w:hyperlink>
-      <w:r>
-        <w:t xml:space="preserve">.</w:t>
-      </w:r>
-    </w:p>
-    <w:bookmarkEnd w:id="40"/>
-    <w:bookmarkStart w:id="41" w:name="sensitivity-analyses"/>
-    <w:p>
-      <w:pPr>
-        <w:pStyle w:val="Heading3"/>
-      </w:pPr>
-      <w:r>
-        <w:t xml:space="preserve">3.7.5 Sensitivity analyses</w:t>
-      </w:r>
-    </w:p>
-    <w:p>
-      <w:pPr>
-        <w:pStyle w:val="FirstParagraph"/>
-      </w:pPr>
-      <w:r>
-        <w:t xml:space="preserve">In sensitivity analyses, we will explore the effect of:</w:t>
       </w:r>
     </w:p>
     <w:p>
@@ -2877,7 +2366,7 @@
         </w:numPr>
       </w:pPr>
       <w:r>
-        <w:t xml:space="preserve">Including drugs that are administered through other routes.</w:t>
+        <w:t xml:space="preserve">The average total number of prescribed medications per person on the index date, and</w:t>
       </w:r>
     </w:p>
     <w:p>
@@ -2889,7 +2378,33 @@
         </w:numPr>
       </w:pPr>
       <w:r>
-        <w:t xml:space="preserve">Varying the definition of a chronic medicines (using different numbers/timeframes of prescriptions).</w:t>
+        <w:t xml:space="preserve">The proportions of the population prescribed each of the most common categories of medication (grouped by BNF subchapter).</w:t>
+      </w:r>
+    </w:p>
+    <w:p>
+      <w:pPr>
+        <w:pStyle w:val="FirstParagraph"/>
+      </w:pPr>
+      <w:r>
+        <w:t xml:space="preserve">We will explore the associations between age, sex, ethnicity and deprivation and the total number of prescribed medications on the index date by univariable stratification.</w:t>
+      </w:r>
+    </w:p>
+    <w:bookmarkEnd w:id="34"/>
+    <w:bookmarkStart w:id="36" w:name="medication-discontinuation"/>
+    <w:p>
+      <w:pPr>
+        <w:pStyle w:val="Heading3"/>
+      </w:pPr>
+      <w:r>
+        <w:t xml:space="preserve">3.7.3 Medication discontinuation</w:t>
+      </w:r>
+    </w:p>
+    <w:p>
+      <w:pPr>
+        <w:pStyle w:val="FirstParagraph"/>
+      </w:pPr>
+      <w:r>
+        <w:t xml:space="preserve">Competing events:</w:t>
       </w:r>
     </w:p>
     <w:p>
@@ -2897,110 +2412,202 @@
         <w:pStyle w:val="Compact"/>
         <w:numPr>
           <w:ilvl w:val="0"/>
-          <w:numId w:val="1014"/>
+          <w:numId w:val="1015"/>
         </w:numPr>
       </w:pPr>
       <w:r>
-        <w:t xml:space="preserve">Defining discontinuation using a gap of: ≥30 days, ≥60 days and ≥180 days.</w:t>
-      </w:r>
-    </w:p>
-    <w:bookmarkEnd w:id="41"/>
-    <w:bookmarkEnd w:id="42"/>
-    <w:bookmarkStart w:id="43" w:name="tables-and-figures"/>
-    <w:p>
-      <w:pPr>
-        <w:pStyle w:val="Heading2"/>
-      </w:pPr>
-      <w:r>
-        <w:t xml:space="preserve">3.8 Tables and figures</w:t>
-      </w:r>
-    </w:p>
-    <w:bookmarkEnd w:id="43"/>
-    <w:bookmarkStart w:id="44" w:name="study-limitations"/>
-    <w:p>
-      <w:pPr>
-        <w:pStyle w:val="Heading2"/>
-      </w:pPr>
-      <w:r>
-        <w:t xml:space="preserve">3.9 Study limitations</w:t>
-      </w:r>
-    </w:p>
-    <w:bookmarkEnd w:id="44"/>
-    <w:bookmarkEnd w:id="45"/>
-    <w:bookmarkStart w:id="48" w:name="other-information"/>
-    <w:p>
-      <w:pPr>
-        <w:pStyle w:val="Heading1"/>
-      </w:pPr>
-      <w:r>
-        <w:t xml:space="preserve">4. Other information</w:t>
-      </w:r>
-    </w:p>
-    <w:bookmarkStart w:id="46" w:name="funding"/>
-    <w:p>
-      <w:pPr>
-        <w:pStyle w:val="Heading2"/>
-      </w:pPr>
-      <w:r>
-        <w:t xml:space="preserve">4.1 Funding</w:t>
-      </w:r>
-    </w:p>
-    <w:bookmarkEnd w:id="46"/>
-    <w:bookmarkStart w:id="47" w:name="ppie"/>
-    <w:p>
-      <w:pPr>
-        <w:pStyle w:val="Heading2"/>
-      </w:pPr>
-      <w:r>
-        <w:t xml:space="preserve">4.2 PPIE</w:t>
-      </w:r>
-    </w:p>
-    <w:bookmarkEnd w:id="47"/>
-    <w:bookmarkEnd w:id="48"/>
-    <w:bookmarkStart w:id="80" w:name="references"/>
-    <w:p>
-      <w:pPr>
-        <w:pStyle w:val="Heading1"/>
-      </w:pPr>
-      <w:r>
-        <w:t xml:space="preserve">References</w:t>
-      </w:r>
-    </w:p>
-    <w:bookmarkStart w:id="79" w:name="refs"/>
-    <w:bookmarkStart w:id="50" w:name="ref-Brown2024"/>
-    <w:p>
-      <w:pPr>
-        <w:pStyle w:val="Bibliography"/>
-      </w:pPr>
-      <w:r>
-        <w:t xml:space="preserve">1.</w:t>
-      </w:r>
-      <w:r>
-        <w:t xml:space="preserve"> </w:t>
-      </w:r>
-      <w:r>
-        <w:t xml:space="preserve">	</w:t>
-      </w:r>
-      <w:r>
-        <w:t xml:space="preserve">Brown JP, Hunnicutt JN, Ali MS, Bhaskaran K, Cole A, Langan SM, et al. Quantifying possible bias in clinical and epidemiological studies with quantitative bias analysis: Common approaches and limitations. BMJ. 2024;e076365. doi:</w:t>
-      </w:r>
-      <w:hyperlink r:id="rId49">
+        <w:t xml:space="preserve">Death (all-cause)</w:t>
+      </w:r>
+    </w:p>
+    <w:p>
+      <w:pPr>
+        <w:pStyle w:val="Compact"/>
+        <w:numPr>
+          <w:ilvl w:val="0"/>
+          <w:numId w:val="1015"/>
+        </w:numPr>
+      </w:pPr>
+      <w:r>
+        <w:t xml:space="preserve">Initiation of kidney replacement therapy</w:t>
+      </w:r>
+    </w:p>
+    <w:bookmarkStart w:id="35" w:name="cumulative-incidence-of-discontinuation"/>
+    <w:p>
+      <w:pPr>
+        <w:pStyle w:val="Heading4"/>
+      </w:pPr>
+      <w:r>
+        <w:t xml:space="preserve">3.7.3.1 Cumulative incidence of discontinuation</w:t>
+      </w:r>
+    </w:p>
+    <w:p>
+      <w:pPr>
+        <w:pStyle w:val="FirstParagraph"/>
+      </w:pPr>
+      <w:r>
+        <w:t xml:space="preserve">For each of the studied medication classes, cumulative incidence functions (CIFs) for medication discontinuation over the follow-up period will be plotted. These will model death and the initiation of KRT as competing events.</w:t>
+      </w:r>
+    </w:p>
+    <w:bookmarkEnd w:id="35"/>
+    <w:bookmarkEnd w:id="36"/>
+    <w:bookmarkStart w:id="38" w:name="software"/>
+    <w:p>
+      <w:pPr>
+        <w:pStyle w:val="Heading3"/>
+      </w:pPr>
+      <w:r>
+        <w:t xml:space="preserve">3.7.4 Software</w:t>
+      </w:r>
+    </w:p>
+    <w:p>
+      <w:pPr>
+        <w:pStyle w:val="FirstParagraph"/>
+      </w:pPr>
+      <w:r>
+        <w:t xml:space="preserve">All analyses will be run using the OpenSAFELY Data Analytics Platform. Data extraction scripts will be written using the electronic health record query language (ehrQL), and data processing and analysis scripts will be written using R. OpenSAFELY tightly controls the version of R (4.4.3) and the the available packages that can be</w:t>
+      </w:r>
+      <w:r>
+        <w:t xml:space="preserve"> </w:t>
+      </w:r>
+      <w:hyperlink r:id="rId37">
         <w:r>
           <w:rPr>
             <w:rStyle w:val="Hyperlink"/>
           </w:rPr>
-          <w:t xml:space="preserve">10.1136/bmj-2023-076365</w:t>
+          <w:t xml:space="preserve">used</w:t>
         </w:r>
       </w:hyperlink>
-    </w:p>
-    <w:bookmarkEnd w:id="50"/>
-    <w:bookmarkStart w:id="52" w:name="ref-Hawthorne2023"/>
+      <w:r>
+        <w:t xml:space="preserve"> </w:t>
+      </w:r>
+      <w:r>
+        <w:t xml:space="preserve">in order to maximise reproducibility of code, and to enable local testing.</w:t>
+      </w:r>
+    </w:p>
+    <w:bookmarkEnd w:id="38"/>
+    <w:bookmarkStart w:id="39" w:name="sensitivity-analyses"/>
+    <w:p>
+      <w:pPr>
+        <w:pStyle w:val="Heading3"/>
+      </w:pPr>
+      <w:r>
+        <w:t xml:space="preserve">3.7.5 Sensitivity analyses</w:t>
+      </w:r>
+    </w:p>
+    <w:p>
+      <w:pPr>
+        <w:pStyle w:val="FirstParagraph"/>
+      </w:pPr>
+      <w:r>
+        <w:t xml:space="preserve">Sensitivity analyses will explore the effect of:</w:t>
+      </w:r>
+    </w:p>
+    <w:p>
+      <w:pPr>
+        <w:pStyle w:val="Compact"/>
+        <w:numPr>
+          <w:ilvl w:val="0"/>
+          <w:numId w:val="1016"/>
+        </w:numPr>
+      </w:pPr>
+      <w:r>
+        <w:t xml:space="preserve">Including drugs that are administered through other routes.</w:t>
+      </w:r>
+    </w:p>
+    <w:p>
+      <w:pPr>
+        <w:pStyle w:val="Compact"/>
+        <w:numPr>
+          <w:ilvl w:val="0"/>
+          <w:numId w:val="1016"/>
+        </w:numPr>
+      </w:pPr>
+      <w:r>
+        <w:t xml:space="preserve">Varying the definition of a chronic medicines (using different numbers/timeframes of prescriptions).</w:t>
+      </w:r>
+    </w:p>
+    <w:p>
+      <w:pPr>
+        <w:pStyle w:val="Compact"/>
+        <w:numPr>
+          <w:ilvl w:val="0"/>
+          <w:numId w:val="1016"/>
+        </w:numPr>
+      </w:pPr>
+      <w:r>
+        <w:t xml:space="preserve">Varying the definition of medication discontinuation.</w:t>
+      </w:r>
+    </w:p>
+    <w:bookmarkEnd w:id="39"/>
+    <w:bookmarkEnd w:id="40"/>
+    <w:bookmarkStart w:id="41" w:name="tables-and-figures"/>
+    <w:p>
+      <w:pPr>
+        <w:pStyle w:val="Heading2"/>
+      </w:pPr>
+      <w:r>
+        <w:t xml:space="preserve">3.8 Tables and figures</w:t>
+      </w:r>
+    </w:p>
+    <w:bookmarkEnd w:id="41"/>
+    <w:bookmarkStart w:id="42" w:name="study-limitations"/>
+    <w:p>
+      <w:pPr>
+        <w:pStyle w:val="Heading2"/>
+      </w:pPr>
+      <w:r>
+        <w:t xml:space="preserve">3.9 Study limitations</w:t>
+      </w:r>
+    </w:p>
+    <w:bookmarkEnd w:id="42"/>
+    <w:bookmarkEnd w:id="43"/>
+    <w:bookmarkStart w:id="46" w:name="other-information"/>
+    <w:p>
+      <w:pPr>
+        <w:pStyle w:val="Heading1"/>
+      </w:pPr>
+      <w:r>
+        <w:t xml:space="preserve">4. Other information</w:t>
+      </w:r>
+    </w:p>
+    <w:bookmarkStart w:id="44" w:name="funding"/>
+    <w:p>
+      <w:pPr>
+        <w:pStyle w:val="Heading2"/>
+      </w:pPr>
+      <w:r>
+        <w:t xml:space="preserve">4.1 Funding</w:t>
+      </w:r>
+    </w:p>
+    <w:bookmarkEnd w:id="44"/>
+    <w:bookmarkStart w:id="45" w:name="ppie"/>
+    <w:p>
+      <w:pPr>
+        <w:pStyle w:val="Heading2"/>
+      </w:pPr>
+      <w:r>
+        <w:t xml:space="preserve">4.2 PPIE</w:t>
+      </w:r>
+    </w:p>
+    <w:bookmarkEnd w:id="45"/>
+    <w:bookmarkEnd w:id="46"/>
+    <w:bookmarkStart w:id="72" w:name="references"/>
+    <w:p>
+      <w:pPr>
+        <w:pStyle w:val="Heading1"/>
+      </w:pPr>
+      <w:r>
+        <w:t xml:space="preserve">References</w:t>
+      </w:r>
+    </w:p>
+    <w:bookmarkStart w:id="71" w:name="refs"/>
+    <w:bookmarkStart w:id="48" w:name="ref-Hawthorne2023"/>
     <w:p>
       <w:pPr>
         <w:pStyle w:val="Bibliography"/>
       </w:pPr>
       <w:r>
-        <w:t xml:space="preserve">2.</w:t>
+        <w:t xml:space="preserve">1.</w:t>
       </w:r>
       <w:r>
         <w:t xml:space="preserve"> </w:t>
@@ -3023,7 +2630,7 @@
       <w:r>
         <w:t xml:space="preserve">cohort study. International Urology and Nephrology. 2023;55(8):2047–57. doi:</w:t>
       </w:r>
-      <w:hyperlink r:id="rId51">
+      <w:hyperlink r:id="rId47">
         <w:r>
           <w:rPr>
             <w:rStyle w:val="Hyperlink"/>
@@ -3032,14 +2639,14 @@
         </w:r>
       </w:hyperlink>
     </w:p>
-    <w:bookmarkEnd w:id="52"/>
-    <w:bookmarkStart w:id="54" w:name="ref-vanOosten2021"/>
+    <w:bookmarkEnd w:id="48"/>
+    <w:bookmarkStart w:id="50" w:name="ref-vanOosten2021"/>
     <w:p>
       <w:pPr>
         <w:pStyle w:val="Bibliography"/>
       </w:pPr>
       <w:r>
-        <w:t xml:space="preserve">3.</w:t>
+        <w:t xml:space="preserve">2.</w:t>
       </w:r>
       <w:r>
         <w:t xml:space="preserve"> </w:t>
@@ -3050,7 +2657,7 @@
       <w:r>
         <w:t xml:space="preserve">Oosten MJM van, Logtenberg SJJ, Hemmellder MH, Leegte MJH, Bilo HJG, Jager KJ, et al. Polypharmacy and medication use in patients with chronic kidney disease with and without kidney replacement therapy compared to matched controls. Clinical Kidney Journal. 2021;14(12):2497–523. doi:</w:t>
       </w:r>
-      <w:hyperlink r:id="rId53">
+      <w:hyperlink r:id="rId49">
         <w:r>
           <w:rPr>
             <w:rStyle w:val="Hyperlink"/>
@@ -3059,14 +2666,14 @@
         </w:r>
       </w:hyperlink>
     </w:p>
-    <w:bookmarkEnd w:id="54"/>
-    <w:bookmarkStart w:id="56" w:name="ref-Fried2014"/>
+    <w:bookmarkEnd w:id="50"/>
+    <w:bookmarkStart w:id="52" w:name="ref-Fried2014"/>
     <w:p>
       <w:pPr>
         <w:pStyle w:val="Bibliography"/>
       </w:pPr>
       <w:r>
-        <w:t xml:space="preserve">4.</w:t>
+        <w:t xml:space="preserve">3.</w:t>
       </w:r>
       <w:r>
         <w:t xml:space="preserve"> </w:t>
@@ -3077,7 +2684,7 @@
       <w:r>
         <w:t xml:space="preserve">Fried TR, O’Leary J, Towle V, Goldstein MK, Trentalange M, Martin DK. Health outcomes associated with polypharmacy in community-dwelling older adults: A systematic review. Journal of the American Geriatrics Society. 2014;62(12):2261–72. doi:</w:t>
       </w:r>
-      <w:hyperlink r:id="rId55">
+      <w:hyperlink r:id="rId51">
         <w:r>
           <w:rPr>
             <w:rStyle w:val="Hyperlink"/>
@@ -3086,13 +2693,32 @@
         </w:r>
       </w:hyperlink>
     </w:p>
-    <w:bookmarkEnd w:id="56"/>
-    <w:bookmarkStart w:id="57" w:name="ref-WHO2023"/>
+    <w:bookmarkEnd w:id="52"/>
+    <w:bookmarkStart w:id="53" w:name="ref-WHO2023"/>
     <w:p>
       <w:pPr>
         <w:pStyle w:val="Bibliography"/>
       </w:pPr>
       <w:r>
+        <w:t xml:space="preserve">4.</w:t>
+      </w:r>
+      <w:r>
+        <w:t xml:space="preserve"> </w:t>
+      </w:r>
+      <w:r>
+        <w:t xml:space="preserve">	</w:t>
+      </w:r>
+      <w:r>
+        <w:t xml:space="preserve">World Health Organization. Medication without harm: Policy brief. World Health Organization; 2023.</w:t>
+      </w:r>
+    </w:p>
+    <w:bookmarkEnd w:id="53"/>
+    <w:bookmarkStart w:id="55" w:name="ref-Laville2020"/>
+    <w:p>
+      <w:pPr>
+        <w:pStyle w:val="Bibliography"/>
+      </w:pPr>
+      <w:r>
         <w:t xml:space="preserve">5.</w:t>
       </w:r>
       <w:r>
@@ -3102,31 +2728,12 @@
         <w:t xml:space="preserve">	</w:t>
       </w:r>
       <w:r>
-        <w:t xml:space="preserve">World Health Organization. Medication without harm: Policy brief. World Health Organization; 2023.</w:t>
-      </w:r>
-    </w:p>
-    <w:bookmarkEnd w:id="57"/>
-    <w:bookmarkStart w:id="59" w:name="ref-Laville2020"/>
-    <w:p>
-      <w:pPr>
-        <w:pStyle w:val="Bibliography"/>
-      </w:pPr>
-      <w:r>
-        <w:t xml:space="preserve">6.</w:t>
-      </w:r>
-      <w:r>
-        <w:t xml:space="preserve"> </w:t>
-      </w:r>
-      <w:r>
-        <w:t xml:space="preserve">	</w:t>
-      </w:r>
-      <w:r>
         <w:t xml:space="preserve">Laville SM, Gras-Champel V, Moragny J, Metzger M, Jacquelinet C, Combe C, et al.</w:t>
       </w:r>
       <w:r>
         <w:t xml:space="preserve"> Adverse drug reactions in patients with CKD [Journal Article]. Clinical Journal of the American Society of Nephrology. 2020;15(8):1090–102. doi:</w:t>
       </w:r>
-      <w:hyperlink r:id="rId58">
+      <w:hyperlink r:id="rId54">
         <w:r>
           <w:rPr>
             <w:rStyle w:val="Hyperlink"/>
@@ -3135,13 +2742,32 @@
         </w:r>
       </w:hyperlink>
     </w:p>
-    <w:bookmarkEnd w:id="59"/>
-    <w:bookmarkStart w:id="60" w:name="ref-Mohottige2021"/>
+    <w:bookmarkEnd w:id="55"/>
+    <w:bookmarkStart w:id="56" w:name="ref-Mohottige2021"/>
     <w:p>
       <w:pPr>
         <w:pStyle w:val="Bibliography"/>
       </w:pPr>
       <w:r>
+        <w:t xml:space="preserve">6.</w:t>
+      </w:r>
+      <w:r>
+        <w:t xml:space="preserve"> </w:t>
+      </w:r>
+      <w:r>
+        <w:t xml:space="preserve">	</w:t>
+      </w:r>
+      <w:r>
+        <w:t xml:space="preserve">Mohottige D, Manley HJ, Hall RK. Less is more: Deprescribing medications in older adults with kidney disease: A review. Kidney360. 2021;2(9):1510–22.</w:t>
+      </w:r>
+    </w:p>
+    <w:bookmarkEnd w:id="56"/>
+    <w:bookmarkStart w:id="58" w:name="ref-Colombijn2024"/>
+    <w:p>
+      <w:pPr>
+        <w:pStyle w:val="Bibliography"/>
+      </w:pPr>
+      <w:r>
         <w:t xml:space="preserve">7.</w:t>
       </w:r>
       <w:r>
@@ -3151,28 +2777,9 @@
         <w:t xml:space="preserve">	</w:t>
       </w:r>
       <w:r>
-        <w:t xml:space="preserve">Mohottige D, Manley HJ, Hall RK. Less is more: Deprescribing medications in older adults with kidney disease: A review. Kidney360. 2021;2(9):1510–22.</w:t>
-      </w:r>
-    </w:p>
-    <w:bookmarkEnd w:id="60"/>
-    <w:bookmarkStart w:id="62" w:name="ref-Colombijn2024"/>
-    <w:p>
-      <w:pPr>
-        <w:pStyle w:val="Bibliography"/>
-      </w:pPr>
-      <w:r>
-        <w:t xml:space="preserve">8.</w:t>
-      </w:r>
-      <w:r>
-        <w:t xml:space="preserve"> </w:t>
-      </w:r>
-      <w:r>
-        <w:t xml:space="preserve">	</w:t>
-      </w:r>
-      <w:r>
         <w:t xml:space="preserve">Colombijn JMT, Idema DL, Van Beem S, Blokland AM, Van Der Braak K, Handoko ML, et al. Representation of patients with chronic kidney disease in clinical trials of cardiovascular disease medications. JAMA Network Open. 2024;7(3):e240427. doi:</w:t>
       </w:r>
-      <w:hyperlink r:id="rId61">
+      <w:hyperlink r:id="rId57">
         <w:r>
           <w:rPr>
             <w:rStyle w:val="Hyperlink"/>
@@ -3181,14 +2788,14 @@
         </w:r>
       </w:hyperlink>
     </w:p>
-    <w:bookmarkEnd w:id="62"/>
-    <w:bookmarkStart w:id="64" w:name="ref-Stevens2024"/>
+    <w:bookmarkEnd w:id="58"/>
+    <w:bookmarkStart w:id="60" w:name="ref-Stevens2024"/>
     <w:p>
       <w:pPr>
         <w:pStyle w:val="Bibliography"/>
       </w:pPr>
       <w:r>
-        <w:t xml:space="preserve">9.</w:t>
+        <w:t xml:space="preserve">8.</w:t>
       </w:r>
       <w:r>
         <w:t xml:space="preserve"> </w:t>
@@ -3211,7 +2818,7 @@
       <w:r>
         <w:t xml:space="preserve">2024 clinical practice guideline for the evaluation and management of chronic kidney disease. Kidney International. 2024;105(4):S117–314. doi:</w:t>
       </w:r>
-      <w:hyperlink r:id="rId63">
+      <w:hyperlink r:id="rId59">
         <w:r>
           <w:rPr>
             <w:rStyle w:val="Hyperlink"/>
@@ -3220,13 +2827,32 @@
         </w:r>
       </w:hyperlink>
     </w:p>
-    <w:bookmarkEnd w:id="64"/>
-    <w:bookmarkStart w:id="66" w:name="ref-Letts2024"/>
+    <w:bookmarkEnd w:id="60"/>
+    <w:bookmarkStart w:id="61" w:name="ref-Sparks2025"/>
     <w:p>
       <w:pPr>
         <w:pStyle w:val="Bibliography"/>
       </w:pPr>
       <w:r>
+        <w:t xml:space="preserve">9.</w:t>
+      </w:r>
+      <w:r>
+        <w:t xml:space="preserve"> </w:t>
+      </w:r>
+      <w:r>
+        <w:t xml:space="preserve">	</w:t>
+      </w:r>
+      <w:r>
+        <w:t xml:space="preserve">Sparks C, Steinberg AG, Toussaint ND. Identifying and characterising a chronic kidney disease electronic-phenotype using electronic health record-derived data: A narrative review of strategies and applications. Nephrology. 2025;30(9).</w:t>
+      </w:r>
+    </w:p>
+    <w:bookmarkEnd w:id="61"/>
+    <w:bookmarkStart w:id="63" w:name="ref-Santhakumaran2024"/>
+    <w:p>
+      <w:pPr>
+        <w:pStyle w:val="Bibliography"/>
+      </w:pPr>
+      <w:r>
         <w:t xml:space="preserve">10.</w:t>
       </w:r>
       <w:r>
@@ -3236,52 +2862,6 @@
         <w:t xml:space="preserve">	</w:t>
       </w:r>
       <w:r>
-        <w:t xml:space="preserve">Letts M, Chesnaye NC, Pippias M, Caskey F, Jager KJ, Dekker FW, et al. Prescribing patterns in older people with advanced chronic kidney disease towards the end of life. Clinical Kidney Journal. 2024. doi:</w:t>
-      </w:r>
-      <w:hyperlink r:id="rId65">
-        <w:r>
-          <w:rPr>
-            <w:rStyle w:val="Hyperlink"/>
-          </w:rPr>
-          <w:t xml:space="preserve">10.1093/ckj/sfae301</w:t>
-        </w:r>
-      </w:hyperlink>
-    </w:p>
-    <w:bookmarkEnd w:id="66"/>
-    <w:bookmarkStart w:id="67" w:name="ref-Sparks2025"/>
-    <w:p>
-      <w:pPr>
-        <w:pStyle w:val="Bibliography"/>
-      </w:pPr>
-      <w:r>
-        <w:t xml:space="preserve">11.</w:t>
-      </w:r>
-      <w:r>
-        <w:t xml:space="preserve"> </w:t>
-      </w:r>
-      <w:r>
-        <w:t xml:space="preserve">	</w:t>
-      </w:r>
-      <w:r>
-        <w:t xml:space="preserve">Sparks C, Steinberg AG, Toussaint ND. Identifying and characterising a chronic kidney disease electronic-phenotype using electronic health record-derived data: A narrative review of strategies and applications. Nephrology. 2025;30(9).</w:t>
-      </w:r>
-    </w:p>
-    <w:bookmarkEnd w:id="67"/>
-    <w:bookmarkStart w:id="69" w:name="ref-Santhakumaran2024"/>
-    <w:p>
-      <w:pPr>
-        <w:pStyle w:val="Bibliography"/>
-      </w:pPr>
-      <w:r>
-        <w:t xml:space="preserve">12.</w:t>
-      </w:r>
-      <w:r>
-        <w:t xml:space="preserve"> </w:t>
-      </w:r>
-      <w:r>
-        <w:t xml:space="preserve">	</w:t>
-      </w:r>
-      <w:r>
         <w:t xml:space="preserve">Santhakumaran S, Fisher L, Zheng B, Mahalingasivam V, Plumb L, Parker EPK, et al. Identification of patients undergoing chronic kidney replacement therapy in primary and secondary care data: Validation study based on</w:t>
       </w:r>
       <w:r>
@@ -3308,7 +2888,7 @@
       <w:r>
         <w:t xml:space="preserve">renal registry. BMJ Medicine. 2024;3(1):e000807. doi:</w:t>
       </w:r>
-      <w:hyperlink r:id="rId68">
+      <w:hyperlink r:id="rId62">
         <w:r>
           <w:rPr>
             <w:rStyle w:val="Hyperlink"/>
@@ -3317,14 +2897,14 @@
         </w:r>
       </w:hyperlink>
     </w:p>
-    <w:bookmarkEnd w:id="69"/>
-    <w:bookmarkStart w:id="71" w:name="ref-Goedken2016"/>
+    <w:bookmarkEnd w:id="63"/>
+    <w:bookmarkStart w:id="65" w:name="ref-Goedken2016"/>
     <w:p>
       <w:pPr>
         <w:pStyle w:val="Bibliography"/>
       </w:pPr>
       <w:r>
-        <w:t xml:space="preserve">13.</w:t>
+        <w:t xml:space="preserve">11.</w:t>
       </w:r>
       <w:r>
         <w:t xml:space="preserve"> </w:t>
@@ -3335,7 +2915,7 @@
       <w:r>
         <w:t xml:space="preserve">Goedken AM, Lund BC, Cook EA, Schroeder MC, Brooks JM. Application of a framework for determining number of drugs. BMC Research Notes. 2016;9(1). doi:</w:t>
       </w:r>
-      <w:hyperlink r:id="rId70">
+      <w:hyperlink r:id="rId64">
         <w:r>
           <w:rPr>
             <w:rStyle w:val="Hyperlink"/>
@@ -3344,14 +2924,14 @@
         </w:r>
       </w:hyperlink>
     </w:p>
-    <w:bookmarkEnd w:id="71"/>
-    <w:bookmarkStart w:id="73" w:name="ref-Mackenna2025"/>
+    <w:bookmarkEnd w:id="65"/>
+    <w:bookmarkStart w:id="67" w:name="ref-Mackenna2025"/>
     <w:p>
       <w:pPr>
         <w:pStyle w:val="Bibliography"/>
       </w:pPr>
       <w:r>
-        <w:t xml:space="preserve">14.</w:t>
+        <w:t xml:space="preserve">12.</w:t>
       </w:r>
       <w:r>
         <w:t xml:space="preserve"> </w:t>
@@ -3371,7 +2951,7 @@
       <w:r>
         <w:t xml:space="preserve">. British Journal of General Practice. 2025;75(756):e448–56. doi:</w:t>
       </w:r>
-      <w:hyperlink r:id="rId72">
+      <w:hyperlink r:id="rId66">
         <w:r>
           <w:rPr>
             <w:rStyle w:val="Hyperlink"/>
@@ -3380,14 +2960,14 @@
         </w:r>
       </w:hyperlink>
     </w:p>
-    <w:bookmarkEnd w:id="73"/>
-    <w:bookmarkStart w:id="75" w:name="ref-Bayliss2025"/>
+    <w:bookmarkEnd w:id="67"/>
+    <w:bookmarkStart w:id="69" w:name="ref-Best2025"/>
     <w:p>
       <w:pPr>
         <w:pStyle w:val="Bibliography"/>
       </w:pPr>
       <w:r>
-        <w:t xml:space="preserve">15.</w:t>
+        <w:t xml:space="preserve">13.</w:t>
       </w:r>
       <w:r>
         <w:t xml:space="preserve"> </w:t>
@@ -3396,36 +2976,9 @@
         <w:t xml:space="preserve">	</w:t>
       </w:r>
       <w:r>
-        <w:t xml:space="preserve">Bayliss EA, Goodrich GK, Barrow JC, Harding B, Ripley CA, Kraus CR, et al. Discontinuation categories underlying gaps in dispensing for six medication groups. Pharmacoepidemiology and Drug Safety. 2025;34(4). doi:</w:t>
-      </w:r>
-      <w:hyperlink r:id="rId74">
-        <w:r>
-          <w:rPr>
-            <w:rStyle w:val="Hyperlink"/>
-          </w:rPr>
-          <w:t xml:space="preserve">10.1002/pds.70142</w:t>
-        </w:r>
-      </w:hyperlink>
-    </w:p>
-    <w:bookmarkEnd w:id="75"/>
-    <w:bookmarkStart w:id="77" w:name="ref-Best2025"/>
-    <w:p>
-      <w:pPr>
-        <w:pStyle w:val="Bibliography"/>
-      </w:pPr>
-      <w:r>
-        <w:t xml:space="preserve">16.</w:t>
-      </w:r>
-      <w:r>
-        <w:t xml:space="preserve"> </w:t>
-      </w:r>
-      <w:r>
-        <w:t xml:space="preserve">	</w:t>
-      </w:r>
-      <w:r>
         <w:t xml:space="preserve">Best K, Shuweihdi F, Alvarez JCB, Relton S, Avgerinou C, Nimmons D, et al. Development and external validation of the electronic frailty index 2 using routine primary care electronic health record data. Age and Ageing. 2025;54(4). doi:</w:t>
       </w:r>
-      <w:hyperlink r:id="rId76">
+      <w:hyperlink r:id="rId68">
         <w:r>
           <w:rPr>
             <w:rStyle w:val="Hyperlink"/>
@@ -3434,14 +2987,14 @@
         </w:r>
       </w:hyperlink>
     </w:p>
-    <w:bookmarkEnd w:id="77"/>
-    <w:bookmarkStart w:id="78" w:name="ref-Grams2018"/>
+    <w:bookmarkEnd w:id="69"/>
+    <w:bookmarkStart w:id="70" w:name="ref-Grams2018"/>
     <w:p>
       <w:pPr>
         <w:pStyle w:val="Bibliography"/>
       </w:pPr>
       <w:r>
-        <w:t xml:space="preserve">17.</w:t>
+        <w:t xml:space="preserve">14.</w:t>
       </w:r>
       <w:r>
         <w:t xml:space="preserve"> </w:t>
@@ -3456,9 +3009,9 @@
         <w:t xml:space="preserve"> Predicting timing of clinical outcomes in patients with chronic kidney disease and severely decreased glomerular filtration rate. Kidney International. 2018;93(6):1442–51.</w:t>
       </w:r>
     </w:p>
-    <w:bookmarkEnd w:id="78"/>
-    <w:bookmarkEnd w:id="79"/>
-    <w:bookmarkEnd w:id="80"/>
+    <w:bookmarkEnd w:id="70"/>
+    <w:bookmarkEnd w:id="71"/>
+    <w:bookmarkEnd w:id="72"/>
     <w:sectPr>
       <w:footnotePr>
         <w:numRestart w:val="eachSect"/>
@@ -3821,6 +3374,12 @@
     <w:abstractNumId w:val="991"/>
   </w:num>
   <w:num w:numId="1012">
+    <w:abstractNumId w:val="991"/>
+  </w:num>
+  <w:num w:numId="1013">
+    <w:abstractNumId w:val="991"/>
+  </w:num>
+  <w:num w:numId="1014">
     <w:abstractNumId w:val="99411"/>
     <w:lvlOverride w:ilvl="0">
       <w:startOverride w:val="1"/>
@@ -3850,10 +3409,10 @@
       <w:startOverride w:val="1"/>
     </w:lvlOverride>
   </w:num>
-  <w:num w:numId="1013">
+  <w:num w:numId="1015">
     <w:abstractNumId w:val="991"/>
   </w:num>
-  <w:num w:numId="1014">
+  <w:num w:numId="1016">
     <w:abstractNumId w:val="991"/>
   </w:num>
 </w:numbering>

</xml_diff>